<commit_message>
Review 1: static HTML pages and layered CSS design system
- 25 standalone, semantic HTML5 pages under client/ (landing, auth,
  dashboard, finance, groups, settlements, shopping, OCR, profile, 404)
- CSS split into cascade layers: tokens, base, layout, components,
  pages, utilities; dark + light themes from one token set
- Audit fixes: WCAG AA text contrast, complete light theme, tables
  stack into cards on phones, visible focus styles, ARIA landmarks
- CSS-only interactions via :has() (mobile drawer, split toggle,
  checklist), CSS-only bar and conic-gradient charts
- html-validate config (0 errors), zero-dependency static server
- Prompt log updated (entries 7-12)

Co-Authored-By: Claude Opus 5.5 <noreply@anthropic.com>
</commit_message>
<xml_diff>
--- a/docs/SplitStack_Prompt_Log.docx
+++ b/docs/SplitStack_Prompt_Log.docx
@@ -132,7 +132,7 @@
           <w:sz w:val="21"/>
           <w:szCs w:val="21"/>
         </w:rPr>
-        <w:t xml:space="preserve">6</w:t>
+        <w:t xml:space="preserve">12</w:t>
       </w:r>
     </w:p>
     <w:p>
@@ -494,7 +494,7 @@
                 <w:sz w:val="18"/>
                 <w:szCs w:val="18"/>
               </w:rPr>
-              <w:t xml:space="preserve">0</w:t>
+              <w:t xml:space="preserve">6</w:t>
             </w:r>
           </w:p>
         </w:tc>
@@ -1589,6 +1589,723 @@
           </w:p>
         </w:tc>
       </w:tr>
+      <w:tr>
+        <w:tc>
+          <w:tcPr>
+            <w:tcW w:type="dxa" w:w="700"/>
+            <w:tcMar>
+              <w:top w:type="dxa" w:w="60"/>
+              <w:left w:type="dxa" w:w="100"/>
+              <w:bottom w:type="dxa" w:w="60"/>
+              <w:right w:type="dxa" w:w="100"/>
+            </w:tcMar>
+          </w:tcPr>
+          <w:p>
+            <w:r>
+              <w:rPr>
+                <w:b w:val="false"/>
+                <w:bCs w:val="false"/>
+                <w:color w:val="222222"/>
+                <w:sz w:val="18"/>
+                <w:szCs w:val="18"/>
+              </w:rPr>
+              <w:t xml:space="preserve">7</w:t>
+            </w:r>
+          </w:p>
+        </w:tc>
+        <w:tc>
+          <w:tcPr>
+            <w:tcW w:type="dxa" w:w="1500"/>
+            <w:tcMar>
+              <w:top w:type="dxa" w:w="60"/>
+              <w:left w:type="dxa" w:w="100"/>
+              <w:bottom w:type="dxa" w:w="60"/>
+              <w:right w:type="dxa" w:w="100"/>
+            </w:tcMar>
+          </w:tcPr>
+          <w:p>
+            <w:r>
+              <w:rPr>
+                <w:b w:val="false"/>
+                <w:bCs w:val="false"/>
+                <w:color w:val="222222"/>
+                <w:sz w:val="18"/>
+                <w:szCs w:val="18"/>
+              </w:rPr>
+              <w:t xml:space="preserve">Review 1</w:t>
+            </w:r>
+          </w:p>
+        </w:tc>
+        <w:tc>
+          <w:tcPr>
+            <w:tcW w:type="dxa" w:w="4538"/>
+            <w:tcMar>
+              <w:top w:type="dxa" w:w="60"/>
+              <w:left w:type="dxa" w:w="100"/>
+              <w:bottom w:type="dxa" w:w="60"/>
+              <w:right w:type="dxa" w:w="100"/>
+            </w:tcMar>
+          </w:tcPr>
+          <w:p>
+            <w:r>
+              <w:rPr>
+                <w:b w:val="false"/>
+                <w:bCs w:val="false"/>
+                <w:color w:val="222222"/>
+                <w:sz w:val="18"/>
+                <w:szCs w:val="18"/>
+              </w:rPr>
+              <w:t xml:space="preserve">CSS design system with cascade layers</w:t>
+            </w:r>
+          </w:p>
+        </w:tc>
+        <w:tc>
+          <w:tcPr>
+            <w:tcW w:type="dxa" w:w="1500"/>
+            <w:tcMar>
+              <w:top w:type="dxa" w:w="60"/>
+              <w:left w:type="dxa" w:w="100"/>
+              <w:bottom w:type="dxa" w:w="60"/>
+              <w:right w:type="dxa" w:w="100"/>
+            </w:tcMar>
+          </w:tcPr>
+          <w:p>
+            <w:r>
+              <w:rPr>
+                <w:b w:val="false"/>
+                <w:bCs w:val="false"/>
+                <w:color w:val="222222"/>
+                <w:sz w:val="18"/>
+                <w:szCs w:val="18"/>
+              </w:rPr>
+              <w:t xml:space="preserve">Working prompt</w:t>
+            </w:r>
+          </w:p>
+        </w:tc>
+        <w:tc>
+          <w:tcPr>
+            <w:tcW w:type="dxa" w:w="1400"/>
+            <w:tcMar>
+              <w:top w:type="dxa" w:w="60"/>
+              <w:left w:type="dxa" w:w="100"/>
+              <w:bottom w:type="dxa" w:w="60"/>
+              <w:right w:type="dxa" w:w="100"/>
+            </w:tcMar>
+          </w:tcPr>
+          <w:p>
+            <w:r>
+              <w:rPr>
+                <w:b w:val="false"/>
+                <w:bCs w:val="false"/>
+                <w:color w:val="222222"/>
+                <w:sz w:val="18"/>
+                <w:szCs w:val="18"/>
+              </w:rPr>
+              <w:t xml:space="preserve">2026-10-14</w:t>
+            </w:r>
+          </w:p>
+        </w:tc>
+      </w:tr>
+      <w:tr>
+        <w:tc>
+          <w:tcPr>
+            <w:tcW w:type="dxa" w:w="700"/>
+            <w:shd w:fill="F7F7FB" w:color="auto" w:val="clear"/>
+            <w:tcMar>
+              <w:top w:type="dxa" w:w="60"/>
+              <w:left w:type="dxa" w:w="100"/>
+              <w:bottom w:type="dxa" w:w="60"/>
+              <w:right w:type="dxa" w:w="100"/>
+            </w:tcMar>
+          </w:tcPr>
+          <w:p>
+            <w:r>
+              <w:rPr>
+                <w:b w:val="false"/>
+                <w:bCs w:val="false"/>
+                <w:color w:val="222222"/>
+                <w:sz w:val="18"/>
+                <w:szCs w:val="18"/>
+              </w:rPr>
+              <w:t xml:space="preserve">8</w:t>
+            </w:r>
+          </w:p>
+        </w:tc>
+        <w:tc>
+          <w:tcPr>
+            <w:tcW w:type="dxa" w:w="1500"/>
+            <w:shd w:fill="F7F7FB" w:color="auto" w:val="clear"/>
+            <w:tcMar>
+              <w:top w:type="dxa" w:w="60"/>
+              <w:left w:type="dxa" w:w="100"/>
+              <w:bottom w:type="dxa" w:w="60"/>
+              <w:right w:type="dxa" w:w="100"/>
+            </w:tcMar>
+          </w:tcPr>
+          <w:p>
+            <w:r>
+              <w:rPr>
+                <w:b w:val="false"/>
+                <w:bCs w:val="false"/>
+                <w:color w:val="222222"/>
+                <w:sz w:val="18"/>
+                <w:szCs w:val="18"/>
+              </w:rPr>
+              <w:t xml:space="preserve">Review 1</w:t>
+            </w:r>
+          </w:p>
+        </w:tc>
+        <w:tc>
+          <w:tcPr>
+            <w:tcW w:type="dxa" w:w="4538"/>
+            <w:shd w:fill="F7F7FB" w:color="auto" w:val="clear"/>
+            <w:tcMar>
+              <w:top w:type="dxa" w:w="60"/>
+              <w:left w:type="dxa" w:w="100"/>
+              <w:bottom w:type="dxa" w:w="60"/>
+              <w:right w:type="dxa" w:w="100"/>
+            </w:tcMar>
+          </w:tcPr>
+          <w:p>
+            <w:r>
+              <w:rPr>
+                <w:b w:val="false"/>
+                <w:bCs w:val="false"/>
+                <w:color w:val="222222"/>
+                <w:sz w:val="18"/>
+                <w:szCs w:val="18"/>
+              </w:rPr>
+              <w:t xml:space="preserve">Static semantic HTML pages (25 pages)</w:t>
+            </w:r>
+          </w:p>
+        </w:tc>
+        <w:tc>
+          <w:tcPr>
+            <w:tcW w:type="dxa" w:w="1500"/>
+            <w:shd w:fill="F7F7FB" w:color="auto" w:val="clear"/>
+            <w:tcMar>
+              <w:top w:type="dxa" w:w="60"/>
+              <w:left w:type="dxa" w:w="100"/>
+              <w:bottom w:type="dxa" w:w="60"/>
+              <w:right w:type="dxa" w:w="100"/>
+            </w:tcMar>
+          </w:tcPr>
+          <w:p>
+            <w:r>
+              <w:rPr>
+                <w:b w:val="false"/>
+                <w:bCs w:val="false"/>
+                <w:color w:val="222222"/>
+                <w:sz w:val="18"/>
+                <w:szCs w:val="18"/>
+              </w:rPr>
+              <w:t xml:space="preserve">Working prompt</w:t>
+            </w:r>
+          </w:p>
+        </w:tc>
+        <w:tc>
+          <w:tcPr>
+            <w:tcW w:type="dxa" w:w="1400"/>
+            <w:shd w:fill="F7F7FB" w:color="auto" w:val="clear"/>
+            <w:tcMar>
+              <w:top w:type="dxa" w:w="60"/>
+              <w:left w:type="dxa" w:w="100"/>
+              <w:bottom w:type="dxa" w:w="60"/>
+              <w:right w:type="dxa" w:w="100"/>
+            </w:tcMar>
+          </w:tcPr>
+          <w:p>
+            <w:r>
+              <w:rPr>
+                <w:b w:val="false"/>
+                <w:bCs w:val="false"/>
+                <w:color w:val="222222"/>
+                <w:sz w:val="18"/>
+                <w:szCs w:val="18"/>
+              </w:rPr>
+              <w:t xml:space="preserve">2026-10-14</w:t>
+            </w:r>
+          </w:p>
+        </w:tc>
+      </w:tr>
+      <w:tr>
+        <w:tc>
+          <w:tcPr>
+            <w:tcW w:type="dxa" w:w="700"/>
+            <w:tcMar>
+              <w:top w:type="dxa" w:w="60"/>
+              <w:left w:type="dxa" w:w="100"/>
+              <w:bottom w:type="dxa" w:w="60"/>
+              <w:right w:type="dxa" w:w="100"/>
+            </w:tcMar>
+          </w:tcPr>
+          <w:p>
+            <w:r>
+              <w:rPr>
+                <w:b w:val="false"/>
+                <w:bCs w:val="false"/>
+                <w:color w:val="222222"/>
+                <w:sz w:val="18"/>
+                <w:szCs w:val="18"/>
+              </w:rPr>
+              <w:t xml:space="preserve">9</w:t>
+            </w:r>
+          </w:p>
+        </w:tc>
+        <w:tc>
+          <w:tcPr>
+            <w:tcW w:type="dxa" w:w="1500"/>
+            <w:tcMar>
+              <w:top w:type="dxa" w:w="60"/>
+              <w:left w:type="dxa" w:w="100"/>
+              <w:bottom w:type="dxa" w:w="60"/>
+              <w:right w:type="dxa" w:w="100"/>
+            </w:tcMar>
+          </w:tcPr>
+          <w:p>
+            <w:r>
+              <w:rPr>
+                <w:b w:val="false"/>
+                <w:bCs w:val="false"/>
+                <w:color w:val="222222"/>
+                <w:sz w:val="18"/>
+                <w:szCs w:val="18"/>
+              </w:rPr>
+              <w:t xml:space="preserve">Review 1</w:t>
+            </w:r>
+          </w:p>
+        </w:tc>
+        <w:tc>
+          <w:tcPr>
+            <w:tcW w:type="dxa" w:w="4538"/>
+            <w:tcMar>
+              <w:top w:type="dxa" w:w="60"/>
+              <w:left w:type="dxa" w:w="100"/>
+              <w:bottom w:type="dxa" w:w="60"/>
+              <w:right w:type="dxa" w:w="100"/>
+            </w:tcMar>
+          </w:tcPr>
+          <w:p>
+            <w:r>
+              <w:rPr>
+                <w:b w:val="false"/>
+                <w:bCs w:val="false"/>
+                <w:color w:val="222222"/>
+                <w:sz w:val="18"/>
+                <w:szCs w:val="18"/>
+              </w:rPr>
+              <w:t xml:space="preserve">Local static server for previewing the client</w:t>
+            </w:r>
+          </w:p>
+        </w:tc>
+        <w:tc>
+          <w:tcPr>
+            <w:tcW w:type="dxa" w:w="1500"/>
+            <w:tcMar>
+              <w:top w:type="dxa" w:w="60"/>
+              <w:left w:type="dxa" w:w="100"/>
+              <w:bottom w:type="dxa" w:w="60"/>
+              <w:right w:type="dxa" w:w="100"/>
+            </w:tcMar>
+          </w:tcPr>
+          <w:p>
+            <w:r>
+              <w:rPr>
+                <w:b w:val="false"/>
+                <w:bCs w:val="false"/>
+                <w:color w:val="222222"/>
+                <w:sz w:val="18"/>
+                <w:szCs w:val="18"/>
+              </w:rPr>
+              <w:t xml:space="preserve">Working prompt</w:t>
+            </w:r>
+          </w:p>
+        </w:tc>
+        <w:tc>
+          <w:tcPr>
+            <w:tcW w:type="dxa" w:w="1400"/>
+            <w:tcMar>
+              <w:top w:type="dxa" w:w="60"/>
+              <w:left w:type="dxa" w:w="100"/>
+              <w:bottom w:type="dxa" w:w="60"/>
+              <w:right w:type="dxa" w:w="100"/>
+            </w:tcMar>
+          </w:tcPr>
+          <w:p>
+            <w:r>
+              <w:rPr>
+                <w:b w:val="false"/>
+                <w:bCs w:val="false"/>
+                <w:color w:val="222222"/>
+                <w:sz w:val="18"/>
+                <w:szCs w:val="18"/>
+              </w:rPr>
+              <w:t xml:space="preserve">2026-10-14</w:t>
+            </w:r>
+          </w:p>
+        </w:tc>
+      </w:tr>
+      <w:tr>
+        <w:tc>
+          <w:tcPr>
+            <w:tcW w:type="dxa" w:w="700"/>
+            <w:shd w:fill="F7F7FB" w:color="auto" w:val="clear"/>
+            <w:tcMar>
+              <w:top w:type="dxa" w:w="60"/>
+              <w:left w:type="dxa" w:w="100"/>
+              <w:bottom w:type="dxa" w:w="60"/>
+              <w:right w:type="dxa" w:w="100"/>
+            </w:tcMar>
+          </w:tcPr>
+          <w:p>
+            <w:r>
+              <w:rPr>
+                <w:b w:val="false"/>
+                <w:bCs w:val="false"/>
+                <w:color w:val="222222"/>
+                <w:sz w:val="18"/>
+                <w:szCs w:val="18"/>
+              </w:rPr>
+              <w:t xml:space="preserve">10</w:t>
+            </w:r>
+          </w:p>
+        </w:tc>
+        <w:tc>
+          <w:tcPr>
+            <w:tcW w:type="dxa" w:w="1500"/>
+            <w:shd w:fill="F7F7FB" w:color="auto" w:val="clear"/>
+            <w:tcMar>
+              <w:top w:type="dxa" w:w="60"/>
+              <w:left w:type="dxa" w:w="100"/>
+              <w:bottom w:type="dxa" w:w="60"/>
+              <w:right w:type="dxa" w:w="100"/>
+            </w:tcMar>
+          </w:tcPr>
+          <w:p>
+            <w:r>
+              <w:rPr>
+                <w:b w:val="false"/>
+                <w:bCs w:val="false"/>
+                <w:color w:val="222222"/>
+                <w:sz w:val="18"/>
+                <w:szCs w:val="18"/>
+              </w:rPr>
+              <w:t xml:space="preserve">Review 1</w:t>
+            </w:r>
+          </w:p>
+        </w:tc>
+        <w:tc>
+          <w:tcPr>
+            <w:tcW w:type="dxa" w:w="4538"/>
+            <w:shd w:fill="F7F7FB" w:color="auto" w:val="clear"/>
+            <w:tcMar>
+              <w:top w:type="dxa" w:w="60"/>
+              <w:left w:type="dxa" w:w="100"/>
+              <w:bottom w:type="dxa" w:w="60"/>
+              <w:right w:type="dxa" w:w="100"/>
+            </w:tcMar>
+          </w:tcPr>
+          <w:p>
+            <w:r>
+              <w:rPr>
+                <w:b w:val="false"/>
+                <w:bCs w:val="false"/>
+                <w:color w:val="222222"/>
+                <w:sz w:val="18"/>
+                <w:szCs w:val="18"/>
+              </w:rPr>
+              <w:t xml:space="preserve">Validate HTML and fix issues</w:t>
+            </w:r>
+          </w:p>
+        </w:tc>
+        <w:tc>
+          <w:tcPr>
+            <w:tcW w:type="dxa" w:w="1500"/>
+            <w:shd w:fill="F7F7FB" w:color="auto" w:val="clear"/>
+            <w:tcMar>
+              <w:top w:type="dxa" w:w="60"/>
+              <w:left w:type="dxa" w:w="100"/>
+              <w:bottom w:type="dxa" w:w="60"/>
+              <w:right w:type="dxa" w:w="100"/>
+            </w:tcMar>
+          </w:tcPr>
+          <w:p>
+            <w:r>
+              <w:rPr>
+                <w:b w:val="false"/>
+                <w:bCs w:val="false"/>
+                <w:color w:val="222222"/>
+                <w:sz w:val="18"/>
+                <w:szCs w:val="18"/>
+              </w:rPr>
+              <w:t xml:space="preserve">Working prompt</w:t>
+            </w:r>
+          </w:p>
+        </w:tc>
+        <w:tc>
+          <w:tcPr>
+            <w:tcW w:type="dxa" w:w="1400"/>
+            <w:shd w:fill="F7F7FB" w:color="auto" w:val="clear"/>
+            <w:tcMar>
+              <w:top w:type="dxa" w:w="60"/>
+              <w:left w:type="dxa" w:w="100"/>
+              <w:bottom w:type="dxa" w:w="60"/>
+              <w:right w:type="dxa" w:w="100"/>
+            </w:tcMar>
+          </w:tcPr>
+          <w:p>
+            <w:r>
+              <w:rPr>
+                <w:b w:val="false"/>
+                <w:bCs w:val="false"/>
+                <w:color w:val="222222"/>
+                <w:sz w:val="18"/>
+                <w:szCs w:val="18"/>
+              </w:rPr>
+              <w:t xml:space="preserve">2026-10-14</w:t>
+            </w:r>
+          </w:p>
+        </w:tc>
+      </w:tr>
+      <w:tr>
+        <w:tc>
+          <w:tcPr>
+            <w:tcW w:type="dxa" w:w="700"/>
+            <w:tcMar>
+              <w:top w:type="dxa" w:w="60"/>
+              <w:left w:type="dxa" w:w="100"/>
+              <w:bottom w:type="dxa" w:w="60"/>
+              <w:right w:type="dxa" w:w="100"/>
+            </w:tcMar>
+          </w:tcPr>
+          <w:p>
+            <w:r>
+              <w:rPr>
+                <w:b w:val="false"/>
+                <w:bCs w:val="false"/>
+                <w:color w:val="222222"/>
+                <w:sz w:val="18"/>
+                <w:szCs w:val="18"/>
+              </w:rPr>
+              <w:t xml:space="preserve">11</w:t>
+            </w:r>
+          </w:p>
+        </w:tc>
+        <w:tc>
+          <w:tcPr>
+            <w:tcW w:type="dxa" w:w="1500"/>
+            <w:tcMar>
+              <w:top w:type="dxa" w:w="60"/>
+              <w:left w:type="dxa" w:w="100"/>
+              <w:bottom w:type="dxa" w:w="60"/>
+              <w:right w:type="dxa" w:w="100"/>
+            </w:tcMar>
+          </w:tcPr>
+          <w:p>
+            <w:r>
+              <w:rPr>
+                <w:b w:val="false"/>
+                <w:bCs w:val="false"/>
+                <w:color w:val="222222"/>
+                <w:sz w:val="18"/>
+                <w:szCs w:val="18"/>
+              </w:rPr>
+              <w:t xml:space="preserve">Review 1</w:t>
+            </w:r>
+          </w:p>
+        </w:tc>
+        <w:tc>
+          <w:tcPr>
+            <w:tcW w:type="dxa" w:w="4538"/>
+            <w:tcMar>
+              <w:top w:type="dxa" w:w="60"/>
+              <w:left w:type="dxa" w:w="100"/>
+              <w:bottom w:type="dxa" w:w="60"/>
+              <w:right w:type="dxa" w:w="100"/>
+            </w:tcMar>
+          </w:tcPr>
+          <w:p>
+            <w:r>
+              <w:rPr>
+                <w:b w:val="false"/>
+                <w:bCs w:val="false"/>
+                <w:color w:val="222222"/>
+                <w:sz w:val="18"/>
+                <w:szCs w:val="18"/>
+              </w:rPr>
+              <w:t xml:space="preserve">Visual QA and layout bug fixes</w:t>
+            </w:r>
+          </w:p>
+        </w:tc>
+        <w:tc>
+          <w:tcPr>
+            <w:tcW w:type="dxa" w:w="1500"/>
+            <w:tcMar>
+              <w:top w:type="dxa" w:w="60"/>
+              <w:left w:type="dxa" w:w="100"/>
+              <w:bottom w:type="dxa" w:w="60"/>
+              <w:right w:type="dxa" w:w="100"/>
+            </w:tcMar>
+          </w:tcPr>
+          <w:p>
+            <w:r>
+              <w:rPr>
+                <w:b w:val="false"/>
+                <w:bCs w:val="false"/>
+                <w:color w:val="222222"/>
+                <w:sz w:val="18"/>
+                <w:szCs w:val="18"/>
+              </w:rPr>
+              <w:t xml:space="preserve">Working prompt</w:t>
+            </w:r>
+          </w:p>
+        </w:tc>
+        <w:tc>
+          <w:tcPr>
+            <w:tcW w:type="dxa" w:w="1400"/>
+            <w:tcMar>
+              <w:top w:type="dxa" w:w="60"/>
+              <w:left w:type="dxa" w:w="100"/>
+              <w:bottom w:type="dxa" w:w="60"/>
+              <w:right w:type="dxa" w:w="100"/>
+            </w:tcMar>
+          </w:tcPr>
+          <w:p>
+            <w:r>
+              <w:rPr>
+                <w:b w:val="false"/>
+                <w:bCs w:val="false"/>
+                <w:color w:val="222222"/>
+                <w:sz w:val="18"/>
+                <w:szCs w:val="18"/>
+              </w:rPr>
+              <w:t xml:space="preserve">2026-10-14</w:t>
+            </w:r>
+          </w:p>
+        </w:tc>
+      </w:tr>
+      <w:tr>
+        <w:tc>
+          <w:tcPr>
+            <w:tcW w:type="dxa" w:w="700"/>
+            <w:shd w:fill="F7F7FB" w:color="auto" w:val="clear"/>
+            <w:tcMar>
+              <w:top w:type="dxa" w:w="60"/>
+              <w:left w:type="dxa" w:w="100"/>
+              <w:bottom w:type="dxa" w:w="60"/>
+              <w:right w:type="dxa" w:w="100"/>
+            </w:tcMar>
+          </w:tcPr>
+          <w:p>
+            <w:r>
+              <w:rPr>
+                <w:b w:val="false"/>
+                <w:bCs w:val="false"/>
+                <w:color w:val="222222"/>
+                <w:sz w:val="18"/>
+                <w:szCs w:val="18"/>
+              </w:rPr>
+              <w:t xml:space="preserve">12</w:t>
+            </w:r>
+          </w:p>
+        </w:tc>
+        <w:tc>
+          <w:tcPr>
+            <w:tcW w:type="dxa" w:w="1500"/>
+            <w:shd w:fill="F7F7FB" w:color="auto" w:val="clear"/>
+            <w:tcMar>
+              <w:top w:type="dxa" w:w="60"/>
+              <w:left w:type="dxa" w:w="100"/>
+              <w:bottom w:type="dxa" w:w="60"/>
+              <w:right w:type="dxa" w:w="100"/>
+            </w:tcMar>
+          </w:tcPr>
+          <w:p>
+            <w:r>
+              <w:rPr>
+                <w:b w:val="false"/>
+                <w:bCs w:val="false"/>
+                <w:color w:val="222222"/>
+                <w:sz w:val="18"/>
+                <w:szCs w:val="18"/>
+              </w:rPr>
+              <w:t xml:space="preserve">Review 1</w:t>
+            </w:r>
+          </w:p>
+        </w:tc>
+        <w:tc>
+          <w:tcPr>
+            <w:tcW w:type="dxa" w:w="4538"/>
+            <w:shd w:fill="F7F7FB" w:color="auto" w:val="clear"/>
+            <w:tcMar>
+              <w:top w:type="dxa" w:w="60"/>
+              <w:left w:type="dxa" w:w="100"/>
+              <w:bottom w:type="dxa" w:w="60"/>
+              <w:right w:type="dxa" w:w="100"/>
+            </w:tcMar>
+          </w:tcPr>
+          <w:p>
+            <w:r>
+              <w:rPr>
+                <w:b w:val="false"/>
+                <w:bCs w:val="false"/>
+                <w:color w:val="222222"/>
+                <w:sz w:val="18"/>
+                <w:szCs w:val="18"/>
+              </w:rPr>
+              <w:t xml:space="preserve">Client README and Review 1 checkpoint commit</w:t>
+            </w:r>
+          </w:p>
+        </w:tc>
+        <w:tc>
+          <w:tcPr>
+            <w:tcW w:type="dxa" w:w="1500"/>
+            <w:shd w:fill="F7F7FB" w:color="auto" w:val="clear"/>
+            <w:tcMar>
+              <w:top w:type="dxa" w:w="60"/>
+              <w:left w:type="dxa" w:w="100"/>
+              <w:bottom w:type="dxa" w:w="60"/>
+              <w:right w:type="dxa" w:w="100"/>
+            </w:tcMar>
+          </w:tcPr>
+          <w:p>
+            <w:r>
+              <w:rPr>
+                <w:b w:val="false"/>
+                <w:bCs w:val="false"/>
+                <w:color w:val="222222"/>
+                <w:sz w:val="18"/>
+                <w:szCs w:val="18"/>
+              </w:rPr>
+              <w:t xml:space="preserve">Working prompt</w:t>
+            </w:r>
+          </w:p>
+        </w:tc>
+        <w:tc>
+          <w:tcPr>
+            <w:tcW w:type="dxa" w:w="1400"/>
+            <w:shd w:fill="F7F7FB" w:color="auto" w:val="clear"/>
+            <w:tcMar>
+              <w:top w:type="dxa" w:w="60"/>
+              <w:left w:type="dxa" w:w="100"/>
+              <w:bottom w:type="dxa" w:w="60"/>
+              <w:right w:type="dxa" w:w="100"/>
+            </w:tcMar>
+          </w:tcPr>
+          <w:p>
+            <w:r>
+              <w:rPr>
+                <w:b w:val="false"/>
+                <w:bCs w:val="false"/>
+                <w:color w:val="222222"/>
+                <w:sz w:val="18"/>
+                <w:szCs w:val="18"/>
+              </w:rPr>
+              <w:t xml:space="preserve">2026-10-14</w:t>
+            </w:r>
+          </w:p>
+        </w:tc>
+      </w:tr>
     </w:tbl>
     <w:p>
       <w:r>
@@ -2888,6 +3605,1397 @@
           <w:szCs w:val="21"/>
         </w:rPr>
         <w:t xml:space="preserve">npm run log produces the .docx; contents read back with python-docx.</w:t>
+      </w:r>
+    </w:p>
+    <w:p>
+      <w:pPr>
+        <w:pBdr>
+          <w:bottom w:val="single" w:color="D9DBE5" w:sz="4" w:space="4"/>
+        </w:pBdr>
+        <w:spacing w:after="200"/>
+      </w:pPr>
+      <w:r>
+        <w:t xml:space="preserve"/>
+      </w:r>
+    </w:p>
+    <w:p>
+      <w:pPr>
+        <w:pStyle w:val="Heading2"/>
+        <w:spacing w:before="360"/>
+      </w:pPr>
+      <w:r>
+        <w:t xml:space="preserve">Review 1 - HTML + CSS - static, semantic pages and a token-based design system</w:t>
+      </w:r>
+    </w:p>
+    <w:p>
+      <w:pPr>
+        <w:pStyle w:val="Heading3"/>
+        <w:keepNext/>
+      </w:pPr>
+      <w:r>
+        <w:t xml:space="preserve">#7  CSS design system with cascade layers</w:t>
+      </w:r>
+    </w:p>
+    <w:p>
+      <w:pPr>
+        <w:keepNext/>
+        <w:spacing w:after="60"/>
+      </w:pPr>
+      <w:r>
+        <w:rPr>
+          <w:color w:val="5B6475"/>
+          <w:sz w:val="18"/>
+          <w:szCs w:val="18"/>
+        </w:rPr>
+        <w:t xml:space="preserve">Working prompt  |  2026-10-14</w:t>
+      </w:r>
+    </w:p>
+    <w:p>
+      <w:pPr>
+        <w:spacing w:after="60" w:before="160"/>
+      </w:pPr>
+      <w:r>
+        <w:rPr>
+          <w:b/>
+          <w:bCs/>
+          <w:color w:val="4F46E5"/>
+          <w:spacing w:val="20"/>
+          <w:sz w:val="17"/>
+          <w:szCs w:val="17"/>
+        </w:rPr>
+        <w:t xml:space="preserve">PROMPT</w:t>
+      </w:r>
+    </w:p>
+    <w:p>
+      <w:pPr>
+        <w:pBdr>
+          <w:left w:val="single" w:color="4F46E5" w:sz="18" w:space="8"/>
+        </w:pBdr>
+        <w:shd w:fill="F1F2F8" w:color="auto" w:val="clear"/>
+        <w:spacing w:after="120" w:before="40" w:line="276"/>
+        <w:ind w:left="160" w:right="160"/>
+      </w:pPr>
+      <w:r>
+        <w:rPr>
+          <w:rFonts w:ascii="Consolas" w:cs="Consolas" w:eastAsia="Consolas" w:hAnsi="Consolas"/>
+          <w:sz w:val="19"/>
+          <w:szCs w:val="19"/>
+        </w:rPr>
+        <w:t xml:space="preserve">Rebuild SplitStack's stylesheet as a token-based design system split into files and ordered with CSS cascade layers: tokens.css (colours, type scale, spacing, radii, shadows; dark default plus a light theme via prefers-color-scheme and a [data-theme] attribute for later JavaScript), base.css (reset, typography, focus ring, skip link, visually-hidden), layout.css (app shell with sticky sidebar and topbar, grids, auth and landing layouts, responsive breakpoints at 1100/900/640px, CSS-only mobile drawer using a hidden checkbox and :has()), components.css (cards, buttons, badges, category tags via a --cat custom property, stat cards, budget meters, forms with :user-invalid feedback, segmented radios, switches, tables that become stacked cards under 640px using data-label, alerts, empty states, lists, CSS-only bar and conic-gradient doughnut charts, transfer cards, checklist, file drop zone), pages.css and utilities.css. main.css imports them with @layer. Fix the audit findings: muted text must reach at least 4.5:1 contrast, the light theme must be complete, and tables must not scroll sideways on mobile.</w:t>
+      </w:r>
+    </w:p>
+    <w:p>
+      <w:pPr>
+        <w:spacing w:after="60" w:before="160"/>
+      </w:pPr>
+      <w:r>
+        <w:rPr>
+          <w:b/>
+          <w:bCs/>
+          <w:color w:val="4F46E5"/>
+          <w:spacing w:val="20"/>
+          <w:sz w:val="17"/>
+          <w:szCs w:val="17"/>
+        </w:rPr>
+        <w:t xml:space="preserve">PURPOSE</w:t>
+      </w:r>
+    </w:p>
+    <w:p>
+      <w:pPr>
+        <w:spacing w:after="80"/>
+      </w:pPr>
+      <w:r>
+        <w:rPr>
+          <w:sz w:val="21"/>
+          <w:szCs w:val="21"/>
+        </w:rPr>
+        <w:t xml:space="preserve">Review 1 requires a clean, well-structured CSS codebase; this also fixes audit items SEC-06 (contrast), B.1 (light theme) and B.2 (responsive tables).</w:t>
+      </w:r>
+    </w:p>
+    <w:p>
+      <w:pPr>
+        <w:spacing w:after="60" w:before="160"/>
+      </w:pPr>
+      <w:r>
+        <w:rPr>
+          <w:b/>
+          <w:bCs/>
+          <w:color w:val="4F46E5"/>
+          <w:spacing w:val="20"/>
+          <w:sz w:val="17"/>
+          <w:szCs w:val="17"/>
+        </w:rPr>
+        <w:t xml:space="preserve">FILES</w:t>
+      </w:r>
+    </w:p>
+    <w:p>
+      <w:pPr>
+        <w:pStyle w:val="ListParagraph"/>
+        <w:numPr>
+          <w:ilvl w:val="0"/>
+          <w:numId w:val="2"/>
+        </w:numPr>
+      </w:pPr>
+      <w:r>
+        <w:rPr>
+          <w:rFonts w:ascii="Consolas" w:cs="Consolas" w:eastAsia="Consolas" w:hAnsi="Consolas"/>
+          <w:sz w:val="19"/>
+          <w:szCs w:val="19"/>
+        </w:rPr>
+        <w:t xml:space="preserve">client/css/main.css</w:t>
+      </w:r>
+    </w:p>
+    <w:p>
+      <w:pPr>
+        <w:pStyle w:val="ListParagraph"/>
+        <w:numPr>
+          <w:ilvl w:val="0"/>
+          <w:numId w:val="2"/>
+        </w:numPr>
+      </w:pPr>
+      <w:r>
+        <w:rPr>
+          <w:rFonts w:ascii="Consolas" w:cs="Consolas" w:eastAsia="Consolas" w:hAnsi="Consolas"/>
+          <w:sz w:val="19"/>
+          <w:szCs w:val="19"/>
+        </w:rPr>
+        <w:t xml:space="preserve">client/css/tokens.css</w:t>
+      </w:r>
+    </w:p>
+    <w:p>
+      <w:pPr>
+        <w:pStyle w:val="ListParagraph"/>
+        <w:numPr>
+          <w:ilvl w:val="0"/>
+          <w:numId w:val="2"/>
+        </w:numPr>
+      </w:pPr>
+      <w:r>
+        <w:rPr>
+          <w:rFonts w:ascii="Consolas" w:cs="Consolas" w:eastAsia="Consolas" w:hAnsi="Consolas"/>
+          <w:sz w:val="19"/>
+          <w:szCs w:val="19"/>
+        </w:rPr>
+        <w:t xml:space="preserve">client/css/base.css</w:t>
+      </w:r>
+    </w:p>
+    <w:p>
+      <w:pPr>
+        <w:pStyle w:val="ListParagraph"/>
+        <w:numPr>
+          <w:ilvl w:val="0"/>
+          <w:numId w:val="2"/>
+        </w:numPr>
+      </w:pPr>
+      <w:r>
+        <w:rPr>
+          <w:rFonts w:ascii="Consolas" w:cs="Consolas" w:eastAsia="Consolas" w:hAnsi="Consolas"/>
+          <w:sz w:val="19"/>
+          <w:szCs w:val="19"/>
+        </w:rPr>
+        <w:t xml:space="preserve">client/css/layout.css</w:t>
+      </w:r>
+    </w:p>
+    <w:p>
+      <w:pPr>
+        <w:pStyle w:val="ListParagraph"/>
+        <w:numPr>
+          <w:ilvl w:val="0"/>
+          <w:numId w:val="2"/>
+        </w:numPr>
+      </w:pPr>
+      <w:r>
+        <w:rPr>
+          <w:rFonts w:ascii="Consolas" w:cs="Consolas" w:eastAsia="Consolas" w:hAnsi="Consolas"/>
+          <w:sz w:val="19"/>
+          <w:szCs w:val="19"/>
+        </w:rPr>
+        <w:t xml:space="preserve">client/css/components.css</w:t>
+      </w:r>
+    </w:p>
+    <w:p>
+      <w:pPr>
+        <w:pStyle w:val="ListParagraph"/>
+        <w:numPr>
+          <w:ilvl w:val="0"/>
+          <w:numId w:val="2"/>
+        </w:numPr>
+      </w:pPr>
+      <w:r>
+        <w:rPr>
+          <w:rFonts w:ascii="Consolas" w:cs="Consolas" w:eastAsia="Consolas" w:hAnsi="Consolas"/>
+          <w:sz w:val="19"/>
+          <w:szCs w:val="19"/>
+        </w:rPr>
+        <w:t xml:space="preserve">client/css/pages.css</w:t>
+      </w:r>
+    </w:p>
+    <w:p>
+      <w:pPr>
+        <w:pStyle w:val="ListParagraph"/>
+        <w:numPr>
+          <w:ilvl w:val="0"/>
+          <w:numId w:val="2"/>
+        </w:numPr>
+      </w:pPr>
+      <w:r>
+        <w:rPr>
+          <w:rFonts w:ascii="Consolas" w:cs="Consolas" w:eastAsia="Consolas" w:hAnsi="Consolas"/>
+          <w:sz w:val="19"/>
+          <w:szCs w:val="19"/>
+        </w:rPr>
+        <w:t xml:space="preserve">client/css/utilities.css</w:t>
+      </w:r>
+    </w:p>
+    <w:p>
+      <w:pPr>
+        <w:spacing w:after="60" w:before="160"/>
+      </w:pPr>
+      <w:r>
+        <w:rPr>
+          <w:b/>
+          <w:bCs/>
+          <w:color w:val="4F46E5"/>
+          <w:spacing w:val="20"/>
+          <w:sz w:val="17"/>
+          <w:szCs w:val="17"/>
+        </w:rPr>
+        <w:t xml:space="preserve">RESULT</w:t>
+      </w:r>
+    </w:p>
+    <w:p>
+      <w:pPr>
+        <w:spacing w:after="80"/>
+      </w:pPr>
+      <w:r>
+        <w:rPr>
+          <w:sz w:val="21"/>
+          <w:szCs w:val="21"/>
+        </w:rPr>
+        <w:t xml:space="preserve">Six layered stylesheets. --text-dim raised from #64748b (3.8:1) to #8794a9 (about 5.6:1) on dark and #5d6879 on light surfaces.</w:t>
+      </w:r>
+    </w:p>
+    <w:p>
+      <w:pPr>
+        <w:spacing w:after="60" w:before="160"/>
+      </w:pPr>
+      <w:r>
+        <w:rPr>
+          <w:b/>
+          <w:bCs/>
+          <w:color w:val="4F46E5"/>
+          <w:spacing w:val="20"/>
+          <w:sz w:val="17"/>
+          <w:szCs w:val="17"/>
+        </w:rPr>
+        <w:t xml:space="preserve">VERIFICATION</w:t>
+      </w:r>
+    </w:p>
+    <w:p>
+      <w:pPr>
+        <w:spacing w:after="80"/>
+      </w:pPr>
+      <w:r>
+        <w:rPr>
+          <w:sz w:val="21"/>
+          <w:szCs w:val="21"/>
+        </w:rPr>
+        <w:t xml:space="preserve">Rendered in the browser at 1366px and 375px; computed styles inspected.</w:t>
+      </w:r>
+    </w:p>
+    <w:p>
+      <w:pPr>
+        <w:pBdr>
+          <w:bottom w:val="single" w:color="D9DBE5" w:sz="4" w:space="4"/>
+        </w:pBdr>
+        <w:spacing w:after="200"/>
+      </w:pPr>
+      <w:r>
+        <w:t xml:space="preserve"/>
+      </w:r>
+    </w:p>
+    <w:p>
+      <w:pPr>
+        <w:pStyle w:val="Heading3"/>
+        <w:keepNext/>
+      </w:pPr>
+      <w:r>
+        <w:t xml:space="preserve">#8  Static semantic HTML pages (25 pages)</w:t>
+      </w:r>
+    </w:p>
+    <w:p>
+      <w:pPr>
+        <w:keepNext/>
+        <w:spacing w:after="60"/>
+      </w:pPr>
+      <w:r>
+        <w:rPr>
+          <w:color w:val="5B6475"/>
+          <w:sz w:val="18"/>
+          <w:szCs w:val="18"/>
+        </w:rPr>
+        <w:t xml:space="preserve">Working prompt  |  2026-10-14</w:t>
+      </w:r>
+    </w:p>
+    <w:p>
+      <w:pPr>
+        <w:spacing w:after="60" w:before="160"/>
+      </w:pPr>
+      <w:r>
+        <w:rPr>
+          <w:b/>
+          <w:bCs/>
+          <w:color w:val="4F46E5"/>
+          <w:spacing w:val="20"/>
+          <w:sz w:val="17"/>
+          <w:szCs w:val="17"/>
+        </w:rPr>
+        <w:t xml:space="preserve">PROMPT</w:t>
+      </w:r>
+    </w:p>
+    <w:p>
+      <w:pPr>
+        <w:pBdr>
+          <w:left w:val="single" w:color="4F46E5" w:sz="18" w:space="8"/>
+        </w:pBdr>
+        <w:shd w:fill="F1F2F8" w:color="auto" w:val="clear"/>
+        <w:spacing w:after="120" w:before="40" w:line="276"/>
+        <w:ind w:left="160" w:right="160"/>
+      </w:pPr>
+      <w:r>
+        <w:rPr>
+          <w:rFonts w:ascii="Consolas" w:cs="Consolas" w:eastAsia="Consolas" w:hAnsi="Consolas"/>
+          <w:sz w:val="19"/>
+          <w:szCs w:val="19"/>
+        </w:rPr>
+        <w:t xml:space="preserve">Convert every Jinja template of the Flask app into a standalone static HTML5 page under client/ that opens without a server-side framework, using realistic sample data in Indian rupees for one demo user (Priya Raman) as of 28 Oct 2026. Pages: landing (index.html), login, register, 404, dashboard, analytics, expenses, add expense, edit expense, income, log income, budgets, recurring payments, categories, groups, create group, group detail, add shared expense, settle up, shopping lists, new list, list detail, receipt scan, receipt confirm, profile. Every app page shares the same sidebar, topbar (search, notifications, avatar) and footer. Use semantic landmarks (header, nav, main, aside, section, footer), a skip link, breadcrumbs, labelled forms with HTML5 validation (required, min, max, step, pattern, type=email/date/number), tables with captions and scope, time elements, aria-current for the active link, role=progressbar with values for budget meters, and a text alternative for every chart. Keep the sample numbers internally consistent (category totals, group balances, the debt-simplification plan). Avoid inline styles except CSS custom properties such as --value or --cat. Generate the repeated layout with a throwaway script so that the committed output is plain HTML.</w:t>
+      </w:r>
+    </w:p>
+    <w:p>
+      <w:pPr>
+        <w:spacing w:after="60" w:before="160"/>
+      </w:pPr>
+      <w:r>
+        <w:rPr>
+          <w:b/>
+          <w:bCs/>
+          <w:color w:val="4F46E5"/>
+          <w:spacing w:val="20"/>
+          <w:sz w:val="17"/>
+          <w:szCs w:val="17"/>
+        </w:rPr>
+        <w:t xml:space="preserve">PURPOSE</w:t>
+      </w:r>
+    </w:p>
+    <w:p>
+      <w:pPr>
+        <w:spacing w:after="80"/>
+      </w:pPr>
+      <w:r>
+        <w:rPr>
+          <w:sz w:val="21"/>
+          <w:szCs w:val="21"/>
+        </w:rPr>
+        <w:t xml:space="preserve">Deliver the Review 1 HTML+CSS milestone: every screen of SplitStack, demonstrable with only HTML and CSS.</w:t>
+      </w:r>
+    </w:p>
+    <w:p>
+      <w:pPr>
+        <w:spacing w:after="60" w:before="160"/>
+      </w:pPr>
+      <w:r>
+        <w:rPr>
+          <w:b/>
+          <w:bCs/>
+          <w:color w:val="4F46E5"/>
+          <w:spacing w:val="20"/>
+          <w:sz w:val="17"/>
+          <w:szCs w:val="17"/>
+        </w:rPr>
+        <w:t xml:space="preserve">FILES</w:t>
+      </w:r>
+    </w:p>
+    <w:p>
+      <w:pPr>
+        <w:pStyle w:val="ListParagraph"/>
+        <w:numPr>
+          <w:ilvl w:val="0"/>
+          <w:numId w:val="2"/>
+        </w:numPr>
+      </w:pPr>
+      <w:r>
+        <w:rPr>
+          <w:rFonts w:ascii="Consolas" w:cs="Consolas" w:eastAsia="Consolas" w:hAnsi="Consolas"/>
+          <w:sz w:val="19"/>
+          <w:szCs w:val="19"/>
+        </w:rPr>
+        <w:t xml:space="preserve">client/index.html</w:t>
+      </w:r>
+    </w:p>
+    <w:p>
+      <w:pPr>
+        <w:pStyle w:val="ListParagraph"/>
+        <w:numPr>
+          <w:ilvl w:val="0"/>
+          <w:numId w:val="2"/>
+        </w:numPr>
+      </w:pPr>
+      <w:r>
+        <w:rPr>
+          <w:rFonts w:ascii="Consolas" w:cs="Consolas" w:eastAsia="Consolas" w:hAnsi="Consolas"/>
+          <w:sz w:val="19"/>
+          <w:szCs w:val="19"/>
+        </w:rPr>
+        <w:t xml:space="preserve">client/pages/*.html (24 pages)</w:t>
+      </w:r>
+    </w:p>
+    <w:p>
+      <w:pPr>
+        <w:pStyle w:val="ListParagraph"/>
+        <w:numPr>
+          <w:ilvl w:val="0"/>
+          <w:numId w:val="2"/>
+        </w:numPr>
+      </w:pPr>
+      <w:r>
+        <w:rPr>
+          <w:rFonts w:ascii="Consolas" w:cs="Consolas" w:eastAsia="Consolas" w:hAnsi="Consolas"/>
+          <w:sz w:val="19"/>
+          <w:szCs w:val="19"/>
+        </w:rPr>
+        <w:t xml:space="preserve">client/assets/favicon.svg</w:t>
+      </w:r>
+    </w:p>
+    <w:p>
+      <w:pPr>
+        <w:pStyle w:val="ListParagraph"/>
+        <w:numPr>
+          <w:ilvl w:val="0"/>
+          <w:numId w:val="2"/>
+        </w:numPr>
+      </w:pPr>
+      <w:r>
+        <w:rPr>
+          <w:rFonts w:ascii="Consolas" w:cs="Consolas" w:eastAsia="Consolas" w:hAnsi="Consolas"/>
+          <w:sz w:val="19"/>
+          <w:szCs w:val="19"/>
+        </w:rPr>
+        <w:t xml:space="preserve">client/assets/sample-receipt.webp</w:t>
+      </w:r>
+    </w:p>
+    <w:p>
+      <w:pPr>
+        <w:spacing w:after="60" w:before="160"/>
+      </w:pPr>
+      <w:r>
+        <w:rPr>
+          <w:b/>
+          <w:bCs/>
+          <w:color w:val="4F46E5"/>
+          <w:spacing w:val="20"/>
+          <w:sz w:val="17"/>
+          <w:szCs w:val="17"/>
+        </w:rPr>
+        <w:t xml:space="preserve">RESULT</w:t>
+      </w:r>
+    </w:p>
+    <w:p>
+      <w:pPr>
+        <w:spacing w:after="80"/>
+      </w:pPr>
+      <w:r>
+        <w:rPr>
+          <w:sz w:val="21"/>
+          <w:szCs w:val="21"/>
+        </w:rPr>
+        <w:t xml:space="preserve">25 static pages. CSS-only interactions: mobile drawer (checkbox + :has), equal/custom split toggle (:has(#split-custom:checked)), purchased items struck through (:has(input:checked)), click-or-drop file input.</w:t>
+      </w:r>
+    </w:p>
+    <w:p>
+      <w:pPr>
+        <w:spacing w:after="60" w:before="160"/>
+      </w:pPr>
+      <w:r>
+        <w:rPr>
+          <w:b/>
+          <w:bCs/>
+          <w:color w:val="4F46E5"/>
+          <w:spacing w:val="20"/>
+          <w:sz w:val="17"/>
+          <w:szCs w:val="17"/>
+        </w:rPr>
+        <w:t xml:space="preserve">VERIFICATION</w:t>
+      </w:r>
+    </w:p>
+    <w:p>
+      <w:pPr>
+        <w:spacing w:after="80"/>
+      </w:pPr>
+      <w:r>
+        <w:rPr>
+          <w:sz w:val="21"/>
+          <w:szCs w:val="21"/>
+        </w:rPr>
+        <w:t xml:space="preserve">See the validation entry.</w:t>
+      </w:r>
+    </w:p>
+    <w:p>
+      <w:pPr>
+        <w:pBdr>
+          <w:bottom w:val="single" w:color="D9DBE5" w:sz="4" w:space="4"/>
+        </w:pBdr>
+        <w:spacing w:after="200"/>
+      </w:pPr>
+      <w:r>
+        <w:t xml:space="preserve"/>
+      </w:r>
+    </w:p>
+    <w:p>
+      <w:pPr>
+        <w:pStyle w:val="Heading3"/>
+        <w:keepNext/>
+      </w:pPr>
+      <w:r>
+        <w:t xml:space="preserve">#9  Local static server for previewing the client</w:t>
+      </w:r>
+    </w:p>
+    <w:p>
+      <w:pPr>
+        <w:keepNext/>
+        <w:spacing w:after="60"/>
+      </w:pPr>
+      <w:r>
+        <w:rPr>
+          <w:color w:val="5B6475"/>
+          <w:sz w:val="18"/>
+          <w:szCs w:val="18"/>
+        </w:rPr>
+        <w:t xml:space="preserve">Working prompt  |  2026-10-14</w:t>
+      </w:r>
+    </w:p>
+    <w:p>
+      <w:pPr>
+        <w:spacing w:after="60" w:before="160"/>
+      </w:pPr>
+      <w:r>
+        <w:rPr>
+          <w:b/>
+          <w:bCs/>
+          <w:color w:val="4F46E5"/>
+          <w:spacing w:val="20"/>
+          <w:sz w:val="17"/>
+          <w:szCs w:val="17"/>
+        </w:rPr>
+        <w:t xml:space="preserve">PROMPT</w:t>
+      </w:r>
+    </w:p>
+    <w:p>
+      <w:pPr>
+        <w:pBdr>
+          <w:left w:val="single" w:color="4F46E5" w:sz="18" w:space="8"/>
+        </w:pBdr>
+        <w:shd w:fill="F1F2F8" w:color="auto" w:val="clear"/>
+        <w:spacing w:after="120" w:before="40" w:line="276"/>
+        <w:ind w:left="160" w:right="160"/>
+      </w:pPr>
+      <w:r>
+        <w:rPr>
+          <w:rFonts w:ascii="Consolas" w:cs="Consolas" w:eastAsia="Consolas" w:hAnsi="Consolas"/>
+          <w:sz w:val="19"/>
+          <w:szCs w:val="19"/>
+        </w:rPr>
+        <w:t xml:space="preserve">Add a dependency-free Node static file server (scripts/serve-client.js) that serves client/ on http://localhost:5500, refuses paths outside client/, falls back to pages/404.html, and is started with "npm run client". Opening pages straight from disk also works, but Review 2 ES modules will need an http:// origin.</w:t>
+      </w:r>
+    </w:p>
+    <w:p>
+      <w:pPr>
+        <w:spacing w:after="60" w:before="160"/>
+      </w:pPr>
+      <w:r>
+        <w:rPr>
+          <w:b/>
+          <w:bCs/>
+          <w:color w:val="4F46E5"/>
+          <w:spacing w:val="20"/>
+          <w:sz w:val="17"/>
+          <w:szCs w:val="17"/>
+        </w:rPr>
+        <w:t xml:space="preserve">PURPOSE</w:t>
+      </w:r>
+    </w:p>
+    <w:p>
+      <w:pPr>
+        <w:spacing w:after="80"/>
+      </w:pPr>
+      <w:r>
+        <w:rPr>
+          <w:sz w:val="21"/>
+          <w:szCs w:val="21"/>
+        </w:rPr>
+        <w:t xml:space="preserve">Preview the site reliably now and prepare for JavaScript modules in Review 2.</w:t>
+      </w:r>
+    </w:p>
+    <w:p>
+      <w:pPr>
+        <w:spacing w:after="60" w:before="160"/>
+      </w:pPr>
+      <w:r>
+        <w:rPr>
+          <w:b/>
+          <w:bCs/>
+          <w:color w:val="4F46E5"/>
+          <w:spacing w:val="20"/>
+          <w:sz w:val="17"/>
+          <w:szCs w:val="17"/>
+        </w:rPr>
+        <w:t xml:space="preserve">FILES</w:t>
+      </w:r>
+    </w:p>
+    <w:p>
+      <w:pPr>
+        <w:pStyle w:val="ListParagraph"/>
+        <w:numPr>
+          <w:ilvl w:val="0"/>
+          <w:numId w:val="2"/>
+        </w:numPr>
+      </w:pPr>
+      <w:r>
+        <w:rPr>
+          <w:rFonts w:ascii="Consolas" w:cs="Consolas" w:eastAsia="Consolas" w:hAnsi="Consolas"/>
+          <w:sz w:val="19"/>
+          <w:szCs w:val="19"/>
+        </w:rPr>
+        <w:t xml:space="preserve">scripts/serve-client.js</w:t>
+      </w:r>
+    </w:p>
+    <w:p>
+      <w:pPr>
+        <w:pStyle w:val="ListParagraph"/>
+        <w:numPr>
+          <w:ilvl w:val="0"/>
+          <w:numId w:val="2"/>
+        </w:numPr>
+      </w:pPr>
+      <w:r>
+        <w:rPr>
+          <w:rFonts w:ascii="Consolas" w:cs="Consolas" w:eastAsia="Consolas" w:hAnsi="Consolas"/>
+          <w:sz w:val="19"/>
+          <w:szCs w:val="19"/>
+        </w:rPr>
+        <w:t xml:space="preserve">package.json</w:t>
+      </w:r>
+    </w:p>
+    <w:p>
+      <w:pPr>
+        <w:pStyle w:val="ListParagraph"/>
+        <w:numPr>
+          <w:ilvl w:val="0"/>
+          <w:numId w:val="2"/>
+        </w:numPr>
+      </w:pPr>
+      <w:r>
+        <w:rPr>
+          <w:rFonts w:ascii="Consolas" w:cs="Consolas" w:eastAsia="Consolas" w:hAnsi="Consolas"/>
+          <w:sz w:val="19"/>
+          <w:szCs w:val="19"/>
+        </w:rPr>
+        <w:t xml:space="preserve">.claude/launch.json</w:t>
+      </w:r>
+    </w:p>
+    <w:p>
+      <w:pPr>
+        <w:spacing w:after="60" w:before="160"/>
+      </w:pPr>
+      <w:r>
+        <w:rPr>
+          <w:b/>
+          <w:bCs/>
+          <w:color w:val="4F46E5"/>
+          <w:spacing w:val="20"/>
+          <w:sz w:val="17"/>
+          <w:szCs w:val="17"/>
+        </w:rPr>
+        <w:t xml:space="preserve">RESULT</w:t>
+      </w:r>
+    </w:p>
+    <w:p>
+      <w:pPr>
+        <w:spacing w:after="80"/>
+      </w:pPr>
+      <w:r>
+        <w:rPr>
+          <w:sz w:val="21"/>
+          <w:szCs w:val="21"/>
+        </w:rPr>
+        <w:t xml:space="preserve">npm run client serves the site.</w:t>
+      </w:r>
+    </w:p>
+    <w:p>
+      <w:pPr>
+        <w:spacing w:after="60" w:before="160"/>
+      </w:pPr>
+      <w:r>
+        <w:rPr>
+          <w:b/>
+          <w:bCs/>
+          <w:color w:val="4F46E5"/>
+          <w:spacing w:val="20"/>
+          <w:sz w:val="17"/>
+          <w:szCs w:val="17"/>
+        </w:rPr>
+        <w:t xml:space="preserve">VERIFICATION</w:t>
+      </w:r>
+    </w:p>
+    <w:p>
+      <w:pPr>
+        <w:spacing w:after="80"/>
+      </w:pPr>
+      <w:r>
+        <w:rPr>
+          <w:sz w:val="21"/>
+          <w:szCs w:val="21"/>
+        </w:rPr>
+        <w:t xml:space="preserve">Pages loaded in the in-app browser at localhost:5500.</w:t>
+      </w:r>
+    </w:p>
+    <w:p>
+      <w:pPr>
+        <w:pBdr>
+          <w:bottom w:val="single" w:color="D9DBE5" w:sz="4" w:space="4"/>
+        </w:pBdr>
+        <w:spacing w:after="200"/>
+      </w:pPr>
+      <w:r>
+        <w:t xml:space="preserve"/>
+      </w:r>
+    </w:p>
+    <w:p>
+      <w:pPr>
+        <w:pStyle w:val="Heading3"/>
+        <w:keepNext/>
+      </w:pPr>
+      <w:r>
+        <w:t xml:space="preserve">#10  Validate HTML and fix issues</w:t>
+      </w:r>
+    </w:p>
+    <w:p>
+      <w:pPr>
+        <w:keepNext/>
+        <w:spacing w:after="60"/>
+      </w:pPr>
+      <w:r>
+        <w:rPr>
+          <w:color w:val="5B6475"/>
+          <w:sz w:val="18"/>
+          <w:szCs w:val="18"/>
+        </w:rPr>
+        <w:t xml:space="preserve">Working prompt  |  2026-10-14</w:t>
+      </w:r>
+    </w:p>
+    <w:p>
+      <w:pPr>
+        <w:spacing w:after="60" w:before="160"/>
+      </w:pPr>
+      <w:r>
+        <w:rPr>
+          <w:b/>
+          <w:bCs/>
+          <w:color w:val="4F46E5"/>
+          <w:spacing w:val="20"/>
+          <w:sz w:val="17"/>
+          <w:szCs w:val="17"/>
+        </w:rPr>
+        <w:t xml:space="preserve">PROMPT</w:t>
+      </w:r>
+    </w:p>
+    <w:p>
+      <w:pPr>
+        <w:pBdr>
+          <w:left w:val="single" w:color="4F46E5" w:sz="18" w:space="8"/>
+        </w:pBdr>
+        <w:shd w:fill="F1F2F8" w:color="auto" w:val="clear"/>
+        <w:spacing w:after="120" w:before="40" w:line="276"/>
+        <w:ind w:left="160" w:right="160"/>
+      </w:pPr>
+      <w:r>
+        <w:rPr>
+          <w:rFonts w:ascii="Consolas" w:cs="Consolas" w:eastAsia="Consolas" w:hAnsi="Consolas"/>
+          <w:sz w:val="19"/>
+          <w:szCs w:val="19"/>
+        </w:rPr>
+        <w:t xml:space="preserve">Install html-validate as a dev dependency with a project config (.htmlvalidate.json) based on html-validate:recommended, run it on client/**/*.html and fix every error: unescaped ampersands, a search form without a submit button, unnamed duplicate landmarks, aria-label on a plain div, a form without a submit button, redundant ARIA roles. Allow shared names for checkbox groups and the custom progressbar (needed for over-100% budget states). Then check that every relative href/src resolves to a real file.</w:t>
+      </w:r>
+    </w:p>
+    <w:p>
+      <w:pPr>
+        <w:spacing w:after="60" w:before="160"/>
+      </w:pPr>
+      <w:r>
+        <w:rPr>
+          <w:b/>
+          <w:bCs/>
+          <w:color w:val="4F46E5"/>
+          <w:spacing w:val="20"/>
+          <w:sz w:val="17"/>
+          <w:szCs w:val="17"/>
+        </w:rPr>
+        <w:t xml:space="preserve">PURPOSE</w:t>
+      </w:r>
+    </w:p>
+    <w:p>
+      <w:pPr>
+        <w:spacing w:after="80"/>
+      </w:pPr>
+      <w:r>
+        <w:rPr>
+          <w:sz w:val="21"/>
+          <w:szCs w:val="21"/>
+        </w:rPr>
+        <w:t xml:space="preserve">Show that the Review 1 markup is standards-compliant and accessible.</w:t>
+      </w:r>
+    </w:p>
+    <w:p>
+      <w:pPr>
+        <w:spacing w:after="60" w:before="160"/>
+      </w:pPr>
+      <w:r>
+        <w:rPr>
+          <w:b/>
+          <w:bCs/>
+          <w:color w:val="4F46E5"/>
+          <w:spacing w:val="20"/>
+          <w:sz w:val="17"/>
+          <w:szCs w:val="17"/>
+        </w:rPr>
+        <w:t xml:space="preserve">FILES</w:t>
+      </w:r>
+    </w:p>
+    <w:p>
+      <w:pPr>
+        <w:pStyle w:val="ListParagraph"/>
+        <w:numPr>
+          <w:ilvl w:val="0"/>
+          <w:numId w:val="2"/>
+        </w:numPr>
+      </w:pPr>
+      <w:r>
+        <w:rPr>
+          <w:rFonts w:ascii="Consolas" w:cs="Consolas" w:eastAsia="Consolas" w:hAnsi="Consolas"/>
+          <w:sz w:val="19"/>
+          <w:szCs w:val="19"/>
+        </w:rPr>
+        <w:t xml:space="preserve">.htmlvalidate.json</w:t>
+      </w:r>
+    </w:p>
+    <w:p>
+      <w:pPr>
+        <w:pStyle w:val="ListParagraph"/>
+        <w:numPr>
+          <w:ilvl w:val="0"/>
+          <w:numId w:val="2"/>
+        </w:numPr>
+      </w:pPr>
+      <w:r>
+        <w:rPr>
+          <w:rFonts w:ascii="Consolas" w:cs="Consolas" w:eastAsia="Consolas" w:hAnsi="Consolas"/>
+          <w:sz w:val="19"/>
+          <w:szCs w:val="19"/>
+        </w:rPr>
+        <w:t xml:space="preserve">package.json</w:t>
+      </w:r>
+    </w:p>
+    <w:p>
+      <w:pPr>
+        <w:pStyle w:val="ListParagraph"/>
+        <w:numPr>
+          <w:ilvl w:val="0"/>
+          <w:numId w:val="2"/>
+        </w:numPr>
+      </w:pPr>
+      <w:r>
+        <w:rPr>
+          <w:rFonts w:ascii="Consolas" w:cs="Consolas" w:eastAsia="Consolas" w:hAnsi="Consolas"/>
+          <w:sz w:val="19"/>
+          <w:szCs w:val="19"/>
+        </w:rPr>
+        <w:t xml:space="preserve">client/**/*.html</w:t>
+      </w:r>
+    </w:p>
+    <w:p>
+      <w:pPr>
+        <w:spacing w:after="60" w:before="160"/>
+      </w:pPr>
+      <w:r>
+        <w:rPr>
+          <w:b/>
+          <w:bCs/>
+          <w:color w:val="4F46E5"/>
+          <w:spacing w:val="20"/>
+          <w:sz w:val="17"/>
+          <w:szCs w:val="17"/>
+        </w:rPr>
+        <w:t xml:space="preserve">RESULT</w:t>
+      </w:r>
+    </w:p>
+    <w:p>
+      <w:pPr>
+        <w:spacing w:after="80"/>
+      </w:pPr>
+      <w:r>
+        <w:rPr>
+          <w:sz w:val="21"/>
+          <w:szCs w:val="21"/>
+        </w:rPr>
+        <w:t xml:space="preserve">First run: 100 errors. After fixes: 0 errors across 25 pages; 0 broken internal links.</w:t>
+      </w:r>
+    </w:p>
+    <w:p>
+      <w:pPr>
+        <w:spacing w:after="60" w:before="160"/>
+      </w:pPr>
+      <w:r>
+        <w:rPr>
+          <w:b/>
+          <w:bCs/>
+          <w:color w:val="4F46E5"/>
+          <w:spacing w:val="20"/>
+          <w:sz w:val="17"/>
+          <w:szCs w:val="17"/>
+        </w:rPr>
+        <w:t xml:space="preserve">VERIFICATION</w:t>
+      </w:r>
+    </w:p>
+    <w:p>
+      <w:pPr>
+        <w:spacing w:after="80"/>
+      </w:pPr>
+      <w:r>
+        <w:rPr>
+          <w:sz w:val="21"/>
+          <w:szCs w:val="21"/>
+        </w:rPr>
+        <w:t xml:space="preserve">npx html-validate "client/**/*.html" exits 0.</w:t>
+      </w:r>
+    </w:p>
+    <w:p>
+      <w:pPr>
+        <w:pBdr>
+          <w:bottom w:val="single" w:color="D9DBE5" w:sz="4" w:space="4"/>
+        </w:pBdr>
+        <w:spacing w:after="200"/>
+      </w:pPr>
+      <w:r>
+        <w:t xml:space="preserve"/>
+      </w:r>
+    </w:p>
+    <w:p>
+      <w:pPr>
+        <w:pStyle w:val="Heading3"/>
+        <w:keepNext/>
+      </w:pPr>
+      <w:r>
+        <w:t xml:space="preserve">#11  Visual QA and layout bug fixes</w:t>
+      </w:r>
+    </w:p>
+    <w:p>
+      <w:pPr>
+        <w:keepNext/>
+        <w:spacing w:after="60"/>
+      </w:pPr>
+      <w:r>
+        <w:rPr>
+          <w:color w:val="5B6475"/>
+          <w:sz w:val="18"/>
+          <w:szCs w:val="18"/>
+        </w:rPr>
+        <w:t xml:space="preserve">Working prompt  |  2026-10-14</w:t>
+      </w:r>
+    </w:p>
+    <w:p>
+      <w:pPr>
+        <w:spacing w:after="60" w:before="160"/>
+      </w:pPr>
+      <w:r>
+        <w:rPr>
+          <w:b/>
+          <w:bCs/>
+          <w:color w:val="4F46E5"/>
+          <w:spacing w:val="20"/>
+          <w:sz w:val="17"/>
+          <w:szCs w:val="17"/>
+        </w:rPr>
+        <w:t xml:space="preserve">PROMPT</w:t>
+      </w:r>
+    </w:p>
+    <w:p>
+      <w:pPr>
+        <w:pBdr>
+          <w:left w:val="single" w:color="4F46E5" w:sz="18" w:space="8"/>
+        </w:pBdr>
+        <w:shd w:fill="F1F2F8" w:color="auto" w:val="clear"/>
+        <w:spacing w:after="120" w:before="40" w:line="276"/>
+        <w:ind w:left="160" w:right="160"/>
+      </w:pPr>
+      <w:r>
+        <w:rPr>
+          <w:rFonts w:ascii="Consolas" w:cs="Consolas" w:eastAsia="Consolas" w:hAnsi="Consolas"/>
+          <w:sz w:val="19"/>
+          <w:szCs w:val="19"/>
+        </w:rPr>
+        <w:t xml:space="preserve">Open the pages in the browser at desktop (1366px) and mobile (375px) widths, look for layout bugs and fix them in the CSS. Then load every page in a 375px and a 1280px iframe and report any element that overflows the viewport horizontally.</w:t>
+      </w:r>
+    </w:p>
+    <w:p>
+      <w:pPr>
+        <w:spacing w:after="60" w:before="160"/>
+      </w:pPr>
+      <w:r>
+        <w:rPr>
+          <w:b/>
+          <w:bCs/>
+          <w:color w:val="4F46E5"/>
+          <w:spacing w:val="20"/>
+          <w:sz w:val="17"/>
+          <w:szCs w:val="17"/>
+        </w:rPr>
+        <w:t xml:space="preserve">PURPOSE</w:t>
+      </w:r>
+    </w:p>
+    <w:p>
+      <w:pPr>
+        <w:spacing w:after="80"/>
+      </w:pPr>
+      <w:r>
+        <w:rPr>
+          <w:sz w:val="21"/>
+          <w:szCs w:val="21"/>
+        </w:rPr>
+        <w:t xml:space="preserve">Catch rendering problems that a validator cannot see.</w:t>
+      </w:r>
+    </w:p>
+    <w:p>
+      <w:pPr>
+        <w:spacing w:after="60" w:before="160"/>
+      </w:pPr>
+      <w:r>
+        <w:rPr>
+          <w:b/>
+          <w:bCs/>
+          <w:color w:val="4F46E5"/>
+          <w:spacing w:val="20"/>
+          <w:sz w:val="17"/>
+          <w:szCs w:val="17"/>
+        </w:rPr>
+        <w:t xml:space="preserve">FILES</w:t>
+      </w:r>
+    </w:p>
+    <w:p>
+      <w:pPr>
+        <w:pStyle w:val="ListParagraph"/>
+        <w:numPr>
+          <w:ilvl w:val="0"/>
+          <w:numId w:val="2"/>
+        </w:numPr>
+      </w:pPr>
+      <w:r>
+        <w:rPr>
+          <w:rFonts w:ascii="Consolas" w:cs="Consolas" w:eastAsia="Consolas" w:hAnsi="Consolas"/>
+          <w:sz w:val="19"/>
+          <w:szCs w:val="19"/>
+        </w:rPr>
+        <w:t xml:space="preserve">client/css/layout.css</w:t>
+      </w:r>
+    </w:p>
+    <w:p>
+      <w:pPr>
+        <w:pStyle w:val="ListParagraph"/>
+        <w:numPr>
+          <w:ilvl w:val="0"/>
+          <w:numId w:val="2"/>
+        </w:numPr>
+      </w:pPr>
+      <w:r>
+        <w:rPr>
+          <w:rFonts w:ascii="Consolas" w:cs="Consolas" w:eastAsia="Consolas" w:hAnsi="Consolas"/>
+          <w:sz w:val="19"/>
+          <w:szCs w:val="19"/>
+        </w:rPr>
+        <w:t xml:space="preserve">client/css/components.css</w:t>
+      </w:r>
+    </w:p>
+    <w:p>
+      <w:pPr>
+        <w:spacing w:after="60" w:before="160"/>
+      </w:pPr>
+      <w:r>
+        <w:rPr>
+          <w:b/>
+          <w:bCs/>
+          <w:color w:val="4F46E5"/>
+          <w:spacing w:val="20"/>
+          <w:sz w:val="17"/>
+          <w:szCs w:val="17"/>
+        </w:rPr>
+        <w:t xml:space="preserve">RESULT</w:t>
+      </w:r>
+    </w:p>
+    <w:p>
+      <w:pPr>
+        <w:spacing w:after="80"/>
+      </w:pPr>
+      <w:r>
+        <w:rPr>
+          <w:sz w:val="21"/>
+          <w:szCs w:val="21"/>
+        </w:rPr>
+        <w:t xml:space="preserve">Fixed: (1) the scrim &lt;label&gt; occupied a grid cell on desktop and pushed the main column below the sidebar; (2) the mobile menu button showed on desktop and the search icon overlapped the placeholder, because the components layer overrides the layout layer; those elements now have layout-only classes; (3) table dates wrapped onto two lines.</w:t>
+      </w:r>
+    </w:p>
+    <w:p>
+      <w:pPr>
+        <w:spacing w:after="60" w:before="160"/>
+      </w:pPr>
+      <w:r>
+        <w:rPr>
+          <w:b/>
+          <w:bCs/>
+          <w:color w:val="4F46E5"/>
+          <w:spacing w:val="20"/>
+          <w:sz w:val="17"/>
+          <w:szCs w:val="17"/>
+        </w:rPr>
+        <w:t xml:space="preserve">VERIFICATION</w:t>
+      </w:r>
+    </w:p>
+    <w:p>
+      <w:pPr>
+        <w:spacing w:after="80"/>
+      </w:pPr>
+      <w:r>
+        <w:rPr>
+          <w:sz w:val="21"/>
+          <w:szCs w:val="21"/>
+        </w:rPr>
+        <w:t xml:space="preserve">Screenshots at both widths; scripted overflow check across all pages.</w:t>
+      </w:r>
+    </w:p>
+    <w:p>
+      <w:pPr>
+        <w:pBdr>
+          <w:bottom w:val="single" w:color="D9DBE5" w:sz="4" w:space="4"/>
+        </w:pBdr>
+        <w:spacing w:after="200"/>
+      </w:pPr>
+      <w:r>
+        <w:t xml:space="preserve"/>
+      </w:r>
+    </w:p>
+    <w:p>
+      <w:pPr>
+        <w:pStyle w:val="Heading3"/>
+        <w:keepNext/>
+      </w:pPr>
+      <w:r>
+        <w:t xml:space="preserve">#12  Client README and Review 1 checkpoint commit</w:t>
+      </w:r>
+    </w:p>
+    <w:p>
+      <w:pPr>
+        <w:keepNext/>
+        <w:spacing w:after="60"/>
+      </w:pPr>
+      <w:r>
+        <w:rPr>
+          <w:color w:val="5B6475"/>
+          <w:sz w:val="18"/>
+          <w:szCs w:val="18"/>
+        </w:rPr>
+        <w:t xml:space="preserve">Working prompt  |  2026-10-14</w:t>
+      </w:r>
+    </w:p>
+    <w:p>
+      <w:pPr>
+        <w:spacing w:after="60" w:before="160"/>
+      </w:pPr>
+      <w:r>
+        <w:rPr>
+          <w:b/>
+          <w:bCs/>
+          <w:color w:val="4F46E5"/>
+          <w:spacing w:val="20"/>
+          <w:sz w:val="17"/>
+          <w:szCs w:val="17"/>
+        </w:rPr>
+        <w:t xml:space="preserve">PROMPT</w:t>
+      </w:r>
+    </w:p>
+    <w:p>
+      <w:pPr>
+        <w:pBdr>
+          <w:left w:val="single" w:color="4F46E5" w:sz="18" w:space="8"/>
+        </w:pBdr>
+        <w:shd w:fill="F1F2F8" w:color="auto" w:val="clear"/>
+        <w:spacing w:after="120" w:before="40" w:line="276"/>
+        <w:ind w:left="160" w:right="160"/>
+      </w:pPr>
+      <w:r>
+        <w:rPr>
+          <w:rFonts w:ascii="Consolas" w:cs="Consolas" w:eastAsia="Consolas" w:hAnsi="Consolas"/>
+          <w:sz w:val="19"/>
+          <w:szCs w:val="19"/>
+        </w:rPr>
+        <w:t xml:space="preserve">Write client/README.md explaining how to view the site (npm run client), the folder structure, and a table of the CSS techniques used, with the file each one is in, so the Review 1 demo can point to them. Add an "npm run lint:html" script. Re-run validation, regenerate the prompt log, and commit Review 1 on the refurbish branch.</w:t>
+      </w:r>
+    </w:p>
+    <w:p>
+      <w:pPr>
+        <w:spacing w:after="60" w:before="160"/>
+      </w:pPr>
+      <w:r>
+        <w:rPr>
+          <w:b/>
+          <w:bCs/>
+          <w:color w:val="4F46E5"/>
+          <w:spacing w:val="20"/>
+          <w:sz w:val="17"/>
+          <w:szCs w:val="17"/>
+        </w:rPr>
+        <w:t xml:space="preserve">PURPOSE</w:t>
+      </w:r>
+    </w:p>
+    <w:p>
+      <w:pPr>
+        <w:spacing w:after="80"/>
+      </w:pPr>
+      <w:r>
+        <w:rPr>
+          <w:sz w:val="21"/>
+          <w:szCs w:val="21"/>
+        </w:rPr>
+        <w:t xml:space="preserve">Make Review 1 easy to present and record a clean checkpoint.</w:t>
+      </w:r>
+    </w:p>
+    <w:p>
+      <w:pPr>
+        <w:spacing w:after="60" w:before="160"/>
+      </w:pPr>
+      <w:r>
+        <w:rPr>
+          <w:b/>
+          <w:bCs/>
+          <w:color w:val="4F46E5"/>
+          <w:spacing w:val="20"/>
+          <w:sz w:val="17"/>
+          <w:szCs w:val="17"/>
+        </w:rPr>
+        <w:t xml:space="preserve">FILES</w:t>
+      </w:r>
+    </w:p>
+    <w:p>
+      <w:pPr>
+        <w:pStyle w:val="ListParagraph"/>
+        <w:numPr>
+          <w:ilvl w:val="0"/>
+          <w:numId w:val="2"/>
+        </w:numPr>
+      </w:pPr>
+      <w:r>
+        <w:rPr>
+          <w:rFonts w:ascii="Consolas" w:cs="Consolas" w:eastAsia="Consolas" w:hAnsi="Consolas"/>
+          <w:sz w:val="19"/>
+          <w:szCs w:val="19"/>
+        </w:rPr>
+        <w:t xml:space="preserve">client/README.md</w:t>
+      </w:r>
+    </w:p>
+    <w:p>
+      <w:pPr>
+        <w:pStyle w:val="ListParagraph"/>
+        <w:numPr>
+          <w:ilvl w:val="0"/>
+          <w:numId w:val="2"/>
+        </w:numPr>
+      </w:pPr>
+      <w:r>
+        <w:rPr>
+          <w:rFonts w:ascii="Consolas" w:cs="Consolas" w:eastAsia="Consolas" w:hAnsi="Consolas"/>
+          <w:sz w:val="19"/>
+          <w:szCs w:val="19"/>
+        </w:rPr>
+        <w:t xml:space="preserve">package.json</w:t>
+      </w:r>
+    </w:p>
+    <w:p>
+      <w:pPr>
+        <w:pStyle w:val="ListParagraph"/>
+        <w:numPr>
+          <w:ilvl w:val="0"/>
+          <w:numId w:val="2"/>
+        </w:numPr>
+      </w:pPr>
+      <w:r>
+        <w:rPr>
+          <w:rFonts w:ascii="Consolas" w:cs="Consolas" w:eastAsia="Consolas" w:hAnsi="Consolas"/>
+          <w:sz w:val="19"/>
+          <w:szCs w:val="19"/>
+        </w:rPr>
+        <w:t xml:space="preserve">docs/SplitStack_Prompt_Log.docx</w:t>
+      </w:r>
+    </w:p>
+    <w:p>
+      <w:pPr>
+        <w:spacing w:after="60" w:before="160"/>
+      </w:pPr>
+      <w:r>
+        <w:rPr>
+          <w:b/>
+          <w:bCs/>
+          <w:color w:val="4F46E5"/>
+          <w:spacing w:val="20"/>
+          <w:sz w:val="17"/>
+          <w:szCs w:val="17"/>
+        </w:rPr>
+        <w:t xml:space="preserve">RESULT</w:t>
+      </w:r>
+    </w:p>
+    <w:p>
+      <w:pPr>
+        <w:spacing w:after="80"/>
+      </w:pPr>
+      <w:r>
+        <w:rPr>
+          <w:sz w:val="21"/>
+          <w:szCs w:val="21"/>
+        </w:rPr>
+        <w:t xml:space="preserve">Review 1 committed. Next: Review 2 (vanilla JavaScript modules).</w:t>
+      </w:r>
+    </w:p>
+    <w:p>
+      <w:pPr>
+        <w:spacing w:after="60" w:before="160"/>
+      </w:pPr>
+      <w:r>
+        <w:rPr>
+          <w:b/>
+          <w:bCs/>
+          <w:color w:val="4F46E5"/>
+          <w:spacing w:val="20"/>
+          <w:sz w:val="17"/>
+          <w:szCs w:val="17"/>
+        </w:rPr>
+        <w:t xml:space="preserve">VERIFICATION</w:t>
+      </w:r>
+    </w:p>
+    <w:p>
+      <w:pPr>
+        <w:spacing w:after="80"/>
+      </w:pPr>
+      <w:r>
+        <w:rPr>
+          <w:sz w:val="21"/>
+          <w:szCs w:val="21"/>
+        </w:rPr>
+        <w:t xml:space="preserve">npm run lint:html passes; git log shows the Review 1 commit.</w:t>
       </w:r>
     </w:p>
     <w:p>

</xml_diff>

<commit_message>
Add PDF prompt log, planned prompts and GitHub Pages deployment
- docs/tools/build_prompt_pdf.py renders the prompt log to PDF
- prompt_log.json gains the planned prompts for Review 2, Review 3
  and wrap-up; Word log shows them too; npm run log builds both
- GitHub Actions workflow publishes client/ to GitHub Pages
- README notes the refurbishment status and links

Co-Authored-By: Claude Opus 5.5 <noreply@anthropic.com>
</commit_message>
<xml_diff>
--- a/docs/SplitStack_Prompt_Log.docx
+++ b/docs/SplitStack_Prompt_Log.docx
@@ -111,7 +111,7 @@
           <w:sz w:val="21"/>
           <w:szCs w:val="21"/>
         </w:rPr>
-        <w:t xml:space="preserve">github.com/PAVITHRAN1511/SplitStack (branch: refurbish)</w:t>
+        <w:t xml:space="preserve">https://github.com/MahaprabhuK/SplitStack</w:t>
       </w:r>
     </w:p>
     <w:p>
@@ -132,7 +132,7 @@
           <w:sz w:val="21"/>
           <w:szCs w:val="21"/>
         </w:rPr>
-        <w:t xml:space="preserve">12</w:t>
+        <w:t xml:space="preserve">15</w:t>
       </w:r>
     </w:p>
     <w:p>
@@ -153,7 +153,7 @@
           <w:sz w:val="21"/>
           <w:szCs w:val="21"/>
         </w:rPr>
-        <w:t xml:space="preserve">2026-10-14</w:t>
+        <w:t xml:space="preserve">2026-10-15</w:t>
       </w:r>
     </w:p>
     <w:p>
@@ -713,7 +713,7 @@
                 <w:sz w:val="18"/>
                 <w:szCs w:val="18"/>
               </w:rPr>
-              <w:t xml:space="preserve">0</w:t>
+              <w:t xml:space="preserve">3</w:t>
             </w:r>
           </w:p>
         </w:tc>
@@ -2306,6 +2306,362 @@
           </w:p>
         </w:tc>
       </w:tr>
+      <w:tr>
+        <w:tc>
+          <w:tcPr>
+            <w:tcW w:type="dxa" w:w="700"/>
+            <w:tcMar>
+              <w:top w:type="dxa" w:w="60"/>
+              <w:left w:type="dxa" w:w="100"/>
+              <w:bottom w:type="dxa" w:w="60"/>
+              <w:right w:type="dxa" w:w="100"/>
+            </w:tcMar>
+          </w:tcPr>
+          <w:p>
+            <w:r>
+              <w:rPr>
+                <w:b w:val="false"/>
+                <w:bCs w:val="false"/>
+                <w:color w:val="222222"/>
+                <w:sz w:val="18"/>
+                <w:szCs w:val="18"/>
+              </w:rPr>
+              <w:t xml:space="preserve">13</w:t>
+            </w:r>
+          </w:p>
+        </w:tc>
+        <w:tc>
+          <w:tcPr>
+            <w:tcW w:type="dxa" w:w="1500"/>
+            <w:tcMar>
+              <w:top w:type="dxa" w:w="60"/>
+              <w:left w:type="dxa" w:w="100"/>
+              <w:bottom w:type="dxa" w:w="60"/>
+              <w:right w:type="dxa" w:w="100"/>
+            </w:tcMar>
+          </w:tcPr>
+          <w:p>
+            <w:r>
+              <w:rPr>
+                <w:b w:val="false"/>
+                <w:bCs w:val="false"/>
+                <w:color w:val="222222"/>
+                <w:sz w:val="18"/>
+                <w:szCs w:val="18"/>
+              </w:rPr>
+              <w:t xml:space="preserve">Wrap-up</w:t>
+            </w:r>
+          </w:p>
+        </w:tc>
+        <w:tc>
+          <w:tcPr>
+            <w:tcW w:type="dxa" w:w="4538"/>
+            <w:tcMar>
+              <w:top w:type="dxa" w:w="60"/>
+              <w:left w:type="dxa" w:w="100"/>
+              <w:bottom w:type="dxa" w:w="60"/>
+              <w:right w:type="dxa" w:w="100"/>
+            </w:tcMar>
+          </w:tcPr>
+          <w:p>
+            <w:r>
+              <w:rPr>
+                <w:b w:val="false"/>
+                <w:bCs w:val="false"/>
+                <w:color w:val="222222"/>
+                <w:sz w:val="18"/>
+                <w:szCs w:val="18"/>
+              </w:rPr>
+              <w:t xml:space="preserve">Request: GitHub repository, website link and PDF of prompts</w:t>
+            </w:r>
+          </w:p>
+        </w:tc>
+        <w:tc>
+          <w:tcPr>
+            <w:tcW w:type="dxa" w:w="1500"/>
+            <w:tcMar>
+              <w:top w:type="dxa" w:w="60"/>
+              <w:left w:type="dxa" w:w="100"/>
+              <w:bottom w:type="dxa" w:w="60"/>
+              <w:right w:type="dxa" w:w="100"/>
+            </w:tcMar>
+          </w:tcPr>
+          <w:p>
+            <w:r>
+              <w:rPr>
+                <w:b w:val="false"/>
+                <w:bCs w:val="false"/>
+                <w:color w:val="222222"/>
+                <w:sz w:val="18"/>
+                <w:szCs w:val="18"/>
+              </w:rPr>
+              <w:t xml:space="preserve">User prompt</w:t>
+            </w:r>
+          </w:p>
+        </w:tc>
+        <w:tc>
+          <w:tcPr>
+            <w:tcW w:type="dxa" w:w="1400"/>
+            <w:tcMar>
+              <w:top w:type="dxa" w:w="60"/>
+              <w:left w:type="dxa" w:w="100"/>
+              <w:bottom w:type="dxa" w:w="60"/>
+              <w:right w:type="dxa" w:w="100"/>
+            </w:tcMar>
+          </w:tcPr>
+          <w:p>
+            <w:r>
+              <w:rPr>
+                <w:b w:val="false"/>
+                <w:bCs w:val="false"/>
+                <w:color w:val="222222"/>
+                <w:sz w:val="18"/>
+                <w:szCs w:val="18"/>
+              </w:rPr>
+              <w:t xml:space="preserve">2026-10-15</w:t>
+            </w:r>
+          </w:p>
+        </w:tc>
+      </w:tr>
+      <w:tr>
+        <w:tc>
+          <w:tcPr>
+            <w:tcW w:type="dxa" w:w="700"/>
+            <w:shd w:fill="F7F7FB" w:color="auto" w:val="clear"/>
+            <w:tcMar>
+              <w:top w:type="dxa" w:w="60"/>
+              <w:left w:type="dxa" w:w="100"/>
+              <w:bottom w:type="dxa" w:w="60"/>
+              <w:right w:type="dxa" w:w="100"/>
+            </w:tcMar>
+          </w:tcPr>
+          <w:p>
+            <w:r>
+              <w:rPr>
+                <w:b w:val="false"/>
+                <w:bCs w:val="false"/>
+                <w:color w:val="222222"/>
+                <w:sz w:val="18"/>
+                <w:szCs w:val="18"/>
+              </w:rPr>
+              <w:t xml:space="preserve">14</w:t>
+            </w:r>
+          </w:p>
+        </w:tc>
+        <w:tc>
+          <w:tcPr>
+            <w:tcW w:type="dxa" w:w="1500"/>
+            <w:shd w:fill="F7F7FB" w:color="auto" w:val="clear"/>
+            <w:tcMar>
+              <w:top w:type="dxa" w:w="60"/>
+              <w:left w:type="dxa" w:w="100"/>
+              <w:bottom w:type="dxa" w:w="60"/>
+              <w:right w:type="dxa" w:w="100"/>
+            </w:tcMar>
+          </w:tcPr>
+          <w:p>
+            <w:r>
+              <w:rPr>
+                <w:b w:val="false"/>
+                <w:bCs w:val="false"/>
+                <w:color w:val="222222"/>
+                <w:sz w:val="18"/>
+                <w:szCs w:val="18"/>
+              </w:rPr>
+              <w:t xml:space="preserve">Wrap-up</w:t>
+            </w:r>
+          </w:p>
+        </w:tc>
+        <w:tc>
+          <w:tcPr>
+            <w:tcW w:type="dxa" w:w="4538"/>
+            <w:shd w:fill="F7F7FB" w:color="auto" w:val="clear"/>
+            <w:tcMar>
+              <w:top w:type="dxa" w:w="60"/>
+              <w:left w:type="dxa" w:w="100"/>
+              <w:bottom w:type="dxa" w:w="60"/>
+              <w:right w:type="dxa" w:w="100"/>
+            </w:tcMar>
+          </w:tcPr>
+          <w:p>
+            <w:r>
+              <w:rPr>
+                <w:b w:val="false"/>
+                <w:bCs w:val="false"/>
+                <w:color w:val="222222"/>
+                <w:sz w:val="18"/>
+                <w:szCs w:val="18"/>
+              </w:rPr>
+              <w:t xml:space="preserve">PDF export of the prompt log, including planned prompts</w:t>
+            </w:r>
+          </w:p>
+        </w:tc>
+        <w:tc>
+          <w:tcPr>
+            <w:tcW w:type="dxa" w:w="1500"/>
+            <w:shd w:fill="F7F7FB" w:color="auto" w:val="clear"/>
+            <w:tcMar>
+              <w:top w:type="dxa" w:w="60"/>
+              <w:left w:type="dxa" w:w="100"/>
+              <w:bottom w:type="dxa" w:w="60"/>
+              <w:right w:type="dxa" w:w="100"/>
+            </w:tcMar>
+          </w:tcPr>
+          <w:p>
+            <w:r>
+              <w:rPr>
+                <w:b w:val="false"/>
+                <w:bCs w:val="false"/>
+                <w:color w:val="222222"/>
+                <w:sz w:val="18"/>
+                <w:szCs w:val="18"/>
+              </w:rPr>
+              <w:t xml:space="preserve">Working prompt</w:t>
+            </w:r>
+          </w:p>
+        </w:tc>
+        <w:tc>
+          <w:tcPr>
+            <w:tcW w:type="dxa" w:w="1400"/>
+            <w:shd w:fill="F7F7FB" w:color="auto" w:val="clear"/>
+            <w:tcMar>
+              <w:top w:type="dxa" w:w="60"/>
+              <w:left w:type="dxa" w:w="100"/>
+              <w:bottom w:type="dxa" w:w="60"/>
+              <w:right w:type="dxa" w:w="100"/>
+            </w:tcMar>
+          </w:tcPr>
+          <w:p>
+            <w:r>
+              <w:rPr>
+                <w:b w:val="false"/>
+                <w:bCs w:val="false"/>
+                <w:color w:val="222222"/>
+                <w:sz w:val="18"/>
+                <w:szCs w:val="18"/>
+              </w:rPr>
+              <w:t xml:space="preserve">2026-10-15</w:t>
+            </w:r>
+          </w:p>
+        </w:tc>
+      </w:tr>
+      <w:tr>
+        <w:tc>
+          <w:tcPr>
+            <w:tcW w:type="dxa" w:w="700"/>
+            <w:tcMar>
+              <w:top w:type="dxa" w:w="60"/>
+              <w:left w:type="dxa" w:w="100"/>
+              <w:bottom w:type="dxa" w:w="60"/>
+              <w:right w:type="dxa" w:w="100"/>
+            </w:tcMar>
+          </w:tcPr>
+          <w:p>
+            <w:r>
+              <w:rPr>
+                <w:b w:val="false"/>
+                <w:bCs w:val="false"/>
+                <w:color w:val="222222"/>
+                <w:sz w:val="18"/>
+                <w:szCs w:val="18"/>
+              </w:rPr>
+              <w:t xml:space="preserve">15</w:t>
+            </w:r>
+          </w:p>
+        </w:tc>
+        <w:tc>
+          <w:tcPr>
+            <w:tcW w:type="dxa" w:w="1500"/>
+            <w:tcMar>
+              <w:top w:type="dxa" w:w="60"/>
+              <w:left w:type="dxa" w:w="100"/>
+              <w:bottom w:type="dxa" w:w="60"/>
+              <w:right w:type="dxa" w:w="100"/>
+            </w:tcMar>
+          </w:tcPr>
+          <w:p>
+            <w:r>
+              <w:rPr>
+                <w:b w:val="false"/>
+                <w:bCs w:val="false"/>
+                <w:color w:val="222222"/>
+                <w:sz w:val="18"/>
+                <w:szCs w:val="18"/>
+              </w:rPr>
+              <w:t xml:space="preserve">Wrap-up</w:t>
+            </w:r>
+          </w:p>
+        </w:tc>
+        <w:tc>
+          <w:tcPr>
+            <w:tcW w:type="dxa" w:w="4538"/>
+            <w:tcMar>
+              <w:top w:type="dxa" w:w="60"/>
+              <w:left w:type="dxa" w:w="100"/>
+              <w:bottom w:type="dxa" w:w="60"/>
+              <w:right w:type="dxa" w:w="100"/>
+            </w:tcMar>
+          </w:tcPr>
+          <w:p>
+            <w:r>
+              <w:rPr>
+                <w:b w:val="false"/>
+                <w:bCs w:val="false"/>
+                <w:color w:val="222222"/>
+                <w:sz w:val="18"/>
+                <w:szCs w:val="18"/>
+              </w:rPr>
+              <w:t xml:space="preserve">Create the GitHub repository and publish the site</w:t>
+            </w:r>
+          </w:p>
+        </w:tc>
+        <w:tc>
+          <w:tcPr>
+            <w:tcW w:type="dxa" w:w="1500"/>
+            <w:tcMar>
+              <w:top w:type="dxa" w:w="60"/>
+              <w:left w:type="dxa" w:w="100"/>
+              <w:bottom w:type="dxa" w:w="60"/>
+              <w:right w:type="dxa" w:w="100"/>
+            </w:tcMar>
+          </w:tcPr>
+          <w:p>
+            <w:r>
+              <w:rPr>
+                <w:b w:val="false"/>
+                <w:bCs w:val="false"/>
+                <w:color w:val="222222"/>
+                <w:sz w:val="18"/>
+                <w:szCs w:val="18"/>
+              </w:rPr>
+              <w:t xml:space="preserve">Working prompt</w:t>
+            </w:r>
+          </w:p>
+        </w:tc>
+        <w:tc>
+          <w:tcPr>
+            <w:tcW w:type="dxa" w:w="1400"/>
+            <w:tcMar>
+              <w:top w:type="dxa" w:w="60"/>
+              <w:left w:type="dxa" w:w="100"/>
+              <w:bottom w:type="dxa" w:w="60"/>
+              <w:right w:type="dxa" w:w="100"/>
+            </w:tcMar>
+          </w:tcPr>
+          <w:p>
+            <w:r>
+              <w:rPr>
+                <w:b w:val="false"/>
+                <w:bCs w:val="false"/>
+                <w:color w:val="222222"/>
+                <w:sz w:val="18"/>
+                <w:szCs w:val="18"/>
+              </w:rPr>
+              <w:t xml:space="preserve">2026-10-15</w:t>
+            </w:r>
+          </w:p>
+        </w:tc>
+      </w:tr>
     </w:tbl>
     <w:p>
       <w:r>
@@ -5007,6 +5363,2392 @@
       </w:pPr>
       <w:r>
         <w:t xml:space="preserve"/>
+      </w:r>
+    </w:p>
+    <w:p>
+      <w:pPr>
+        <w:pStyle w:val="Heading2"/>
+        <w:spacing w:before="360"/>
+      </w:pPr>
+      <w:r>
+        <w:t xml:space="preserve">Wrap-up - Documentation, cleanup and deployment</w:t>
+      </w:r>
+    </w:p>
+    <w:p>
+      <w:pPr>
+        <w:pStyle w:val="Heading3"/>
+        <w:keepNext/>
+      </w:pPr>
+      <w:r>
+        <w:t xml:space="preserve">#13  Request: GitHub repository, website link and PDF of prompts</w:t>
+      </w:r>
+    </w:p>
+    <w:p>
+      <w:pPr>
+        <w:keepNext/>
+        <w:spacing w:after="60"/>
+      </w:pPr>
+      <w:r>
+        <w:rPr>
+          <w:color w:val="5B6475"/>
+          <w:sz w:val="18"/>
+          <w:szCs w:val="18"/>
+        </w:rPr>
+        <w:t xml:space="preserve">User prompt  |  2026-10-15</w:t>
+      </w:r>
+    </w:p>
+    <w:p>
+      <w:pPr>
+        <w:spacing w:after="60" w:before="160"/>
+      </w:pPr>
+      <w:r>
+        <w:rPr>
+          <w:b/>
+          <w:bCs/>
+          <w:color w:val="4F46E5"/>
+          <w:spacing w:val="20"/>
+          <w:sz w:val="17"/>
+          <w:szCs w:val="17"/>
+        </w:rPr>
+        <w:t xml:space="preserve">PROMPT</w:t>
+      </w:r>
+    </w:p>
+    <w:p>
+      <w:pPr>
+        <w:pBdr>
+          <w:left w:val="single" w:color="4F46E5" w:sz="18" w:space="8"/>
+        </w:pBdr>
+        <w:shd w:fill="F1F2F8" w:color="auto" w:val="clear"/>
+        <w:spacing w:after="120" w:before="40" w:line="276"/>
+        <w:ind w:left="160" w:right="160"/>
+      </w:pPr>
+      <w:r>
+        <w:rPr>
+          <w:rFonts w:ascii="Consolas" w:cs="Consolas" w:eastAsia="Consolas" w:hAnsi="Consolas"/>
+          <w:sz w:val="19"/>
+          <w:szCs w:val="19"/>
+        </w:rPr>
+        <w:t xml:space="preserve">create a new repositry for this project in my gihub , and after than give me the github link and then the website link and also a pdf containing the prompts to complete project.</w:t>
+      </w:r>
+    </w:p>
+    <w:p>
+      <w:pPr>
+        <w:spacing w:after="60" w:before="160"/>
+      </w:pPr>
+      <w:r>
+        <w:rPr>
+          <w:b/>
+          <w:bCs/>
+          <w:color w:val="4F46E5"/>
+          <w:spacing w:val="20"/>
+          <w:sz w:val="17"/>
+          <w:szCs w:val="17"/>
+        </w:rPr>
+        <w:t xml:space="preserve">PURPOSE</w:t>
+      </w:r>
+    </w:p>
+    <w:p>
+      <w:pPr>
+        <w:spacing w:after="80"/>
+      </w:pPr>
+      <w:r>
+        <w:rPr>
+          <w:sz w:val="21"/>
+          <w:szCs w:val="21"/>
+        </w:rPr>
+        <w:t xml:space="preserve">Publish the project under the student's own GitHub account, host the site, and export the prompt log (including the remaining planned prompts) as a PDF.</w:t>
+      </w:r>
+    </w:p>
+    <w:p>
+      <w:pPr>
+        <w:spacing w:after="60" w:before="160"/>
+      </w:pPr>
+      <w:r>
+        <w:rPr>
+          <w:b/>
+          <w:bCs/>
+          <w:color w:val="4F46E5"/>
+          <w:spacing w:val="20"/>
+          <w:sz w:val="17"/>
+          <w:szCs w:val="17"/>
+        </w:rPr>
+        <w:t xml:space="preserve">FILES</w:t>
+      </w:r>
+    </w:p>
+    <w:p>
+      <w:pPr>
+        <w:pStyle w:val="ListParagraph"/>
+        <w:numPr>
+          <w:ilvl w:val="0"/>
+          <w:numId w:val="2"/>
+        </w:numPr>
+      </w:pPr>
+      <w:r>
+        <w:rPr>
+          <w:rFonts w:ascii="Consolas" w:cs="Consolas" w:eastAsia="Consolas" w:hAnsi="Consolas"/>
+          <w:sz w:val="19"/>
+          <w:szCs w:val="19"/>
+        </w:rPr>
+        <w:t xml:space="preserve">-</w:t>
+      </w:r>
+    </w:p>
+    <w:p>
+      <w:pPr>
+        <w:spacing w:after="60" w:before="160"/>
+      </w:pPr>
+      <w:r>
+        <w:rPr>
+          <w:b/>
+          <w:bCs/>
+          <w:color w:val="4F46E5"/>
+          <w:spacing w:val="20"/>
+          <w:sz w:val="17"/>
+          <w:szCs w:val="17"/>
+        </w:rPr>
+        <w:t xml:space="preserve">RESULT</w:t>
+      </w:r>
+    </w:p>
+    <w:p>
+      <w:pPr>
+        <w:spacing w:after="80"/>
+      </w:pPr>
+      <w:r>
+        <w:rPr>
+          <w:sz w:val="21"/>
+          <w:szCs w:val="21"/>
+        </w:rPr>
+        <w:t xml:space="preserve">Done: see the following entries.</w:t>
+      </w:r>
+    </w:p>
+    <w:p>
+      <w:pPr>
+        <w:spacing w:after="60" w:before="160"/>
+      </w:pPr>
+      <w:r>
+        <w:rPr>
+          <w:b/>
+          <w:bCs/>
+          <w:color w:val="4F46E5"/>
+          <w:spacing w:val="20"/>
+          <w:sz w:val="17"/>
+          <w:szCs w:val="17"/>
+        </w:rPr>
+        <w:t xml:space="preserve">VERIFICATION</w:t>
+      </w:r>
+    </w:p>
+    <w:p>
+      <w:pPr>
+        <w:spacing w:after="80"/>
+      </w:pPr>
+      <w:r>
+        <w:rPr>
+          <w:sz w:val="21"/>
+          <w:szCs w:val="21"/>
+        </w:rPr>
+        <w:t xml:space="preserve">-</w:t>
+      </w:r>
+    </w:p>
+    <w:p>
+      <w:pPr>
+        <w:pBdr>
+          <w:bottom w:val="single" w:color="D9DBE5" w:sz="4" w:space="4"/>
+        </w:pBdr>
+        <w:spacing w:after="200"/>
+      </w:pPr>
+      <w:r>
+        <w:t xml:space="preserve"/>
+      </w:r>
+    </w:p>
+    <w:p>
+      <w:pPr>
+        <w:pStyle w:val="Heading3"/>
+        <w:keepNext/>
+      </w:pPr>
+      <w:r>
+        <w:t xml:space="preserve">#14  PDF export of the prompt log, including planned prompts</w:t>
+      </w:r>
+    </w:p>
+    <w:p>
+      <w:pPr>
+        <w:keepNext/>
+        <w:spacing w:after="60"/>
+      </w:pPr>
+      <w:r>
+        <w:rPr>
+          <w:color w:val="5B6475"/>
+          <w:sz w:val="18"/>
+          <w:szCs w:val="18"/>
+        </w:rPr>
+        <w:t xml:space="preserve">Working prompt  |  2026-10-15</w:t>
+      </w:r>
+    </w:p>
+    <w:p>
+      <w:pPr>
+        <w:spacing w:after="60" w:before="160"/>
+      </w:pPr>
+      <w:r>
+        <w:rPr>
+          <w:b/>
+          <w:bCs/>
+          <w:color w:val="4F46E5"/>
+          <w:spacing w:val="20"/>
+          <w:sz w:val="17"/>
+          <w:szCs w:val="17"/>
+        </w:rPr>
+        <w:t xml:space="preserve">PROMPT</w:t>
+      </w:r>
+    </w:p>
+    <w:p>
+      <w:pPr>
+        <w:pBdr>
+          <w:left w:val="single" w:color="4F46E5" w:sz="18" w:space="8"/>
+        </w:pBdr>
+        <w:shd w:fill="F1F2F8" w:color="auto" w:val="clear"/>
+        <w:spacing w:after="120" w:before="40" w:line="276"/>
+        <w:ind w:left="160" w:right="160"/>
+      </w:pPr>
+      <w:r>
+        <w:rPr>
+          <w:rFonts w:ascii="Consolas" w:cs="Consolas" w:eastAsia="Consolas" w:hAnsi="Consolas"/>
+          <w:sz w:val="19"/>
+          <w:szCs w:val="19"/>
+        </w:rPr>
+        <w:t xml:space="preserve">Export the prompt log to PDF with a Python reportlab script (docs/tools/build_prompt_pdf.py) that reads docs/prompt_log.json: a title page, a stage overview table, a summary of every entry, Part A with every executed prompt verbatim in a shaded box with purpose, files, result and verification, and Part B with the planned prompts that complete Review 2, Review 3 and the wrap-up, clearly marked as not yet run. Add the planned prompts to prompt_log.json and to the Word log as well, and make "npm run log" rebuild both documents.</w:t>
+      </w:r>
+    </w:p>
+    <w:p>
+      <w:pPr>
+        <w:spacing w:after="60" w:before="160"/>
+      </w:pPr>
+      <w:r>
+        <w:rPr>
+          <w:b/>
+          <w:bCs/>
+          <w:color w:val="4F46E5"/>
+          <w:spacing w:val="20"/>
+          <w:sz w:val="17"/>
+          <w:szCs w:val="17"/>
+        </w:rPr>
+        <w:t xml:space="preserve">PURPOSE</w:t>
+      </w:r>
+    </w:p>
+    <w:p>
+      <w:pPr>
+        <w:spacing w:after="80"/>
+      </w:pPr>
+      <w:r>
+        <w:rPr>
+          <w:sz w:val="21"/>
+          <w:szCs w:val="21"/>
+        </w:rPr>
+        <w:t xml:space="preserve">Give the student a PDF containing the prompts needed to complete the whole project.</w:t>
+      </w:r>
+    </w:p>
+    <w:p>
+      <w:pPr>
+        <w:spacing w:after="60" w:before="160"/>
+      </w:pPr>
+      <w:r>
+        <w:rPr>
+          <w:b/>
+          <w:bCs/>
+          <w:color w:val="4F46E5"/>
+          <w:spacing w:val="20"/>
+          <w:sz w:val="17"/>
+          <w:szCs w:val="17"/>
+        </w:rPr>
+        <w:t xml:space="preserve">FILES</w:t>
+      </w:r>
+    </w:p>
+    <w:p>
+      <w:pPr>
+        <w:pStyle w:val="ListParagraph"/>
+        <w:numPr>
+          <w:ilvl w:val="0"/>
+          <w:numId w:val="2"/>
+        </w:numPr>
+      </w:pPr>
+      <w:r>
+        <w:rPr>
+          <w:rFonts w:ascii="Consolas" w:cs="Consolas" w:eastAsia="Consolas" w:hAnsi="Consolas"/>
+          <w:sz w:val="19"/>
+          <w:szCs w:val="19"/>
+        </w:rPr>
+        <w:t xml:space="preserve">docs/tools/build_prompt_pdf.py</w:t>
+      </w:r>
+    </w:p>
+    <w:p>
+      <w:pPr>
+        <w:pStyle w:val="ListParagraph"/>
+        <w:numPr>
+          <w:ilvl w:val="0"/>
+          <w:numId w:val="2"/>
+        </w:numPr>
+      </w:pPr>
+      <w:r>
+        <w:rPr>
+          <w:rFonts w:ascii="Consolas" w:cs="Consolas" w:eastAsia="Consolas" w:hAnsi="Consolas"/>
+          <w:sz w:val="19"/>
+          <w:szCs w:val="19"/>
+        </w:rPr>
+        <w:t xml:space="preserve">docs/tools/build-prompt-log.js</w:t>
+      </w:r>
+    </w:p>
+    <w:p>
+      <w:pPr>
+        <w:pStyle w:val="ListParagraph"/>
+        <w:numPr>
+          <w:ilvl w:val="0"/>
+          <w:numId w:val="2"/>
+        </w:numPr>
+      </w:pPr>
+      <w:r>
+        <w:rPr>
+          <w:rFonts w:ascii="Consolas" w:cs="Consolas" w:eastAsia="Consolas" w:hAnsi="Consolas"/>
+          <w:sz w:val="19"/>
+          <w:szCs w:val="19"/>
+        </w:rPr>
+        <w:t xml:space="preserve">docs/prompt_log.json</w:t>
+      </w:r>
+    </w:p>
+    <w:p>
+      <w:pPr>
+        <w:pStyle w:val="ListParagraph"/>
+        <w:numPr>
+          <w:ilvl w:val="0"/>
+          <w:numId w:val="2"/>
+        </w:numPr>
+      </w:pPr>
+      <w:r>
+        <w:rPr>
+          <w:rFonts w:ascii="Consolas" w:cs="Consolas" w:eastAsia="Consolas" w:hAnsi="Consolas"/>
+          <w:sz w:val="19"/>
+          <w:szCs w:val="19"/>
+        </w:rPr>
+        <w:t xml:space="preserve">docs/SplitStack_Prompt_Log.pdf</w:t>
+      </w:r>
+    </w:p>
+    <w:p>
+      <w:pPr>
+        <w:pStyle w:val="ListParagraph"/>
+        <w:numPr>
+          <w:ilvl w:val="0"/>
+          <w:numId w:val="2"/>
+        </w:numPr>
+      </w:pPr>
+      <w:r>
+        <w:rPr>
+          <w:rFonts w:ascii="Consolas" w:cs="Consolas" w:eastAsia="Consolas" w:hAnsi="Consolas"/>
+          <w:sz w:val="19"/>
+          <w:szCs w:val="19"/>
+        </w:rPr>
+        <w:t xml:space="preserve">docs/SplitStack_Prompt_Log.docx</w:t>
+      </w:r>
+    </w:p>
+    <w:p>
+      <w:pPr>
+        <w:pStyle w:val="ListParagraph"/>
+        <w:numPr>
+          <w:ilvl w:val="0"/>
+          <w:numId w:val="2"/>
+        </w:numPr>
+      </w:pPr>
+      <w:r>
+        <w:rPr>
+          <w:rFonts w:ascii="Consolas" w:cs="Consolas" w:eastAsia="Consolas" w:hAnsi="Consolas"/>
+          <w:sz w:val="19"/>
+          <w:szCs w:val="19"/>
+        </w:rPr>
+        <w:t xml:space="preserve">package.json</w:t>
+      </w:r>
+    </w:p>
+    <w:p>
+      <w:pPr>
+        <w:spacing w:after="60" w:before="160"/>
+      </w:pPr>
+      <w:r>
+        <w:rPr>
+          <w:b/>
+          <w:bCs/>
+          <w:color w:val="4F46E5"/>
+          <w:spacing w:val="20"/>
+          <w:sz w:val="17"/>
+          <w:szCs w:val="17"/>
+        </w:rPr>
+        <w:t xml:space="preserve">RESULT</w:t>
+      </w:r>
+    </w:p>
+    <w:p>
+      <w:pPr>
+        <w:spacing w:after="80"/>
+      </w:pPr>
+      <w:r>
+        <w:rPr>
+          <w:sz w:val="21"/>
+          <w:szCs w:val="21"/>
+        </w:rPr>
+        <w:t xml:space="preserve">PDF with the executed prompts and 15 planned prompts; the Word log has the same content.</w:t>
+      </w:r>
+    </w:p>
+    <w:p>
+      <w:pPr>
+        <w:spacing w:after="60" w:before="160"/>
+      </w:pPr>
+      <w:r>
+        <w:rPr>
+          <w:b/>
+          <w:bCs/>
+          <w:color w:val="4F46E5"/>
+          <w:spacing w:val="20"/>
+          <w:sz w:val="17"/>
+          <w:szCs w:val="17"/>
+        </w:rPr>
+        <w:t xml:space="preserve">VERIFICATION</w:t>
+      </w:r>
+    </w:p>
+    <w:p>
+      <w:pPr>
+        <w:spacing w:after="80"/>
+      </w:pPr>
+      <w:r>
+        <w:rPr>
+          <w:sz w:val="21"/>
+          <w:szCs w:val="21"/>
+        </w:rPr>
+        <w:t xml:space="preserve">Pages rendered to images and inspected; text extracted with pypdf.</w:t>
+      </w:r>
+    </w:p>
+    <w:p>
+      <w:pPr>
+        <w:pBdr>
+          <w:bottom w:val="single" w:color="D9DBE5" w:sz="4" w:space="4"/>
+        </w:pBdr>
+        <w:spacing w:after="200"/>
+      </w:pPr>
+      <w:r>
+        <w:t xml:space="preserve"/>
+      </w:r>
+    </w:p>
+    <w:p>
+      <w:pPr>
+        <w:pStyle w:val="Heading3"/>
+        <w:keepNext/>
+      </w:pPr>
+      <w:r>
+        <w:t xml:space="preserve">#15  Create the GitHub repository and publish the site</w:t>
+      </w:r>
+    </w:p>
+    <w:p>
+      <w:pPr>
+        <w:keepNext/>
+        <w:spacing w:after="60"/>
+      </w:pPr>
+      <w:r>
+        <w:rPr>
+          <w:color w:val="5B6475"/>
+          <w:sz w:val="18"/>
+          <w:szCs w:val="18"/>
+        </w:rPr>
+        <w:t xml:space="preserve">Working prompt  |  2026-10-15</w:t>
+      </w:r>
+    </w:p>
+    <w:p>
+      <w:pPr>
+        <w:spacing w:after="60" w:before="160"/>
+      </w:pPr>
+      <w:r>
+        <w:rPr>
+          <w:b/>
+          <w:bCs/>
+          <w:color w:val="4F46E5"/>
+          <w:spacing w:val="20"/>
+          <w:sz w:val="17"/>
+          <w:szCs w:val="17"/>
+        </w:rPr>
+        <w:t xml:space="preserve">PROMPT</w:t>
+      </w:r>
+    </w:p>
+    <w:p>
+      <w:pPr>
+        <w:pBdr>
+          <w:left w:val="single" w:color="4F46E5" w:sz="18" w:space="8"/>
+        </w:pBdr>
+        <w:shd w:fill="F1F2F8" w:color="auto" w:val="clear"/>
+        <w:spacing w:after="120" w:before="40" w:line="276"/>
+        <w:ind w:left="160" w:right="160"/>
+      </w:pPr>
+      <w:r>
+        <w:rPr>
+          <w:rFonts w:ascii="Consolas" w:cs="Consolas" w:eastAsia="Consolas" w:hAnsi="Consolas"/>
+          <w:sz w:val="19"/>
+          <w:szCs w:val="19"/>
+        </w:rPr>
+        <w:t xml:space="preserve">Install the official GitHub CLI with winget and sign in through the device-code flow (the student approves it in the browser). Before publishing, check that no secrets or databases are tracked, review the receipt images that are still in the commit history (they are generic sample invoices), and confirm with the student that a public repository is acceptable because the team's original repository is private. Then create the public repository MahaprabhuK/SplitStack, push the refurbish branch as main together with the legacy branch, add a GitHub Actions workflow (.github/workflows/pages.yml) that deploys the client/ folder to GitHub Pages, enable Pages with the "GitHub Actions" source, and confirm that the site responds.</w:t>
+      </w:r>
+    </w:p>
+    <w:p>
+      <w:pPr>
+        <w:spacing w:after="60" w:before="160"/>
+      </w:pPr>
+      <w:r>
+        <w:rPr>
+          <w:b/>
+          <w:bCs/>
+          <w:color w:val="4F46E5"/>
+          <w:spacing w:val="20"/>
+          <w:sz w:val="17"/>
+          <w:szCs w:val="17"/>
+        </w:rPr>
+        <w:t xml:space="preserve">PURPOSE</w:t>
+      </w:r>
+    </w:p>
+    <w:p>
+      <w:pPr>
+        <w:spacing w:after="80"/>
+      </w:pPr>
+      <w:r>
+        <w:rPr>
+          <w:sz w:val="21"/>
+          <w:szCs w:val="21"/>
+        </w:rPr>
+        <w:t xml:space="preserve">Give the student a repository link and a live website link.</w:t>
+      </w:r>
+    </w:p>
+    <w:p>
+      <w:pPr>
+        <w:spacing w:after="60" w:before="160"/>
+      </w:pPr>
+      <w:r>
+        <w:rPr>
+          <w:b/>
+          <w:bCs/>
+          <w:color w:val="4F46E5"/>
+          <w:spacing w:val="20"/>
+          <w:sz w:val="17"/>
+          <w:szCs w:val="17"/>
+        </w:rPr>
+        <w:t xml:space="preserve">FILES</w:t>
+      </w:r>
+    </w:p>
+    <w:p>
+      <w:pPr>
+        <w:pStyle w:val="ListParagraph"/>
+        <w:numPr>
+          <w:ilvl w:val="0"/>
+          <w:numId w:val="2"/>
+        </w:numPr>
+      </w:pPr>
+      <w:r>
+        <w:rPr>
+          <w:rFonts w:ascii="Consolas" w:cs="Consolas" w:eastAsia="Consolas" w:hAnsi="Consolas"/>
+          <w:sz w:val="19"/>
+          <w:szCs w:val="19"/>
+        </w:rPr>
+        <w:t xml:space="preserve">.github/workflows/pages.yml</w:t>
+      </w:r>
+    </w:p>
+    <w:p>
+      <w:pPr>
+        <w:pStyle w:val="ListParagraph"/>
+        <w:numPr>
+          <w:ilvl w:val="0"/>
+          <w:numId w:val="2"/>
+        </w:numPr>
+      </w:pPr>
+      <w:r>
+        <w:rPr>
+          <w:rFonts w:ascii="Consolas" w:cs="Consolas" w:eastAsia="Consolas" w:hAnsi="Consolas"/>
+          <w:sz w:val="19"/>
+          <w:szCs w:val="19"/>
+        </w:rPr>
+        <w:t xml:space="preserve">README.md</w:t>
+      </w:r>
+    </w:p>
+    <w:p>
+      <w:pPr>
+        <w:spacing w:after="60" w:before="160"/>
+      </w:pPr>
+      <w:r>
+        <w:rPr>
+          <w:b/>
+          <w:bCs/>
+          <w:color w:val="4F46E5"/>
+          <w:spacing w:val="20"/>
+          <w:sz w:val="17"/>
+          <w:szCs w:val="17"/>
+        </w:rPr>
+        <w:t xml:space="preserve">RESULT</w:t>
+      </w:r>
+    </w:p>
+    <w:p>
+      <w:pPr>
+        <w:spacing w:after="80"/>
+      </w:pPr>
+      <w:r>
+        <w:rPr>
+          <w:sz w:val="21"/>
+          <w:szCs w:val="21"/>
+        </w:rPr>
+        <w:t xml:space="preserve">Repository: https://github.com/MahaprabhuK/SplitStack - Website: https://mahaprabhuk.github.io/SplitStack/</w:t>
+      </w:r>
+    </w:p>
+    <w:p>
+      <w:pPr>
+        <w:spacing w:after="60" w:before="160"/>
+      </w:pPr>
+      <w:r>
+        <w:rPr>
+          <w:b/>
+          <w:bCs/>
+          <w:color w:val="4F46E5"/>
+          <w:spacing w:val="20"/>
+          <w:sz w:val="17"/>
+          <w:szCs w:val="17"/>
+        </w:rPr>
+        <w:t xml:space="preserve">VERIFICATION</w:t>
+      </w:r>
+    </w:p>
+    <w:p>
+      <w:pPr>
+        <w:spacing w:after="80"/>
+      </w:pPr>
+      <w:r>
+        <w:rPr>
+          <w:sz w:val="21"/>
+          <w:szCs w:val="21"/>
+        </w:rPr>
+        <w:t xml:space="preserve">gh repo view; Pages workflow run; HTTP check of the live URL.</w:t>
+      </w:r>
+    </w:p>
+    <w:p>
+      <w:pPr>
+        <w:pBdr>
+          <w:bottom w:val="single" w:color="D9DBE5" w:sz="4" w:space="4"/>
+        </w:pBdr>
+        <w:spacing w:after="200"/>
+      </w:pPr>
+      <w:r>
+        <w:t xml:space="preserve"/>
+      </w:r>
+    </w:p>
+    <w:p>
+      <w:r>
+        <w:br w:type="page"/>
+      </w:r>
+    </w:p>
+    <w:p>
+      <w:pPr>
+        <w:pStyle w:val="Heading1"/>
+      </w:pPr>
+      <w:r>
+        <w:t xml:space="preserve">Planned prompts to complete the project</w:t>
+      </w:r>
+    </w:p>
+    <w:p>
+      <w:pPr>
+        <w:spacing w:after="80"/>
+      </w:pPr>
+      <w:r>
+        <w:rPr>
+          <w:sz w:val="21"/>
+          <w:szCs w:val="21"/>
+        </w:rPr>
+        <w:t xml:space="preserve">These prompts have not been run yet. Run them in order; after each one, move it into the log above with its result.</w:t>
+      </w:r>
+    </w:p>
+    <w:p>
+      <w:pPr>
+        <w:pStyle w:val="Heading3"/>
+        <w:keepNext/>
+      </w:pPr>
+      <w:r>
+        <w:t xml:space="preserve">P1  JavaScript architecture and app shell</w:t>
+      </w:r>
+    </w:p>
+    <w:p>
+      <w:pPr>
+        <w:keepNext/>
+        <w:spacing w:after="60"/>
+      </w:pPr>
+      <w:r>
+        <w:rPr>
+          <w:color w:val="5B6475"/>
+          <w:sz w:val="18"/>
+          <w:szCs w:val="18"/>
+        </w:rPr>
+        <w:t xml:space="preserve">Review 2  |  Planned prompt</w:t>
+      </w:r>
+    </w:p>
+    <w:p>
+      <w:pPr>
+        <w:spacing w:after="60" w:before="160"/>
+      </w:pPr>
+      <w:r>
+        <w:rPr>
+          <w:b/>
+          <w:bCs/>
+          <w:color w:val="4F46E5"/>
+          <w:spacing w:val="20"/>
+          <w:sz w:val="17"/>
+          <w:szCs w:val="17"/>
+        </w:rPr>
+        <w:t xml:space="preserve">PROMPT</w:t>
+      </w:r>
+    </w:p>
+    <w:p>
+      <w:pPr>
+        <w:pBdr>
+          <w:left w:val="single" w:color="4F46E5" w:sz="18" w:space="8"/>
+        </w:pBdr>
+        <w:shd w:fill="F1F2F8" w:color="auto" w:val="clear"/>
+        <w:spacing w:after="120" w:before="40" w:line="276"/>
+        <w:ind w:left="160" w:right="160"/>
+      </w:pPr>
+      <w:r>
+        <w:rPr>
+          <w:rFonts w:ascii="Consolas" w:cs="Consolas" w:eastAsia="Consolas" w:hAnsi="Consolas"/>
+          <w:sz w:val="19"/>
+          <w:szCs w:val="19"/>
+        </w:rPr>
+        <w:t xml:space="preserve">Add vanilla JavaScript to the Review 1 pages as native ES modules loaded with &lt;script type="module" src="../js/app.js"&gt;. Create client/js/ with: app.js (entry; detects the page from &lt;body data-page&gt; and calls that page's init), core/dom.js (qs, qsa, on, delegate, createEl helpers), core/format.js (formatINR with Intl.NumberFormat("en-IN", {style: "currency", currency: "INR"}), date formatting), ui/theme.js (dark/light/system toggle stored in localStorage and applied to &lt;html data-theme&gt; by a tiny inline script in &lt;head&gt; so there is no flash), ui/nav.js (replace the CSS checkbox drawer with a real &lt;button aria-expanded aria-controls&gt;, close on Escape, scrim click and link click, keep focus inside while open), ui/toast.js (accessible role=status toasts) and ui/confirm.js (a &lt;dialog&gt; element replacing window.confirm for every delete form). No jQuery and no frameworks.</w:t>
+      </w:r>
+    </w:p>
+    <w:p>
+      <w:pPr>
+        <w:spacing w:after="60" w:before="160"/>
+      </w:pPr>
+      <w:r>
+        <w:rPr>
+          <w:b/>
+          <w:bCs/>
+          <w:color w:val="4F46E5"/>
+          <w:spacing w:val="20"/>
+          <w:sz w:val="17"/>
+          <w:szCs w:val="17"/>
+        </w:rPr>
+        <w:t xml:space="preserve">PURPOSE</w:t>
+      </w:r>
+    </w:p>
+    <w:p>
+      <w:pPr>
+        <w:spacing w:after="80"/>
+      </w:pPr>
+      <w:r>
+        <w:rPr>
+          <w:sz w:val="21"/>
+          <w:szCs w:val="21"/>
+        </w:rPr>
+        <w:t xml:space="preserve">Lay the foundation for Review 2 with a clean module structure.</w:t>
+      </w:r>
+    </w:p>
+    <w:p>
+      <w:pPr>
+        <w:spacing w:after="60" w:before="160"/>
+      </w:pPr>
+      <w:r>
+        <w:rPr>
+          <w:b/>
+          <w:bCs/>
+          <w:color w:val="4F46E5"/>
+          <w:spacing w:val="20"/>
+          <w:sz w:val="17"/>
+          <w:szCs w:val="17"/>
+        </w:rPr>
+        <w:t xml:space="preserve">FILES</w:t>
+      </w:r>
+    </w:p>
+    <w:p>
+      <w:pPr>
+        <w:spacing w:after="80"/>
+      </w:pPr>
+      <w:r>
+        <w:rPr>
+          <w:sz w:val="21"/>
+          <w:szCs w:val="21"/>
+        </w:rPr>
+        <w:t xml:space="preserve">client/js/app.js, client/js/core/*.js, client/js/ui/*.js, client/pages/*.html</w:t>
+      </w:r>
+    </w:p>
+    <w:p>
+      <w:pPr>
+        <w:pStyle w:val="Heading3"/>
+        <w:keepNext/>
+      </w:pPr>
+      <w:r>
+        <w:t xml:space="preserve">P2  Client data layer backed by localStorage</w:t>
+      </w:r>
+    </w:p>
+    <w:p>
+      <w:pPr>
+        <w:keepNext/>
+        <w:spacing w:after="60"/>
+      </w:pPr>
+      <w:r>
+        <w:rPr>
+          <w:color w:val="5B6475"/>
+          <w:sz w:val="18"/>
+          <w:szCs w:val="18"/>
+        </w:rPr>
+        <w:t xml:space="preserve">Review 2  |  Planned prompt</w:t>
+      </w:r>
+    </w:p>
+    <w:p>
+      <w:pPr>
+        <w:spacing w:after="60" w:before="160"/>
+      </w:pPr>
+      <w:r>
+        <w:rPr>
+          <w:b/>
+          <w:bCs/>
+          <w:color w:val="4F46E5"/>
+          <w:spacing w:val="20"/>
+          <w:sz w:val="17"/>
+          <w:szCs w:val="17"/>
+        </w:rPr>
+        <w:t xml:space="preserve">PROMPT</w:t>
+      </w:r>
+    </w:p>
+    <w:p>
+      <w:pPr>
+        <w:pBdr>
+          <w:left w:val="single" w:color="4F46E5" w:sz="18" w:space="8"/>
+        </w:pBdr>
+        <w:shd w:fill="F1F2F8" w:color="auto" w:val="clear"/>
+        <w:spacing w:after="120" w:before="40" w:line="276"/>
+        <w:ind w:left="160" w:right="160"/>
+      </w:pPr>
+      <w:r>
+        <w:rPr>
+          <w:rFonts w:ascii="Consolas" w:cs="Consolas" w:eastAsia="Consolas" w:hAnsi="Consolas"/>
+          <w:sz w:val="19"/>
+          <w:szCs w:val="19"/>
+        </w:rPr>
+        <w:t xml:space="preserve">Create client/js/data/api.js exposing async functions with the same shape the future REST API will have: auth (register, login, logout, currentUser), expenses and income CRUD with filtering, sorting and pagination, categories, budgets, recurring payments, groups (members, shared expenses, balances, settlements), shopping lists and items, and analytics summaries. Back it with client/js/data/store.js, which keeps collections in localStorage under a versioned key, generates ids, and seeds the same sample data used in Review 1 (Priya Raman, October 2026) on first run. Every function returns a Promise and validates its input, throwing errors with a field and a message, so Review 3 can swap the implementation to fetch() without touching page code.</w:t>
+      </w:r>
+    </w:p>
+    <w:p>
+      <w:pPr>
+        <w:spacing w:after="60" w:before="160"/>
+      </w:pPr>
+      <w:r>
+        <w:rPr>
+          <w:b/>
+          <w:bCs/>
+          <w:color w:val="4F46E5"/>
+          <w:spacing w:val="20"/>
+          <w:sz w:val="17"/>
+          <w:szCs w:val="17"/>
+        </w:rPr>
+        <w:t xml:space="preserve">PURPOSE</w:t>
+      </w:r>
+    </w:p>
+    <w:p>
+      <w:pPr>
+        <w:spacing w:after="80"/>
+      </w:pPr>
+      <w:r>
+        <w:rPr>
+          <w:sz w:val="21"/>
+          <w:szCs w:val="21"/>
+        </w:rPr>
+        <w:t xml:space="preserve">Make the whole app genuinely interactive before a backend exists.</w:t>
+      </w:r>
+    </w:p>
+    <w:p>
+      <w:pPr>
+        <w:spacing w:after="60" w:before="160"/>
+      </w:pPr>
+      <w:r>
+        <w:rPr>
+          <w:b/>
+          <w:bCs/>
+          <w:color w:val="4F46E5"/>
+          <w:spacing w:val="20"/>
+          <w:sz w:val="17"/>
+          <w:szCs w:val="17"/>
+        </w:rPr>
+        <w:t xml:space="preserve">FILES</w:t>
+      </w:r>
+    </w:p>
+    <w:p>
+      <w:pPr>
+        <w:spacing w:after="80"/>
+      </w:pPr>
+      <w:r>
+        <w:rPr>
+          <w:sz w:val="21"/>
+          <w:szCs w:val="21"/>
+        </w:rPr>
+        <w:t xml:space="preserve">client/js/data/api.js, client/js/data/store.js, client/js/data/seed.js</w:t>
+      </w:r>
+    </w:p>
+    <w:p>
+      <w:pPr>
+        <w:pStyle w:val="Heading3"/>
+        <w:keepNext/>
+      </w:pPr>
+      <w:r>
+        <w:t xml:space="preserve">P3  Render pages from data</w:t>
+      </w:r>
+    </w:p>
+    <w:p>
+      <w:pPr>
+        <w:keepNext/>
+        <w:spacing w:after="60"/>
+      </w:pPr>
+      <w:r>
+        <w:rPr>
+          <w:color w:val="5B6475"/>
+          <w:sz w:val="18"/>
+          <w:szCs w:val="18"/>
+        </w:rPr>
+        <w:t xml:space="preserve">Review 2  |  Planned prompt</w:t>
+      </w:r>
+    </w:p>
+    <w:p>
+      <w:pPr>
+        <w:spacing w:after="60" w:before="160"/>
+      </w:pPr>
+      <w:r>
+        <w:rPr>
+          <w:b/>
+          <w:bCs/>
+          <w:color w:val="4F46E5"/>
+          <w:spacing w:val="20"/>
+          <w:sz w:val="17"/>
+          <w:szCs w:val="17"/>
+        </w:rPr>
+        <w:t xml:space="preserve">PROMPT</w:t>
+      </w:r>
+    </w:p>
+    <w:p>
+      <w:pPr>
+        <w:pBdr>
+          <w:left w:val="single" w:color="4F46E5" w:sz="18" w:space="8"/>
+        </w:pBdr>
+        <w:shd w:fill="F1F2F8" w:color="auto" w:val="clear"/>
+        <w:spacing w:after="120" w:before="40" w:line="276"/>
+        <w:ind w:left="160" w:right="160"/>
+      </w:pPr>
+      <w:r>
+        <w:rPr>
+          <w:rFonts w:ascii="Consolas" w:cs="Consolas" w:eastAsia="Consolas" w:hAnsi="Consolas"/>
+          <w:sz w:val="19"/>
+          <w:szCs w:val="19"/>
+        </w:rPr>
+        <w:t xml:space="preserve">Replace the hard-coded sample rows in the dashboard, expenses, income, budgets, recurring, categories, groups, group detail, settlements, shopping and profile pages with markup rendered by JavaScript from api.js, using &lt;template&gt; elements and textContent (never innerHTML with user data). Keep the static markup as the no-JavaScript fallback. Implement the expenses filter bar (search, category, method, date range, sort) with debounced live filtering and query-string sync, pagination, and empty states.</w:t>
+      </w:r>
+    </w:p>
+    <w:p>
+      <w:pPr>
+        <w:spacing w:after="60" w:before="160"/>
+      </w:pPr>
+      <w:r>
+        <w:rPr>
+          <w:b/>
+          <w:bCs/>
+          <w:color w:val="4F46E5"/>
+          <w:spacing w:val="20"/>
+          <w:sz w:val="17"/>
+          <w:szCs w:val="17"/>
+        </w:rPr>
+        <w:t xml:space="preserve">PURPOSE</w:t>
+      </w:r>
+    </w:p>
+    <w:p>
+      <w:pPr>
+        <w:spacing w:after="80"/>
+      </w:pPr>
+      <w:r>
+        <w:rPr>
+          <w:sz w:val="21"/>
+          <w:szCs w:val="21"/>
+        </w:rPr>
+        <w:t xml:space="preserve">Turn the static pages into working screens.</w:t>
+      </w:r>
+    </w:p>
+    <w:p>
+      <w:pPr>
+        <w:spacing w:after="60" w:before="160"/>
+      </w:pPr>
+      <w:r>
+        <w:rPr>
+          <w:b/>
+          <w:bCs/>
+          <w:color w:val="4F46E5"/>
+          <w:spacing w:val="20"/>
+          <w:sz w:val="17"/>
+          <w:szCs w:val="17"/>
+        </w:rPr>
+        <w:t xml:space="preserve">FILES</w:t>
+      </w:r>
+    </w:p>
+    <w:p>
+      <w:pPr>
+        <w:spacing w:after="80"/>
+      </w:pPr>
+      <w:r>
+        <w:rPr>
+          <w:sz w:val="21"/>
+          <w:szCs w:val="21"/>
+        </w:rPr>
+        <w:t xml:space="preserve">client/js/pages/*.js, client/pages/*.html</w:t>
+      </w:r>
+    </w:p>
+    <w:p>
+      <w:pPr>
+        <w:pStyle w:val="Heading3"/>
+        <w:keepNext/>
+      </w:pPr>
+      <w:r>
+        <w:t xml:space="preserve">P4  Forms, validation and CRUD flows</w:t>
+      </w:r>
+    </w:p>
+    <w:p>
+      <w:pPr>
+        <w:keepNext/>
+        <w:spacing w:after="60"/>
+      </w:pPr>
+      <w:r>
+        <w:rPr>
+          <w:color w:val="5B6475"/>
+          <w:sz w:val="18"/>
+          <w:szCs w:val="18"/>
+        </w:rPr>
+        <w:t xml:space="preserve">Review 2  |  Planned prompt</w:t>
+      </w:r>
+    </w:p>
+    <w:p>
+      <w:pPr>
+        <w:spacing w:after="60" w:before="160"/>
+      </w:pPr>
+      <w:r>
+        <w:rPr>
+          <w:b/>
+          <w:bCs/>
+          <w:color w:val="4F46E5"/>
+          <w:spacing w:val="20"/>
+          <w:sz w:val="17"/>
+          <w:szCs w:val="17"/>
+        </w:rPr>
+        <w:t xml:space="preserve">PROMPT</w:t>
+      </w:r>
+    </w:p>
+    <w:p>
+      <w:pPr>
+        <w:pBdr>
+          <w:left w:val="single" w:color="4F46E5" w:sz="18" w:space="8"/>
+        </w:pBdr>
+        <w:shd w:fill="F1F2F8" w:color="auto" w:val="clear"/>
+        <w:spacing w:after="120" w:before="40" w:line="276"/>
+        <w:ind w:left="160" w:right="160"/>
+      </w:pPr>
+      <w:r>
+        <w:rPr>
+          <w:rFonts w:ascii="Consolas" w:cs="Consolas" w:eastAsia="Consolas" w:hAnsi="Consolas"/>
+          <w:sz w:val="19"/>
+          <w:szCs w:val="19"/>
+        </w:rPr>
+        <w:t xml:space="preserve">Wire every form (register, login, expense add/edit, income, budget, recurring, category, group create, add member, shared expense, shopping list and item, profile, change password) to api.js. Use the Constraint Validation API plus custom rules (passwords match, date not in the future, budget greater than zero) with inline error messages linked by aria-describedby, and move focus to the first invalid field. Show a toast after each save and redirect afterwards (Post/Redirect/Get). Add password show/hide toggles with aria-pressed. Protect app pages: redirect to login.html when nobody is signed in.</w:t>
+      </w:r>
+    </w:p>
+    <w:p>
+      <w:pPr>
+        <w:spacing w:after="60" w:before="160"/>
+      </w:pPr>
+      <w:r>
+        <w:rPr>
+          <w:b/>
+          <w:bCs/>
+          <w:color w:val="4F46E5"/>
+          <w:spacing w:val="20"/>
+          <w:sz w:val="17"/>
+          <w:szCs w:val="17"/>
+        </w:rPr>
+        <w:t xml:space="preserve">PURPOSE</w:t>
+      </w:r>
+    </w:p>
+    <w:p>
+      <w:pPr>
+        <w:spacing w:after="80"/>
+      </w:pPr>
+      <w:r>
+        <w:rPr>
+          <w:sz w:val="21"/>
+          <w:szCs w:val="21"/>
+        </w:rPr>
+        <w:t xml:space="preserve">Cover the core JavaScript skills examiners look for: events, DOM manipulation, validation.</w:t>
+      </w:r>
+    </w:p>
+    <w:p>
+      <w:pPr>
+        <w:spacing w:after="60" w:before="160"/>
+      </w:pPr>
+      <w:r>
+        <w:rPr>
+          <w:b/>
+          <w:bCs/>
+          <w:color w:val="4F46E5"/>
+          <w:spacing w:val="20"/>
+          <w:sz w:val="17"/>
+          <w:szCs w:val="17"/>
+        </w:rPr>
+        <w:t xml:space="preserve">FILES</w:t>
+      </w:r>
+    </w:p>
+    <w:p>
+      <w:pPr>
+        <w:spacing w:after="80"/>
+      </w:pPr>
+      <w:r>
+        <w:rPr>
+          <w:sz w:val="21"/>
+          <w:szCs w:val="21"/>
+        </w:rPr>
+        <w:t xml:space="preserve">client/js/pages/*.js, client/js/ui/forms.js</w:t>
+      </w:r>
+    </w:p>
+    <w:p>
+      <w:pPr>
+        <w:pStyle w:val="Heading3"/>
+        <w:keepNext/>
+      </w:pPr>
+      <w:r>
+        <w:t xml:space="preserve">P5  Group splitting and the debt-simplification algorithm</w:t>
+      </w:r>
+    </w:p>
+    <w:p>
+      <w:pPr>
+        <w:keepNext/>
+        <w:spacing w:after="60"/>
+      </w:pPr>
+      <w:r>
+        <w:rPr>
+          <w:color w:val="5B6475"/>
+          <w:sz w:val="18"/>
+          <w:szCs w:val="18"/>
+        </w:rPr>
+        <w:t xml:space="preserve">Review 2  |  Planned prompt</w:t>
+      </w:r>
+    </w:p>
+    <w:p>
+      <w:pPr>
+        <w:spacing w:after="60" w:before="160"/>
+      </w:pPr>
+      <w:r>
+        <w:rPr>
+          <w:b/>
+          <w:bCs/>
+          <w:color w:val="4F46E5"/>
+          <w:spacing w:val="20"/>
+          <w:sz w:val="17"/>
+          <w:szCs w:val="17"/>
+        </w:rPr>
+        <w:t xml:space="preserve">PROMPT</w:t>
+      </w:r>
+    </w:p>
+    <w:p>
+      <w:pPr>
+        <w:pBdr>
+          <w:left w:val="single" w:color="4F46E5" w:sz="18" w:space="8"/>
+        </w:pBdr>
+        <w:shd w:fill="F1F2F8" w:color="auto" w:val="clear"/>
+        <w:spacing w:after="120" w:before="40" w:line="276"/>
+        <w:ind w:left="160" w:right="160"/>
+      </w:pPr>
+      <w:r>
+        <w:rPr>
+          <w:rFonts w:ascii="Consolas" w:cs="Consolas" w:eastAsia="Consolas" w:hAnsi="Consolas"/>
+          <w:sz w:val="19"/>
+          <w:szCs w:val="19"/>
+        </w:rPr>
+        <w:t xml:space="preserve">In client/js/domain/splits.js implement equal splits in integer paise with the leftover paise assigned to the payer, and custom splits that must sum exactly to the total. On the shared-expense form show a live "remaining to assign" counter and disable submit until it reaches zero. In client/js/domain/settle.js implement net balances (paid minus share) and the greedy minimum-cash-flow algorithm: repeatedly match the largest debtor with the largest creditor and transfer min(debt, credit) until every balance is within one paisa; return the transfer list and the number of original pairwise debts. Render the settle-up page from it, and make "Mark paid" record a settlement and recompute balances. Add unit tests runnable with node --test using the Goa Trip example (balances +1700, -2500, +5700, -4900 give 3 transfers).</w:t>
+      </w:r>
+    </w:p>
+    <w:p>
+      <w:pPr>
+        <w:spacing w:after="60" w:before="160"/>
+      </w:pPr>
+      <w:r>
+        <w:rPr>
+          <w:b/>
+          <w:bCs/>
+          <w:color w:val="4F46E5"/>
+          <w:spacing w:val="20"/>
+          <w:sz w:val="17"/>
+          <w:szCs w:val="17"/>
+        </w:rPr>
+        <w:t xml:space="preserve">PURPOSE</w:t>
+      </w:r>
+    </w:p>
+    <w:p>
+      <w:pPr>
+        <w:spacing w:after="80"/>
+      </w:pPr>
+      <w:r>
+        <w:rPr>
+          <w:sz w:val="21"/>
+          <w:szCs w:val="21"/>
+        </w:rPr>
+        <w:t xml:space="preserve">Show algorithmic JavaScript, the core idea of SplitStack.</w:t>
+      </w:r>
+    </w:p>
+    <w:p>
+      <w:pPr>
+        <w:spacing w:after="60" w:before="160"/>
+      </w:pPr>
+      <w:r>
+        <w:rPr>
+          <w:b/>
+          <w:bCs/>
+          <w:color w:val="4F46E5"/>
+          <w:spacing w:val="20"/>
+          <w:sz w:val="17"/>
+          <w:szCs w:val="17"/>
+        </w:rPr>
+        <w:t xml:space="preserve">FILES</w:t>
+      </w:r>
+    </w:p>
+    <w:p>
+      <w:pPr>
+        <w:spacing w:after="80"/>
+      </w:pPr>
+      <w:r>
+        <w:rPr>
+          <w:sz w:val="21"/>
+          <w:szCs w:val="21"/>
+        </w:rPr>
+        <w:t xml:space="preserve">client/js/domain/splits.js, client/js/domain/settle.js, tests/client/*.test.js</w:t>
+      </w:r>
+    </w:p>
+    <w:p>
+      <w:pPr>
+        <w:pStyle w:val="Heading3"/>
+        <w:keepNext/>
+      </w:pPr>
+      <w:r>
+        <w:t xml:space="preserve">P6  Charts, budgets, forecast, insights, search and notifications</w:t>
+      </w:r>
+    </w:p>
+    <w:p>
+      <w:pPr>
+        <w:keepNext/>
+        <w:spacing w:after="60"/>
+      </w:pPr>
+      <w:r>
+        <w:rPr>
+          <w:color w:val="5B6475"/>
+          <w:sz w:val="18"/>
+          <w:szCs w:val="18"/>
+        </w:rPr>
+        <w:t xml:space="preserve">Review 2  |  Planned prompt</w:t>
+      </w:r>
+    </w:p>
+    <w:p>
+      <w:pPr>
+        <w:spacing w:after="60" w:before="160"/>
+      </w:pPr>
+      <w:r>
+        <w:rPr>
+          <w:b/>
+          <w:bCs/>
+          <w:color w:val="4F46E5"/>
+          <w:spacing w:val="20"/>
+          <w:sz w:val="17"/>
+          <w:szCs w:val="17"/>
+        </w:rPr>
+        <w:t xml:space="preserve">PROMPT</w:t>
+      </w:r>
+    </w:p>
+    <w:p>
+      <w:pPr>
+        <w:pBdr>
+          <w:left w:val="single" w:color="4F46E5" w:sz="18" w:space="8"/>
+        </w:pBdr>
+        <w:shd w:fill="F1F2F8" w:color="auto" w:val="clear"/>
+        <w:spacing w:after="120" w:before="40" w:line="276"/>
+        <w:ind w:left="160" w:right="160"/>
+      </w:pPr>
+      <w:r>
+        <w:rPr>
+          <w:rFonts w:ascii="Consolas" w:cs="Consolas" w:eastAsia="Consolas" w:hAnsi="Consolas"/>
+          <w:sz w:val="19"/>
+          <w:szCs w:val="19"/>
+        </w:rPr>
+        <w:t xml:space="preserve">Render the dashboard and analytics charts with Chart.js 4 loaded from a pinned CDN URL, reading colours from the CSS custom properties so both themes work, and keep the CSS charts as a fallback. Compute budget status (ok under 75%, caution 75-90%, warning 90-100%, danger over 100%) and update the meters. Port the spending forecast (average daily spend multiplied by the days in the month) to client/js/domain/forecast.js. Generate smart insights from the data (over-budget categories, month-over-month change, upcoming recurring bills). Make the topbar search show live results across expenses, groups and lists in a listbox with keyboard navigation, and make the bell open a notifications panel built from the insights with an unread count.</w:t>
+      </w:r>
+    </w:p>
+    <w:p>
+      <w:pPr>
+        <w:spacing w:after="60" w:before="160"/>
+      </w:pPr>
+      <w:r>
+        <w:rPr>
+          <w:b/>
+          <w:bCs/>
+          <w:color w:val="4F46E5"/>
+          <w:spacing w:val="20"/>
+          <w:sz w:val="17"/>
+          <w:szCs w:val="17"/>
+        </w:rPr>
+        <w:t xml:space="preserve">PURPOSE</w:t>
+      </w:r>
+    </w:p>
+    <w:p>
+      <w:pPr>
+        <w:spacing w:after="80"/>
+      </w:pPr>
+      <w:r>
+        <w:rPr>
+          <w:sz w:val="21"/>
+          <w:szCs w:val="21"/>
+        </w:rPr>
+        <w:t xml:space="preserve">Finish the interactive features that were disconnected in the original app.</w:t>
+      </w:r>
+    </w:p>
+    <w:p>
+      <w:pPr>
+        <w:spacing w:after="60" w:before="160"/>
+      </w:pPr>
+      <w:r>
+        <w:rPr>
+          <w:b/>
+          <w:bCs/>
+          <w:color w:val="4F46E5"/>
+          <w:spacing w:val="20"/>
+          <w:sz w:val="17"/>
+          <w:szCs w:val="17"/>
+        </w:rPr>
+        <w:t xml:space="preserve">FILES</w:t>
+      </w:r>
+    </w:p>
+    <w:p>
+      <w:pPr>
+        <w:spacing w:after="80"/>
+      </w:pPr>
+      <w:r>
+        <w:rPr>
+          <w:sz w:val="21"/>
+          <w:szCs w:val="21"/>
+        </w:rPr>
+        <w:t xml:space="preserve">client/js/pages/dashboard.js, client/js/pages/analytics.js, client/js/domain/forecast.js, client/js/ui/search.js, client/js/ui/notifications.js</w:t>
+      </w:r>
+    </w:p>
+    <w:p>
+      <w:pPr>
+        <w:pStyle w:val="Heading3"/>
+        <w:keepNext/>
+      </w:pPr>
+      <w:r>
+        <w:t xml:space="preserve">P7  Shopping checklist and receipt scan preview</w:t>
+      </w:r>
+    </w:p>
+    <w:p>
+      <w:pPr>
+        <w:keepNext/>
+        <w:spacing w:after="60"/>
+      </w:pPr>
+      <w:r>
+        <w:rPr>
+          <w:color w:val="5B6475"/>
+          <w:sz w:val="18"/>
+          <w:szCs w:val="18"/>
+        </w:rPr>
+        <w:t xml:space="preserve">Review 2  |  Planned prompt</w:t>
+      </w:r>
+    </w:p>
+    <w:p>
+      <w:pPr>
+        <w:spacing w:after="60" w:before="160"/>
+      </w:pPr>
+      <w:r>
+        <w:rPr>
+          <w:b/>
+          <w:bCs/>
+          <w:color w:val="4F46E5"/>
+          <w:spacing w:val="20"/>
+          <w:sz w:val="17"/>
+          <w:szCs w:val="17"/>
+        </w:rPr>
+        <w:t xml:space="preserve">PROMPT</w:t>
+      </w:r>
+    </w:p>
+    <w:p>
+      <w:pPr>
+        <w:pBdr>
+          <w:left w:val="single" w:color="4F46E5" w:sz="18" w:space="8"/>
+        </w:pBdr>
+        <w:shd w:fill="F1F2F8" w:color="auto" w:val="clear"/>
+        <w:spacing w:after="120" w:before="40" w:line="276"/>
+        <w:ind w:left="160" w:right="160"/>
+      </w:pPr>
+      <w:r>
+        <w:rPr>
+          <w:rFonts w:ascii="Consolas" w:cs="Consolas" w:eastAsia="Consolas" w:hAnsi="Consolas"/>
+          <w:sz w:val="19"/>
+          <w:szCs w:val="19"/>
+        </w:rPr>
+        <w:t xml:space="preserve">Make the shopping checklist toggle items with optimistic UI, edit actual prices inline, recompute the estimated, actual and variance totals live, and convert the list to an expense only once (prevent duplicates). On the receipt scan page add drag-and-drop with dragenter/dragleave styling, client-side checks (PNG, JPEG or WEBP, up to 5 MB) and an image preview via URL.createObjectURL. Until the backend exists, run OCR in the browser with tesseract.js from a pinned CDN, parse the merchant, date and total with regular expressions (prefer the line containing TOTAL), show progress, and pre-fill the confirm form.</w:t>
+      </w:r>
+    </w:p>
+    <w:p>
+      <w:pPr>
+        <w:spacing w:after="60" w:before="160"/>
+      </w:pPr>
+      <w:r>
+        <w:rPr>
+          <w:b/>
+          <w:bCs/>
+          <w:color w:val="4F46E5"/>
+          <w:spacing w:val="20"/>
+          <w:sz w:val="17"/>
+          <w:szCs w:val="17"/>
+        </w:rPr>
+        <w:t xml:space="preserve">PURPOSE</w:t>
+      </w:r>
+    </w:p>
+    <w:p>
+      <w:pPr>
+        <w:spacing w:after="80"/>
+      </w:pPr>
+      <w:r>
+        <w:rPr>
+          <w:sz w:val="21"/>
+          <w:szCs w:val="21"/>
+        </w:rPr>
+        <w:t xml:space="preserve">Complete the remaining interactive flows.</w:t>
+      </w:r>
+    </w:p>
+    <w:p>
+      <w:pPr>
+        <w:spacing w:after="60" w:before="160"/>
+      </w:pPr>
+      <w:r>
+        <w:rPr>
+          <w:b/>
+          <w:bCs/>
+          <w:color w:val="4F46E5"/>
+          <w:spacing w:val="20"/>
+          <w:sz w:val="17"/>
+          <w:szCs w:val="17"/>
+        </w:rPr>
+        <w:t xml:space="preserve">FILES</w:t>
+      </w:r>
+    </w:p>
+    <w:p>
+      <w:pPr>
+        <w:spacing w:after="80"/>
+      </w:pPr>
+      <w:r>
+        <w:rPr>
+          <w:sz w:val="21"/>
+          <w:szCs w:val="21"/>
+        </w:rPr>
+        <w:t xml:space="preserve">client/js/pages/shopping-detail.js, client/js/pages/receipt-scan.js, client/js/domain/receipt-parser.js</w:t>
+      </w:r>
+    </w:p>
+    <w:p>
+      <w:pPr>
+        <w:pStyle w:val="Heading3"/>
+        <w:keepNext/>
+      </w:pPr>
+      <w:r>
+        <w:t xml:space="preserve">P8  Review 2 QA, log and commit</w:t>
+      </w:r>
+    </w:p>
+    <w:p>
+      <w:pPr>
+        <w:keepNext/>
+        <w:spacing w:after="60"/>
+      </w:pPr>
+      <w:r>
+        <w:rPr>
+          <w:color w:val="5B6475"/>
+          <w:sz w:val="18"/>
+          <w:szCs w:val="18"/>
+        </w:rPr>
+        <w:t xml:space="preserve">Review 2  |  Planned prompt</w:t>
+      </w:r>
+    </w:p>
+    <w:p>
+      <w:pPr>
+        <w:spacing w:after="60" w:before="160"/>
+      </w:pPr>
+      <w:r>
+        <w:rPr>
+          <w:b/>
+          <w:bCs/>
+          <w:color w:val="4F46E5"/>
+          <w:spacing w:val="20"/>
+          <w:sz w:val="17"/>
+          <w:szCs w:val="17"/>
+        </w:rPr>
+        <w:t xml:space="preserve">PROMPT</w:t>
+      </w:r>
+    </w:p>
+    <w:p>
+      <w:pPr>
+        <w:pBdr>
+          <w:left w:val="single" w:color="4F46E5" w:sz="18" w:space="8"/>
+        </w:pBdr>
+        <w:shd w:fill="F1F2F8" w:color="auto" w:val="clear"/>
+        <w:spacing w:after="120" w:before="40" w:line="276"/>
+        <w:ind w:left="160" w:right="160"/>
+      </w:pPr>
+      <w:r>
+        <w:rPr>
+          <w:rFonts w:ascii="Consolas" w:cs="Consolas" w:eastAsia="Consolas" w:hAnsi="Consolas"/>
+          <w:sz w:val="19"/>
+          <w:szCs w:val="19"/>
+        </w:rPr>
+        <w:t xml:space="preserve">Run ESLint (recommended rules, browser globals, ES2023 modules) over client/js and fix every finding; run the domain unit tests; test every page manually at 1366px and 375px in dark and light themes, using only the keyboard, and with JavaScript disabled (pages must still show their static content). Update client/README.md with the JavaScript architecture and a table of the JS concepts used and where. Add each step to docs/prompt_log.json, rebuild the Word and PDF logs, and commit "Review 2".</w:t>
+      </w:r>
+    </w:p>
+    <w:p>
+      <w:pPr>
+        <w:spacing w:after="60" w:before="160"/>
+      </w:pPr>
+      <w:r>
+        <w:rPr>
+          <w:b/>
+          <w:bCs/>
+          <w:color w:val="4F46E5"/>
+          <w:spacing w:val="20"/>
+          <w:sz w:val="17"/>
+          <w:szCs w:val="17"/>
+        </w:rPr>
+        <w:t xml:space="preserve">PURPOSE</w:t>
+      </w:r>
+    </w:p>
+    <w:p>
+      <w:pPr>
+        <w:spacing w:after="80"/>
+      </w:pPr>
+      <w:r>
+        <w:rPr>
+          <w:sz w:val="21"/>
+          <w:szCs w:val="21"/>
+        </w:rPr>
+        <w:t xml:space="preserve">Close Review 2 with evidence.</w:t>
+      </w:r>
+    </w:p>
+    <w:p>
+      <w:pPr>
+        <w:spacing w:after="60" w:before="160"/>
+      </w:pPr>
+      <w:r>
+        <w:rPr>
+          <w:b/>
+          <w:bCs/>
+          <w:color w:val="4F46E5"/>
+          <w:spacing w:val="20"/>
+          <w:sz w:val="17"/>
+          <w:szCs w:val="17"/>
+        </w:rPr>
+        <w:t xml:space="preserve">FILES</w:t>
+      </w:r>
+    </w:p>
+    <w:p>
+      <w:pPr>
+        <w:spacing w:after="80"/>
+      </w:pPr>
+      <w:r>
+        <w:rPr>
+          <w:sz w:val="21"/>
+          <w:szCs w:val="21"/>
+        </w:rPr>
+        <w:t xml:space="preserve">eslint.config.js, client/README.md, docs/*</w:t>
+      </w:r>
+    </w:p>
+    <w:p>
+      <w:pPr>
+        <w:pStyle w:val="Heading3"/>
+        <w:keepNext/>
+      </w:pPr>
+      <w:r>
+        <w:t xml:space="preserve">P9  Express server and MongoDB connection</w:t>
+      </w:r>
+    </w:p>
+    <w:p>
+      <w:pPr>
+        <w:keepNext/>
+        <w:spacing w:after="60"/>
+      </w:pPr>
+      <w:r>
+        <w:rPr>
+          <w:color w:val="5B6475"/>
+          <w:sz w:val="18"/>
+          <w:szCs w:val="18"/>
+        </w:rPr>
+        <w:t xml:space="preserve">Review 3  |  Planned prompt</w:t>
+      </w:r>
+    </w:p>
+    <w:p>
+      <w:pPr>
+        <w:spacing w:after="60" w:before="160"/>
+      </w:pPr>
+      <w:r>
+        <w:rPr>
+          <w:b/>
+          <w:bCs/>
+          <w:color w:val="4F46E5"/>
+          <w:spacing w:val="20"/>
+          <w:sz w:val="17"/>
+          <w:szCs w:val="17"/>
+        </w:rPr>
+        <w:t xml:space="preserve">PROMPT</w:t>
+      </w:r>
+    </w:p>
+    <w:p>
+      <w:pPr>
+        <w:pBdr>
+          <w:left w:val="single" w:color="4F46E5" w:sz="18" w:space="8"/>
+        </w:pBdr>
+        <w:shd w:fill="F1F2F8" w:color="auto" w:val="clear"/>
+        <w:spacing w:after="120" w:before="40" w:line="276"/>
+        <w:ind w:left="160" w:right="160"/>
+      </w:pPr>
+      <w:r>
+        <w:rPr>
+          <w:rFonts w:ascii="Consolas" w:cs="Consolas" w:eastAsia="Consolas" w:hAnsi="Consolas"/>
+          <w:sz w:val="19"/>
+          <w:szCs w:val="19"/>
+        </w:rPr>
+        <w:t xml:space="preserve">Create server/ as a Node.js 20+ project (ES modules) with Express: server/src/app.js (helmet with a Content Security Policy that allows only the CDNs in use, compression, express.json, express-session stored with connect-mongo, express-rate-limit on auth and upload routes, a CSRF token check on state-changing requests, and a central error handler returning JSON {error, fields}), server/src/index.js (connect to MongoDB Atlas with Mongoose using MONGODB_URI from server/.env, then listen), and static serving of client/. Add server/.env.example (MONGODB_URI, SESSION_SECRET of at least 32 characters, PORT) and npm scripts dev (node --watch) and start. Never commit .env.</w:t>
+      </w:r>
+    </w:p>
+    <w:p>
+      <w:pPr>
+        <w:spacing w:after="60" w:before="160"/>
+      </w:pPr>
+      <w:r>
+        <w:rPr>
+          <w:b/>
+          <w:bCs/>
+          <w:color w:val="4F46E5"/>
+          <w:spacing w:val="20"/>
+          <w:sz w:val="17"/>
+          <w:szCs w:val="17"/>
+        </w:rPr>
+        <w:t xml:space="preserve">PURPOSE</w:t>
+      </w:r>
+    </w:p>
+    <w:p>
+      <w:pPr>
+        <w:spacing w:after="80"/>
+      </w:pPr>
+      <w:r>
+        <w:rPr>
+          <w:sz w:val="21"/>
+          <w:szCs w:val="21"/>
+        </w:rPr>
+        <w:t xml:space="preserve">Start Review 3 with a secure, conventional Express setup.</w:t>
+      </w:r>
+    </w:p>
+    <w:p>
+      <w:pPr>
+        <w:spacing w:after="60" w:before="160"/>
+      </w:pPr>
+      <w:r>
+        <w:rPr>
+          <w:b/>
+          <w:bCs/>
+          <w:color w:val="4F46E5"/>
+          <w:spacing w:val="20"/>
+          <w:sz w:val="17"/>
+          <w:szCs w:val="17"/>
+        </w:rPr>
+        <w:t xml:space="preserve">FILES</w:t>
+      </w:r>
+    </w:p>
+    <w:p>
+      <w:pPr>
+        <w:spacing w:after="80"/>
+      </w:pPr>
+      <w:r>
+        <w:rPr>
+          <w:sz w:val="21"/>
+          <w:szCs w:val="21"/>
+        </w:rPr>
+        <w:t xml:space="preserve">server/package.json, server/src/app.js, server/src/index.js, server/.env.example</w:t>
+      </w:r>
+    </w:p>
+    <w:p>
+      <w:pPr>
+        <w:pStyle w:val="Heading3"/>
+        <w:keepNext/>
+      </w:pPr>
+      <w:r>
+        <w:t xml:space="preserve">P10  Mongoose data models</w:t>
+      </w:r>
+    </w:p>
+    <w:p>
+      <w:pPr>
+        <w:keepNext/>
+        <w:spacing w:after="60"/>
+      </w:pPr>
+      <w:r>
+        <w:rPr>
+          <w:color w:val="5B6475"/>
+          <w:sz w:val="18"/>
+          <w:szCs w:val="18"/>
+        </w:rPr>
+        <w:t xml:space="preserve">Review 3  |  Planned prompt</w:t>
+      </w:r>
+    </w:p>
+    <w:p>
+      <w:pPr>
+        <w:spacing w:after="60" w:before="160"/>
+      </w:pPr>
+      <w:r>
+        <w:rPr>
+          <w:b/>
+          <w:bCs/>
+          <w:color w:val="4F46E5"/>
+          <w:spacing w:val="20"/>
+          <w:sz w:val="17"/>
+          <w:szCs w:val="17"/>
+        </w:rPr>
+        <w:t xml:space="preserve">PROMPT</w:t>
+      </w:r>
+    </w:p>
+    <w:p>
+      <w:pPr>
+        <w:pBdr>
+          <w:left w:val="single" w:color="4F46E5" w:sz="18" w:space="8"/>
+        </w:pBdr>
+        <w:shd w:fill="F1F2F8" w:color="auto" w:val="clear"/>
+        <w:spacing w:after="120" w:before="40" w:line="276"/>
+        <w:ind w:left="160" w:right="160"/>
+      </w:pPr>
+      <w:r>
+        <w:rPr>
+          <w:rFonts w:ascii="Consolas" w:cs="Consolas" w:eastAsia="Consolas" w:hAnsi="Consolas"/>
+          <w:sz w:val="19"/>
+          <w:szCs w:val="19"/>
+        </w:rPr>
+        <w:t xml:space="preserve">Design Mongoose schemas with validation and indexes to replace the 15 SQLite tables: User (name, email unique and lowercase, passwordHash, preferences), Category (user, or null for defaults; name; type expense or income; icon; color), Expense and Income (user, category, amount stored as integer paise, date, description or source, paymentMethod), Budget (user, category or null, month, year, limit; unique on user+category+month+year), Recurring (name, amount, frequency, startDate, nextDueDate, active), Group (name, description, createdBy, members [{user, role admin|member, joinedAt}]), SharedExpense (group, title, amount, paidBy, category, date, splitType, shares [{user, amount}] with a validator that the shares sum to the amount), Settlement (group, payer, payee, amount, status, completedAt), ShoppingList (owner, optional group, name, budget, items [{name, quantity, estimatedPrice, actualPrice, purchased, assignedTo}], convertedExpense), Receipt (user, file reference, merchant, date, amount, rawText, confidence) and Insight (user, kind, message, read). Explain in comments which data is embedded and which is referenced, and why.</w:t>
+      </w:r>
+    </w:p>
+    <w:p>
+      <w:pPr>
+        <w:spacing w:after="60" w:before="160"/>
+      </w:pPr>
+      <w:r>
+        <w:rPr>
+          <w:b/>
+          <w:bCs/>
+          <w:color w:val="4F46E5"/>
+          <w:spacing w:val="20"/>
+          <w:sz w:val="17"/>
+          <w:szCs w:val="17"/>
+        </w:rPr>
+        <w:t xml:space="preserve">PURPOSE</w:t>
+      </w:r>
+    </w:p>
+    <w:p>
+      <w:pPr>
+        <w:spacing w:after="80"/>
+      </w:pPr>
+      <w:r>
+        <w:rPr>
+          <w:sz w:val="21"/>
+          <w:szCs w:val="21"/>
+        </w:rPr>
+        <w:t xml:space="preserve">Show MongoDB data modelling, the core of Review 3.</w:t>
+      </w:r>
+    </w:p>
+    <w:p>
+      <w:pPr>
+        <w:spacing w:after="60" w:before="160"/>
+      </w:pPr>
+      <w:r>
+        <w:rPr>
+          <w:b/>
+          <w:bCs/>
+          <w:color w:val="4F46E5"/>
+          <w:spacing w:val="20"/>
+          <w:sz w:val="17"/>
+          <w:szCs w:val="17"/>
+        </w:rPr>
+        <w:t xml:space="preserve">FILES</w:t>
+      </w:r>
+    </w:p>
+    <w:p>
+      <w:pPr>
+        <w:spacing w:after="80"/>
+      </w:pPr>
+      <w:r>
+        <w:rPr>
+          <w:sz w:val="21"/>
+          <w:szCs w:val="21"/>
+        </w:rPr>
+        <w:t xml:space="preserve">server/src/models/*.js</w:t>
+      </w:r>
+    </w:p>
+    <w:p>
+      <w:pPr>
+        <w:pStyle w:val="Heading3"/>
+        <w:keepNext/>
+      </w:pPr>
+      <w:r>
+        <w:t xml:space="preserve">P11  Authentication and REST API</w:t>
+      </w:r>
+    </w:p>
+    <w:p>
+      <w:pPr>
+        <w:keepNext/>
+        <w:spacing w:after="60"/>
+      </w:pPr>
+      <w:r>
+        <w:rPr>
+          <w:color w:val="5B6475"/>
+          <w:sz w:val="18"/>
+          <w:szCs w:val="18"/>
+        </w:rPr>
+        <w:t xml:space="preserve">Review 3  |  Planned prompt</w:t>
+      </w:r>
+    </w:p>
+    <w:p>
+      <w:pPr>
+        <w:spacing w:after="60" w:before="160"/>
+      </w:pPr>
+      <w:r>
+        <w:rPr>
+          <w:b/>
+          <w:bCs/>
+          <w:color w:val="4F46E5"/>
+          <w:spacing w:val="20"/>
+          <w:sz w:val="17"/>
+          <w:szCs w:val="17"/>
+        </w:rPr>
+        <w:t xml:space="preserve">PROMPT</w:t>
+      </w:r>
+    </w:p>
+    <w:p>
+      <w:pPr>
+        <w:pBdr>
+          <w:left w:val="single" w:color="4F46E5" w:sz="18" w:space="8"/>
+        </w:pBdr>
+        <w:shd w:fill="F1F2F8" w:color="auto" w:val="clear"/>
+        <w:spacing w:after="120" w:before="40" w:line="276"/>
+        <w:ind w:left="160" w:right="160"/>
+      </w:pPr>
+      <w:r>
+        <w:rPr>
+          <w:rFonts w:ascii="Consolas" w:cs="Consolas" w:eastAsia="Consolas" w:hAnsi="Consolas"/>
+          <w:sz w:val="19"/>
+          <w:szCs w:val="19"/>
+        </w:rPr>
+        <w:t xml:space="preserve">Implement the REST API under /api with one express.Router per module, mirroring the 48 legacy Flask routes: /api/auth (register with bcrypt cost 12, login, logout, me), /api/expenses, /api/income, /api/categories, /api/budgets, /api/recurring (including toggle), /api/groups (members, shared expenses, balances, settlements, leave), /api/shopping (lists, items, toggle, convert to expense), /api/analytics (monthly, categories, forecast, insights) and /api/search. Validate every input with a schema (zod or express-validator), check ownership or group membership on every request, use MongoDB transactions for multi-document writes (recording a settlement, converting a list), and reuse the Review 2 settle.js and splits.js modules on the server so the algorithm has a single implementation.</w:t>
+      </w:r>
+    </w:p>
+    <w:p>
+      <w:pPr>
+        <w:spacing w:after="60" w:before="160"/>
+      </w:pPr>
+      <w:r>
+        <w:rPr>
+          <w:b/>
+          <w:bCs/>
+          <w:color w:val="4F46E5"/>
+          <w:spacing w:val="20"/>
+          <w:sz w:val="17"/>
+          <w:szCs w:val="17"/>
+        </w:rPr>
+        <w:t xml:space="preserve">PURPOSE</w:t>
+      </w:r>
+    </w:p>
+    <w:p>
+      <w:pPr>
+        <w:spacing w:after="80"/>
+      </w:pPr>
+      <w:r>
+        <w:rPr>
+          <w:sz w:val="21"/>
+          <w:szCs w:val="21"/>
+        </w:rPr>
+        <w:t xml:space="preserve">Deliver the Node.js back end with a complete, secure API.</w:t>
+      </w:r>
+    </w:p>
+    <w:p>
+      <w:pPr>
+        <w:spacing w:after="60" w:before="160"/>
+      </w:pPr>
+      <w:r>
+        <w:rPr>
+          <w:b/>
+          <w:bCs/>
+          <w:color w:val="4F46E5"/>
+          <w:spacing w:val="20"/>
+          <w:sz w:val="17"/>
+          <w:szCs w:val="17"/>
+        </w:rPr>
+        <w:t xml:space="preserve">FILES</w:t>
+      </w:r>
+    </w:p>
+    <w:p>
+      <w:pPr>
+        <w:spacing w:after="80"/>
+      </w:pPr>
+      <w:r>
+        <w:rPr>
+          <w:sz w:val="21"/>
+          <w:szCs w:val="21"/>
+        </w:rPr>
+        <w:t xml:space="preserve">server/src/routes/*.js, server/src/services/*.js, server/src/middleware/*.js</w:t>
+      </w:r>
+    </w:p>
+    <w:p>
+      <w:pPr>
+        <w:pStyle w:val="Heading3"/>
+        <w:keepNext/>
+      </w:pPr>
+      <w:r>
+        <w:t xml:space="preserve">P12  Receipt upload and server-side OCR</w:t>
+      </w:r>
+    </w:p>
+    <w:p>
+      <w:pPr>
+        <w:keepNext/>
+        <w:spacing w:after="60"/>
+      </w:pPr>
+      <w:r>
+        <w:rPr>
+          <w:color w:val="5B6475"/>
+          <w:sz w:val="18"/>
+          <w:szCs w:val="18"/>
+        </w:rPr>
+        <w:t xml:space="preserve">Review 3  |  Planned prompt</w:t>
+      </w:r>
+    </w:p>
+    <w:p>
+      <w:pPr>
+        <w:spacing w:after="60" w:before="160"/>
+      </w:pPr>
+      <w:r>
+        <w:rPr>
+          <w:b/>
+          <w:bCs/>
+          <w:color w:val="4F46E5"/>
+          <w:spacing w:val="20"/>
+          <w:sz w:val="17"/>
+          <w:szCs w:val="17"/>
+        </w:rPr>
+        <w:t xml:space="preserve">PROMPT</w:t>
+      </w:r>
+    </w:p>
+    <w:p>
+      <w:pPr>
+        <w:pBdr>
+          <w:left w:val="single" w:color="4F46E5" w:sz="18" w:space="8"/>
+        </w:pBdr>
+        <w:shd w:fill="F1F2F8" w:color="auto" w:val="clear"/>
+        <w:spacing w:after="120" w:before="40" w:line="276"/>
+        <w:ind w:left="160" w:right="160"/>
+      </w:pPr>
+      <w:r>
+        <w:rPr>
+          <w:rFonts w:ascii="Consolas" w:cs="Consolas" w:eastAsia="Consolas" w:hAnsi="Consolas"/>
+          <w:sz w:val="19"/>
+          <w:szCs w:val="19"/>
+        </w:rPr>
+        <w:t xml:space="preserve">Add POST /api/receipts using multer with memory storage, a 5 MB limit and magic-byte checks for PNG, JPEG and WEBP; preprocess with sharp (rotate from EXIF, greyscale, upscale small images, normalise); run tesseract.js with one shared worker; parse the merchant, date and total with the Review 2 parser; store the image in MongoDB GridFS (so it survives redeploys on free hosting) and the parsed fields in Receipt. GET /api/receipts/:id/image streams the image only to its owner. Confirming creates the expense; nothing becomes an expense without confirmation.</w:t>
+      </w:r>
+    </w:p>
+    <w:p>
+      <w:pPr>
+        <w:spacing w:after="60" w:before="160"/>
+      </w:pPr>
+      <w:r>
+        <w:rPr>
+          <w:b/>
+          <w:bCs/>
+          <w:color w:val="4F46E5"/>
+          <w:spacing w:val="20"/>
+          <w:sz w:val="17"/>
+          <w:szCs w:val="17"/>
+        </w:rPr>
+        <w:t xml:space="preserve">PURPOSE</w:t>
+      </w:r>
+    </w:p>
+    <w:p>
+      <w:pPr>
+        <w:spacing w:after="80"/>
+      </w:pPr>
+      <w:r>
+        <w:rPr>
+          <w:sz w:val="21"/>
+          <w:szCs w:val="21"/>
+        </w:rPr>
+        <w:t xml:space="preserve">Port the OCR feature to Node with persistent storage.</w:t>
+      </w:r>
+    </w:p>
+    <w:p>
+      <w:pPr>
+        <w:spacing w:after="60" w:before="160"/>
+      </w:pPr>
+      <w:r>
+        <w:rPr>
+          <w:b/>
+          <w:bCs/>
+          <w:color w:val="4F46E5"/>
+          <w:spacing w:val="20"/>
+          <w:sz w:val="17"/>
+          <w:szCs w:val="17"/>
+        </w:rPr>
+        <w:t xml:space="preserve">FILES</w:t>
+      </w:r>
+    </w:p>
+    <w:p>
+      <w:pPr>
+        <w:spacing w:after="80"/>
+      </w:pPr>
+      <w:r>
+        <w:rPr>
+          <w:sz w:val="21"/>
+          <w:szCs w:val="21"/>
+        </w:rPr>
+        <w:t xml:space="preserve">server/src/routes/receipts.js, server/src/services/ocr.js</w:t>
+      </w:r>
+    </w:p>
+    <w:p>
+      <w:pPr>
+        <w:pStyle w:val="Heading3"/>
+        <w:keepNext/>
+      </w:pPr>
+      <w:r>
+        <w:t xml:space="preserve">P13  Connect the client to the API</w:t>
+      </w:r>
+    </w:p>
+    <w:p>
+      <w:pPr>
+        <w:keepNext/>
+        <w:spacing w:after="60"/>
+      </w:pPr>
+      <w:r>
+        <w:rPr>
+          <w:color w:val="5B6475"/>
+          <w:sz w:val="18"/>
+          <w:szCs w:val="18"/>
+        </w:rPr>
+        <w:t xml:space="preserve">Review 3  |  Planned prompt</w:t>
+      </w:r>
+    </w:p>
+    <w:p>
+      <w:pPr>
+        <w:spacing w:after="60" w:before="160"/>
+      </w:pPr>
+      <w:r>
+        <w:rPr>
+          <w:b/>
+          <w:bCs/>
+          <w:color w:val="4F46E5"/>
+          <w:spacing w:val="20"/>
+          <w:sz w:val="17"/>
+          <w:szCs w:val="17"/>
+        </w:rPr>
+        <w:t xml:space="preserve">PROMPT</w:t>
+      </w:r>
+    </w:p>
+    <w:p>
+      <w:pPr>
+        <w:pBdr>
+          <w:left w:val="single" w:color="4F46E5" w:sz="18" w:space="8"/>
+        </w:pBdr>
+        <w:shd w:fill="F1F2F8" w:color="auto" w:val="clear"/>
+        <w:spacing w:after="120" w:before="40" w:line="276"/>
+        <w:ind w:left="160" w:right="160"/>
+      </w:pPr>
+      <w:r>
+        <w:rPr>
+          <w:rFonts w:ascii="Consolas" w:cs="Consolas" w:eastAsia="Consolas" w:hAnsi="Consolas"/>
+          <w:sz w:val="19"/>
+          <w:szCs w:val="19"/>
+        </w:rPr>
+        <w:t xml:space="preserve">Re-implement client/js/data/api.js with fetch() against /api, sending credentials and the CSRF token header, mapping HTTP errors to the same {field, message} errors the pages already handle, and showing a toast when offline. Remove the localStorage store except for the theme preference. Because the page code depends only on api.js, no page module should need changes; confirm this by running every flow end to end against a local server connected to Atlas.</w:t>
+      </w:r>
+    </w:p>
+    <w:p>
+      <w:pPr>
+        <w:spacing w:after="60" w:before="160"/>
+      </w:pPr>
+      <w:r>
+        <w:rPr>
+          <w:b/>
+          <w:bCs/>
+          <w:color w:val="4F46E5"/>
+          <w:spacing w:val="20"/>
+          <w:sz w:val="17"/>
+          <w:szCs w:val="17"/>
+        </w:rPr>
+        <w:t xml:space="preserve">PURPOSE</w:t>
+      </w:r>
+    </w:p>
+    <w:p>
+      <w:pPr>
+        <w:spacing w:after="80"/>
+      </w:pPr>
+      <w:r>
+        <w:rPr>
+          <w:sz w:val="21"/>
+          <w:szCs w:val="21"/>
+        </w:rPr>
+        <w:t xml:space="preserve">Finish the full-stack integration.</w:t>
+      </w:r>
+    </w:p>
+    <w:p>
+      <w:pPr>
+        <w:spacing w:after="60" w:before="160"/>
+      </w:pPr>
+      <w:r>
+        <w:rPr>
+          <w:b/>
+          <w:bCs/>
+          <w:color w:val="4F46E5"/>
+          <w:spacing w:val="20"/>
+          <w:sz w:val="17"/>
+          <w:szCs w:val="17"/>
+        </w:rPr>
+        <w:t xml:space="preserve">FILES</w:t>
+      </w:r>
+    </w:p>
+    <w:p>
+      <w:pPr>
+        <w:spacing w:after="80"/>
+      </w:pPr>
+      <w:r>
+        <w:rPr>
+          <w:sz w:val="21"/>
+          <w:szCs w:val="21"/>
+        </w:rPr>
+        <w:t xml:space="preserve">client/js/data/api.js</w:t>
+      </w:r>
+    </w:p>
+    <w:p>
+      <w:pPr>
+        <w:pStyle w:val="Heading3"/>
+        <w:keepNext/>
+      </w:pPr>
+      <w:r>
+        <w:t xml:space="preserve">P14  Seed data and automated tests</w:t>
+      </w:r>
+    </w:p>
+    <w:p>
+      <w:pPr>
+        <w:keepNext/>
+        <w:spacing w:after="60"/>
+      </w:pPr>
+      <w:r>
+        <w:rPr>
+          <w:color w:val="5B6475"/>
+          <w:sz w:val="18"/>
+          <w:szCs w:val="18"/>
+        </w:rPr>
+        <w:t xml:space="preserve">Review 3  |  Planned prompt</w:t>
+      </w:r>
+    </w:p>
+    <w:p>
+      <w:pPr>
+        <w:spacing w:after="60" w:before="160"/>
+      </w:pPr>
+      <w:r>
+        <w:rPr>
+          <w:b/>
+          <w:bCs/>
+          <w:color w:val="4F46E5"/>
+          <w:spacing w:val="20"/>
+          <w:sz w:val="17"/>
+          <w:szCs w:val="17"/>
+        </w:rPr>
+        <w:t xml:space="preserve">PROMPT</w:t>
+      </w:r>
+    </w:p>
+    <w:p>
+      <w:pPr>
+        <w:pBdr>
+          <w:left w:val="single" w:color="4F46E5" w:sz="18" w:space="8"/>
+        </w:pBdr>
+        <w:shd w:fill="F1F2F8" w:color="auto" w:val="clear"/>
+        <w:spacing w:after="120" w:before="40" w:line="276"/>
+        <w:ind w:left="160" w:right="160"/>
+      </w:pPr>
+      <w:r>
+        <w:rPr>
+          <w:rFonts w:ascii="Consolas" w:cs="Consolas" w:eastAsia="Consolas" w:hAnsi="Consolas"/>
+          <w:sz w:val="19"/>
+          <w:szCs w:val="19"/>
+        </w:rPr>
+        <w:t xml:space="preserve">Add server/scripts/seed.js that creates the demo user, categories, six months of expenses and income, budgets, recurring payments, the three groups with shared expenses, and shopping lists. It must be idempotent and must refuse to run against a database whose name does not end in -dev or -test unless --force is passed. Write Jest + Supertest tests using mongodb-memory-server for auth, ownership checks, CSRF rejection, rate limiting, split validation, the settlement algorithm, budget status, convert-to-expense duplicate prevention and receipt upload validation, covering what the 47 legacy Python tests checked. Add an npm test script and a GitHub Actions workflow that runs lint and tests on every push.</w:t>
+      </w:r>
+    </w:p>
+    <w:p>
+      <w:pPr>
+        <w:spacing w:after="60" w:before="160"/>
+      </w:pPr>
+      <w:r>
+        <w:rPr>
+          <w:b/>
+          <w:bCs/>
+          <w:color w:val="4F46E5"/>
+          <w:spacing w:val="20"/>
+          <w:sz w:val="17"/>
+          <w:szCs w:val="17"/>
+        </w:rPr>
+        <w:t xml:space="preserve">PURPOSE</w:t>
+      </w:r>
+    </w:p>
+    <w:p>
+      <w:pPr>
+        <w:spacing w:after="80"/>
+      </w:pPr>
+      <w:r>
+        <w:rPr>
+          <w:sz w:val="21"/>
+          <w:szCs w:val="21"/>
+        </w:rPr>
+        <w:t xml:space="preserve">Prove the back end works and keep it working.</w:t>
+      </w:r>
+    </w:p>
+    <w:p>
+      <w:pPr>
+        <w:spacing w:after="60" w:before="160"/>
+      </w:pPr>
+      <w:r>
+        <w:rPr>
+          <w:b/>
+          <w:bCs/>
+          <w:color w:val="4F46E5"/>
+          <w:spacing w:val="20"/>
+          <w:sz w:val="17"/>
+          <w:szCs w:val="17"/>
+        </w:rPr>
+        <w:t xml:space="preserve">FILES</w:t>
+      </w:r>
+    </w:p>
+    <w:p>
+      <w:pPr>
+        <w:spacing w:after="80"/>
+      </w:pPr>
+      <w:r>
+        <w:rPr>
+          <w:sz w:val="21"/>
+          <w:szCs w:val="21"/>
+        </w:rPr>
+        <w:t xml:space="preserve">server/scripts/seed.js, server/tests/*.test.js, .github/workflows/ci.yml</w:t>
+      </w:r>
+    </w:p>
+    <w:p>
+      <w:pPr>
+        <w:pStyle w:val="Heading3"/>
+        <w:keepNext/>
+      </w:pPr>
+      <w:r>
+        <w:t xml:space="preserve">P15  Remove legacy code, document and deploy</w:t>
+      </w:r>
+    </w:p>
+    <w:p>
+      <w:pPr>
+        <w:keepNext/>
+        <w:spacing w:after="60"/>
+      </w:pPr>
+      <w:r>
+        <w:rPr>
+          <w:color w:val="5B6475"/>
+          <w:sz w:val="18"/>
+          <w:szCs w:val="18"/>
+        </w:rPr>
+        <w:t xml:space="preserve">Wrap-up  |  Planned prompt</w:t>
+      </w:r>
+    </w:p>
+    <w:p>
+      <w:pPr>
+        <w:spacing w:after="60" w:before="160"/>
+      </w:pPr>
+      <w:r>
+        <w:rPr>
+          <w:b/>
+          <w:bCs/>
+          <w:color w:val="4F46E5"/>
+          <w:spacing w:val="20"/>
+          <w:sz w:val="17"/>
+          <w:szCs w:val="17"/>
+        </w:rPr>
+        <w:t xml:space="preserve">PROMPT</w:t>
+      </w:r>
+    </w:p>
+    <w:p>
+      <w:pPr>
+        <w:pBdr>
+          <w:left w:val="single" w:color="4F46E5" w:sz="18" w:space="8"/>
+        </w:pBdr>
+        <w:shd w:fill="F1F2F8" w:color="auto" w:val="clear"/>
+        <w:spacing w:after="120" w:before="40" w:line="276"/>
+        <w:ind w:left="160" w:right="160"/>
+      </w:pPr>
+      <w:r>
+        <w:rPr>
+          <w:rFonts w:ascii="Consolas" w:cs="Consolas" w:eastAsia="Consolas" w:hAnsi="Consolas"/>
+          <w:sz w:val="19"/>
+          <w:szCs w:val="19"/>
+        </w:rPr>
+        <w:t xml:space="preserve">Delete the Flask app (app.py, config.py, database/, modules/, templates/, static/, ml/, tests/*.py, requirements.txt, Procfile) from main, since it is kept on the legacy branch. Rewrite README.md: features, the stack per review (HTML+CSS, JavaScript, Node.js+MongoDB), setup steps, environment variables, a data-model diagram, the API table and screenshots. Deploy the full app to Render as a Node web service (build: npm ci; start: npm start; environment: MONGODB_URI, SESSION_SECRET, NODE_ENV=production) with MongoDB Atlas network access configured, and keep the static site on GitHub Pages. Finish the prompt log, export it to Word and PDF, and tag the release v3.0.0.</w:t>
+      </w:r>
+    </w:p>
+    <w:p>
+      <w:pPr>
+        <w:spacing w:after="60" w:before="160"/>
+      </w:pPr>
+      <w:r>
+        <w:rPr>
+          <w:b/>
+          <w:bCs/>
+          <w:color w:val="4F46E5"/>
+          <w:spacing w:val="20"/>
+          <w:sz w:val="17"/>
+          <w:szCs w:val="17"/>
+        </w:rPr>
+        <w:t xml:space="preserve">PURPOSE</w:t>
+      </w:r>
+    </w:p>
+    <w:p>
+      <w:pPr>
+        <w:spacing w:after="80"/>
+      </w:pPr>
+      <w:r>
+        <w:rPr>
+          <w:sz w:val="21"/>
+          <w:szCs w:val="21"/>
+        </w:rPr>
+        <w:t xml:space="preserve">Deliver a clean, documented, deployed project.</w:t>
+      </w:r>
+    </w:p>
+    <w:p>
+      <w:pPr>
+        <w:spacing w:after="60" w:before="160"/>
+      </w:pPr>
+      <w:r>
+        <w:rPr>
+          <w:b/>
+          <w:bCs/>
+          <w:color w:val="4F46E5"/>
+          <w:spacing w:val="20"/>
+          <w:sz w:val="17"/>
+          <w:szCs w:val="17"/>
+        </w:rPr>
+        <w:t xml:space="preserve">FILES</w:t>
+      </w:r>
+    </w:p>
+    <w:p>
+      <w:pPr>
+        <w:spacing w:after="80"/>
+      </w:pPr>
+      <w:r>
+        <w:rPr>
+          <w:sz w:val="21"/>
+          <w:szCs w:val="21"/>
+        </w:rPr>
+        <w:t xml:space="preserve">README.md, render.yaml, docs/*</w:t>
       </w:r>
     </w:p>
     <w:sectPr>

</xml_diff>

<commit_message>
Prepare handover: drop Pages workflow, fix README link, log handover
- Remove .github/workflows/pages.yml (push token lacks workflow scope)
- README: local run instructions instead of a not-yet-live site link
- Prompt log: correct publishing entry, add handover entries

Co-Authored-By: Claude Opus 5.5 <noreply@anthropic.com>
</commit_message>
<xml_diff>
--- a/docs/SplitStack_Prompt_Log.docx
+++ b/docs/SplitStack_Prompt_Log.docx
@@ -132,7 +132,7 @@
           <w:sz w:val="21"/>
           <w:szCs w:val="21"/>
         </w:rPr>
-        <w:t xml:space="preserve">15</w:t>
+        <w:t xml:space="preserve">17</w:t>
       </w:r>
     </w:p>
     <w:p>
@@ -713,7 +713,7 @@
                 <w:sz w:val="18"/>
                 <w:szCs w:val="18"/>
               </w:rPr>
-              <w:t xml:space="preserve">3</w:t>
+              <w:t xml:space="preserve">5</w:t>
             </w:r>
           </w:p>
         </w:tc>
@@ -2611,7 +2611,246 @@
                 <w:sz w:val="18"/>
                 <w:szCs w:val="18"/>
               </w:rPr>
-              <w:t xml:space="preserve">Create the GitHub repository and publish the site</w:t>
+              <w:t xml:space="preserve">Create the GitHub repository and push the code</w:t>
+            </w:r>
+          </w:p>
+        </w:tc>
+        <w:tc>
+          <w:tcPr>
+            <w:tcW w:type="dxa" w:w="1500"/>
+            <w:tcMar>
+              <w:top w:type="dxa" w:w="60"/>
+              <w:left w:type="dxa" w:w="100"/>
+              <w:bottom w:type="dxa" w:w="60"/>
+              <w:right w:type="dxa" w:w="100"/>
+            </w:tcMar>
+          </w:tcPr>
+          <w:p>
+            <w:r>
+              <w:rPr>
+                <w:b w:val="false"/>
+                <w:bCs w:val="false"/>
+                <w:color w:val="222222"/>
+                <w:sz w:val="18"/>
+                <w:szCs w:val="18"/>
+              </w:rPr>
+              <w:t xml:space="preserve">Working prompt</w:t>
+            </w:r>
+          </w:p>
+        </w:tc>
+        <w:tc>
+          <w:tcPr>
+            <w:tcW w:type="dxa" w:w="1400"/>
+            <w:tcMar>
+              <w:top w:type="dxa" w:w="60"/>
+              <w:left w:type="dxa" w:w="100"/>
+              <w:bottom w:type="dxa" w:w="60"/>
+              <w:right w:type="dxa" w:w="100"/>
+            </w:tcMar>
+          </w:tcPr>
+          <w:p>
+            <w:r>
+              <w:rPr>
+                <w:b w:val="false"/>
+                <w:bCs w:val="false"/>
+                <w:color w:val="222222"/>
+                <w:sz w:val="18"/>
+                <w:szCs w:val="18"/>
+              </w:rPr>
+              <w:t xml:space="preserve">2026-10-15</w:t>
+            </w:r>
+          </w:p>
+        </w:tc>
+      </w:tr>
+      <w:tr>
+        <w:tc>
+          <w:tcPr>
+            <w:tcW w:type="dxa" w:w="700"/>
+            <w:shd w:fill="F7F7FB" w:color="auto" w:val="clear"/>
+            <w:tcMar>
+              <w:top w:type="dxa" w:w="60"/>
+              <w:left w:type="dxa" w:w="100"/>
+              <w:bottom w:type="dxa" w:w="60"/>
+              <w:right w:type="dxa" w:w="100"/>
+            </w:tcMar>
+          </w:tcPr>
+          <w:p>
+            <w:r>
+              <w:rPr>
+                <w:b w:val="false"/>
+                <w:bCs w:val="false"/>
+                <w:color w:val="222222"/>
+                <w:sz w:val="18"/>
+                <w:szCs w:val="18"/>
+              </w:rPr>
+              <w:t xml:space="preserve">16</w:t>
+            </w:r>
+          </w:p>
+        </w:tc>
+        <w:tc>
+          <w:tcPr>
+            <w:tcW w:type="dxa" w:w="1500"/>
+            <w:shd w:fill="F7F7FB" w:color="auto" w:val="clear"/>
+            <w:tcMar>
+              <w:top w:type="dxa" w:w="60"/>
+              <w:left w:type="dxa" w:w="100"/>
+              <w:bottom w:type="dxa" w:w="60"/>
+              <w:right w:type="dxa" w:w="100"/>
+            </w:tcMar>
+          </w:tcPr>
+          <w:p>
+            <w:r>
+              <w:rPr>
+                <w:b w:val="false"/>
+                <w:bCs w:val="false"/>
+                <w:color w:val="222222"/>
+                <w:sz w:val="18"/>
+                <w:szCs w:val="18"/>
+              </w:rPr>
+              <w:t xml:space="preserve">Wrap-up</w:t>
+            </w:r>
+          </w:p>
+        </w:tc>
+        <w:tc>
+          <w:tcPr>
+            <w:tcW w:type="dxa" w:w="4538"/>
+            <w:shd w:fill="F7F7FB" w:color="auto" w:val="clear"/>
+            <w:tcMar>
+              <w:top w:type="dxa" w:w="60"/>
+              <w:left w:type="dxa" w:w="100"/>
+              <w:bottom w:type="dxa" w:w="60"/>
+              <w:right w:type="dxa" w:w="100"/>
+            </w:tcMar>
+          </w:tcPr>
+          <w:p>
+            <w:r>
+              <w:rPr>
+                <w:b w:val="false"/>
+                <w:bCs w:val="false"/>
+                <w:color w:val="222222"/>
+                <w:sz w:val="18"/>
+                <w:szCs w:val="18"/>
+              </w:rPr>
+              <w:t xml:space="preserve">Request: hand the project over to a teammate's agent</w:t>
+            </w:r>
+          </w:p>
+        </w:tc>
+        <w:tc>
+          <w:tcPr>
+            <w:tcW w:type="dxa" w:w="1500"/>
+            <w:shd w:fill="F7F7FB" w:color="auto" w:val="clear"/>
+            <w:tcMar>
+              <w:top w:type="dxa" w:w="60"/>
+              <w:left w:type="dxa" w:w="100"/>
+              <w:bottom w:type="dxa" w:w="60"/>
+              <w:right w:type="dxa" w:w="100"/>
+            </w:tcMar>
+          </w:tcPr>
+          <w:p>
+            <w:r>
+              <w:rPr>
+                <w:b w:val="false"/>
+                <w:bCs w:val="false"/>
+                <w:color w:val="222222"/>
+                <w:sz w:val="18"/>
+                <w:szCs w:val="18"/>
+              </w:rPr>
+              <w:t xml:space="preserve">User prompt</w:t>
+            </w:r>
+          </w:p>
+        </w:tc>
+        <w:tc>
+          <w:tcPr>
+            <w:tcW w:type="dxa" w:w="1400"/>
+            <w:shd w:fill="F7F7FB" w:color="auto" w:val="clear"/>
+            <w:tcMar>
+              <w:top w:type="dxa" w:w="60"/>
+              <w:left w:type="dxa" w:w="100"/>
+              <w:bottom w:type="dxa" w:w="60"/>
+              <w:right w:type="dxa" w:w="100"/>
+            </w:tcMar>
+          </w:tcPr>
+          <w:p>
+            <w:r>
+              <w:rPr>
+                <w:b w:val="false"/>
+                <w:bCs w:val="false"/>
+                <w:color w:val="222222"/>
+                <w:sz w:val="18"/>
+                <w:szCs w:val="18"/>
+              </w:rPr>
+              <w:t xml:space="preserve">2026-10-15</w:t>
+            </w:r>
+          </w:p>
+        </w:tc>
+      </w:tr>
+      <w:tr>
+        <w:tc>
+          <w:tcPr>
+            <w:tcW w:type="dxa" w:w="700"/>
+            <w:tcMar>
+              <w:top w:type="dxa" w:w="60"/>
+              <w:left w:type="dxa" w:w="100"/>
+              <w:bottom w:type="dxa" w:w="60"/>
+              <w:right w:type="dxa" w:w="100"/>
+            </w:tcMar>
+          </w:tcPr>
+          <w:p>
+            <w:r>
+              <w:rPr>
+                <w:b w:val="false"/>
+                <w:bCs w:val="false"/>
+                <w:color w:val="222222"/>
+                <w:sz w:val="18"/>
+                <w:szCs w:val="18"/>
+              </w:rPr>
+              <w:t xml:space="preserve">17</w:t>
+            </w:r>
+          </w:p>
+        </w:tc>
+        <w:tc>
+          <w:tcPr>
+            <w:tcW w:type="dxa" w:w="1500"/>
+            <w:tcMar>
+              <w:top w:type="dxa" w:w="60"/>
+              <w:left w:type="dxa" w:w="100"/>
+              <w:bottom w:type="dxa" w:w="60"/>
+              <w:right w:type="dxa" w:w="100"/>
+            </w:tcMar>
+          </w:tcPr>
+          <w:p>
+            <w:r>
+              <w:rPr>
+                <w:b w:val="false"/>
+                <w:bCs w:val="false"/>
+                <w:color w:val="222222"/>
+                <w:sz w:val="18"/>
+                <w:szCs w:val="18"/>
+              </w:rPr>
+              <w:t xml:space="preserve">Wrap-up</w:t>
+            </w:r>
+          </w:p>
+        </w:tc>
+        <w:tc>
+          <w:tcPr>
+            <w:tcW w:type="dxa" w:w="4538"/>
+            <w:tcMar>
+              <w:top w:type="dxa" w:w="60"/>
+              <w:left w:type="dxa" w:w="100"/>
+              <w:bottom w:type="dxa" w:w="60"/>
+              <w:right w:type="dxa" w:w="100"/>
+            </w:tcMar>
+          </w:tcPr>
+          <w:p>
+            <w:r>
+              <w:rPr>
+                <w:b w:val="false"/>
+                <w:bCs w:val="false"/>
+                <w:color w:val="222222"/>
+                <w:sz w:val="18"/>
+                <w:szCs w:val="18"/>
+              </w:rPr>
+              <w:t xml:space="preserve">Push the refurbished code to GitHub main</w:t>
             </w:r>
           </w:p>
         </w:tc>
@@ -5835,7 +6074,7 @@
         <w:keepNext/>
       </w:pPr>
       <w:r>
-        <w:t xml:space="preserve">#15  Create the GitHub repository and publish the site</w:t>
+        <w:t xml:space="preserve">#15  Create the GitHub repository and push the code</w:t>
       </w:r>
     </w:p>
     <w:p>
@@ -5944,7 +6183,175 @@
           <w:sz w:val="19"/>
           <w:szCs w:val="19"/>
         </w:rPr>
-        <w:t xml:space="preserve">.github/workflows/pages.yml</w:t>
+        <w:t xml:space="preserve">README.md</w:t>
+      </w:r>
+    </w:p>
+    <w:p>
+      <w:pPr>
+        <w:spacing w:after="60" w:before="160"/>
+      </w:pPr>
+      <w:r>
+        <w:rPr>
+          <w:b/>
+          <w:bCs/>
+          <w:color w:val="4F46E5"/>
+          <w:spacing w:val="20"/>
+          <w:sz w:val="17"/>
+          <w:szCs w:val="17"/>
+        </w:rPr>
+        <w:t xml:space="preserve">RESULT</w:t>
+      </w:r>
+    </w:p>
+    <w:p>
+      <w:pPr>
+        <w:spacing w:after="80"/>
+      </w:pPr>
+      <w:r>
+        <w:rPr>
+          <w:sz w:val="21"/>
+          <w:szCs w:val="21"/>
+        </w:rPr>
+        <w:t xml:space="preserve">Public repository https://github.com/MahaprabhuK/SplitStack created and the legacy branch pushed. The first push of main was rejected because it added a GitHub Actions workflow (.github/workflows/pages.yml) and the gh token lacked the "workflow" scope; the workflow file was removed and main was pushed in the next step. GitHub Pages is not set up yet (planned for the wrap-up; needs "gh auth refresh -s workflow" or a gh-pages branch).</w:t>
+      </w:r>
+    </w:p>
+    <w:p>
+      <w:pPr>
+        <w:spacing w:after="60" w:before="160"/>
+      </w:pPr>
+      <w:r>
+        <w:rPr>
+          <w:b/>
+          <w:bCs/>
+          <w:color w:val="4F46E5"/>
+          <w:spacing w:val="20"/>
+          <w:sz w:val="17"/>
+          <w:szCs w:val="17"/>
+        </w:rPr>
+        <w:t xml:space="preserve">VERIFICATION</w:t>
+      </w:r>
+    </w:p>
+    <w:p>
+      <w:pPr>
+        <w:spacing w:after="80"/>
+      </w:pPr>
+      <w:r>
+        <w:rPr>
+          <w:sz w:val="21"/>
+          <w:szCs w:val="21"/>
+        </w:rPr>
+        <w:t xml:space="preserve">gh repo view; git push output.</w:t>
+      </w:r>
+    </w:p>
+    <w:p>
+      <w:pPr>
+        <w:pBdr>
+          <w:bottom w:val="single" w:color="D9DBE5" w:sz="4" w:space="4"/>
+        </w:pBdr>
+        <w:spacing w:after="200"/>
+      </w:pPr>
+      <w:r>
+        <w:t xml:space="preserve"/>
+      </w:r>
+    </w:p>
+    <w:p>
+      <w:pPr>
+        <w:pStyle w:val="Heading3"/>
+        <w:keepNext/>
+      </w:pPr>
+      <w:r>
+        <w:t xml:space="preserve">#16  Request: hand the project over to a teammate's agent</w:t>
+      </w:r>
+    </w:p>
+    <w:p>
+      <w:pPr>
+        <w:keepNext/>
+        <w:spacing w:after="60"/>
+      </w:pPr>
+      <w:r>
+        <w:rPr>
+          <w:color w:val="5B6475"/>
+          <w:sz w:val="18"/>
+          <w:szCs w:val="18"/>
+        </w:rPr>
+        <w:t xml:space="preserve">User prompt  |  2026-10-15</w:t>
+      </w:r>
+    </w:p>
+    <w:p>
+      <w:pPr>
+        <w:spacing w:after="60" w:before="160"/>
+      </w:pPr>
+      <w:r>
+        <w:rPr>
+          <w:b/>
+          <w:bCs/>
+          <w:color w:val="4F46E5"/>
+          <w:spacing w:val="20"/>
+          <w:sz w:val="17"/>
+          <w:szCs w:val="17"/>
+        </w:rPr>
+        <w:t xml:space="preserve">PROMPT</w:t>
+      </w:r>
+    </w:p>
+    <w:p>
+      <w:pPr>
+        <w:pBdr>
+          <w:left w:val="single" w:color="4F46E5" w:sz="18" w:space="8"/>
+        </w:pBdr>
+        <w:shd w:fill="F1F2F8" w:color="auto" w:val="clear"/>
+        <w:spacing w:after="120" w:before="40" w:line="276"/>
+        <w:ind w:left="160" w:right="160"/>
+      </w:pPr>
+      <w:r>
+        <w:rPr>
+          <w:rFonts w:ascii="Consolas" w:cs="Consolas" w:eastAsia="Consolas" w:hAnsi="Consolas"/>
+          <w:sz w:val="19"/>
+          <w:szCs w:val="19"/>
+        </w:rPr>
+        <w:t xml:space="preserve">ACTUALLY I GONNA HANDOVER THE PROJECT TO MY TEAMMATES AGENT SO HE'LL BE PULLING THE CODE AND RUNNING IN HIS SYSTEM SO GIVE PROMPT FOR THAT</w:t>
+      </w:r>
+    </w:p>
+    <w:p>
+      <w:pPr>
+        <w:spacing w:after="60" w:before="160"/>
+      </w:pPr>
+      <w:r>
+        <w:rPr>
+          <w:b/>
+          <w:bCs/>
+          <w:color w:val="4F46E5"/>
+          <w:spacing w:val="20"/>
+          <w:sz w:val="17"/>
+          <w:szCs w:val="17"/>
+        </w:rPr>
+        <w:t xml:space="preserve">PURPOSE</w:t>
+      </w:r>
+    </w:p>
+    <w:p>
+      <w:pPr>
+        <w:spacing w:after="80"/>
+      </w:pPr>
+      <w:r>
+        <w:rPr>
+          <w:sz w:val="21"/>
+          <w:szCs w:val="21"/>
+        </w:rPr>
+        <w:t xml:space="preserve">Let a teammate's AI agent clone, run and continue the project.</w:t>
+      </w:r>
+    </w:p>
+    <w:p>
+      <w:pPr>
+        <w:spacing w:after="60" w:before="160"/>
+      </w:pPr>
+      <w:r>
+        <w:rPr>
+          <w:b/>
+          <w:bCs/>
+          <w:color w:val="4F46E5"/>
+          <w:spacing w:val="20"/>
+          <w:sz w:val="17"/>
+          <w:szCs w:val="17"/>
+        </w:rPr>
+        <w:t xml:space="preserve">FILES</w:t>
       </w:r>
     </w:p>
     <w:p>
@@ -5961,11 +6368,264 @@
           <w:sz w:val="19"/>
           <w:szCs w:val="19"/>
         </w:rPr>
+        <w:t xml:space="preserve">-</w:t>
+      </w:r>
+    </w:p>
+    <w:p>
+      <w:pPr>
+        <w:spacing w:after="60" w:before="160"/>
+      </w:pPr>
+      <w:r>
+        <w:rPr>
+          <w:b/>
+          <w:bCs/>
+          <w:color w:val="4F46E5"/>
+          <w:spacing w:val="20"/>
+          <w:sz w:val="17"/>
+          <w:szCs w:val="17"/>
+        </w:rPr>
+        <w:t xml:space="preserve">RESULT</w:t>
+      </w:r>
+    </w:p>
+    <w:p>
+      <w:pPr>
+        <w:spacing w:after="80"/>
+      </w:pPr>
+      <w:r>
+        <w:rPr>
+          <w:sz w:val="21"/>
+          <w:szCs w:val="21"/>
+        </w:rPr>
+        <w:t xml:space="preserve">A handover prompt was written covering: requirements per review, clone and branch, prerequisites, install/run/verify commands, repository map, known traps, the mandatory logging rule, the ordered remaining work (planned prompts P1-P15) and working rules. Noted that the new work had to be pushed to GitHub first.</w:t>
+      </w:r>
+    </w:p>
+    <w:p>
+      <w:pPr>
+        <w:spacing w:after="60" w:before="160"/>
+      </w:pPr>
+      <w:r>
+        <w:rPr>
+          <w:b/>
+          <w:bCs/>
+          <w:color w:val="4F46E5"/>
+          <w:spacing w:val="20"/>
+          <w:sz w:val="17"/>
+          <w:szCs w:val="17"/>
+        </w:rPr>
+        <w:t xml:space="preserve">VERIFICATION</w:t>
+      </w:r>
+    </w:p>
+    <w:p>
+      <w:pPr>
+        <w:spacing w:after="80"/>
+      </w:pPr>
+      <w:r>
+        <w:rPr>
+          <w:sz w:val="21"/>
+          <w:szCs w:val="21"/>
+        </w:rPr>
+        <w:t xml:space="preserve">-</w:t>
+      </w:r>
+    </w:p>
+    <w:p>
+      <w:pPr>
+        <w:pBdr>
+          <w:bottom w:val="single" w:color="D9DBE5" w:sz="4" w:space="4"/>
+        </w:pBdr>
+        <w:spacing w:after="200"/>
+      </w:pPr>
+      <w:r>
+        <w:t xml:space="preserve"/>
+      </w:r>
+    </w:p>
+    <w:p>
+      <w:pPr>
+        <w:pStyle w:val="Heading3"/>
+        <w:keepNext/>
+      </w:pPr>
+      <w:r>
+        <w:t xml:space="preserve">#17  Push the refurbished code to GitHub main</w:t>
+      </w:r>
+    </w:p>
+    <w:p>
+      <w:pPr>
+        <w:keepNext/>
+        <w:spacing w:after="60"/>
+      </w:pPr>
+      <w:r>
+        <w:rPr>
+          <w:color w:val="5B6475"/>
+          <w:sz w:val="18"/>
+          <w:szCs w:val="18"/>
+        </w:rPr>
+        <w:t xml:space="preserve">Working prompt  |  2026-10-15</w:t>
+      </w:r>
+    </w:p>
+    <w:p>
+      <w:pPr>
+        <w:spacing w:after="60" w:before="160"/>
+      </w:pPr>
+      <w:r>
+        <w:rPr>
+          <w:b/>
+          <w:bCs/>
+          <w:color w:val="4F46E5"/>
+          <w:spacing w:val="20"/>
+          <w:sz w:val="17"/>
+          <w:szCs w:val="17"/>
+        </w:rPr>
+        <w:t xml:space="preserve">PROMPT</w:t>
+      </w:r>
+    </w:p>
+    <w:p>
+      <w:pPr>
+        <w:pBdr>
+          <w:left w:val="single" w:color="4F46E5" w:sz="18" w:space="8"/>
+        </w:pBdr>
+        <w:shd w:fill="F1F2F8" w:color="auto" w:val="clear"/>
+        <w:spacing w:after="120" w:before="40" w:line="276"/>
+        <w:ind w:left="160" w:right="160"/>
+      </w:pPr>
+      <w:r>
+        <w:rPr>
+          <w:rFonts w:ascii="Consolas" w:cs="Consolas" w:eastAsia="Consolas" w:hAnsi="Consolas"/>
+          <w:sz w:val="19"/>
+          <w:szCs w:val="19"/>
+        </w:rPr>
+        <w:t xml:space="preserve">push it  (user prompt). Executed as: remove .github/workflows/pages.yml (the token lacks the workflow scope), replace the not-yet-existing live-site link in README.md with local run instructions, correct the earlier log entry about publishing, log the handover, rebuild the prompt logs, commit, and push the refurbish branch to main on https://github.com/MahaprabhuK/SplitStack so the teammate can clone it.</w:t>
+      </w:r>
+    </w:p>
+    <w:p>
+      <w:pPr>
+        <w:spacing w:after="60" w:before="160"/>
+      </w:pPr>
+      <w:r>
+        <w:rPr>
+          <w:b/>
+          <w:bCs/>
+          <w:color w:val="4F46E5"/>
+          <w:spacing w:val="20"/>
+          <w:sz w:val="17"/>
+          <w:szCs w:val="17"/>
+        </w:rPr>
+        <w:t xml:space="preserve">PURPOSE</w:t>
+      </w:r>
+    </w:p>
+    <w:p>
+      <w:pPr>
+        <w:spacing w:after="80"/>
+      </w:pPr>
+      <w:r>
+        <w:rPr>
+          <w:sz w:val="21"/>
+          <w:szCs w:val="21"/>
+        </w:rPr>
+        <w:t xml:space="preserve">Make the current work available to the teammate.</w:t>
+      </w:r>
+    </w:p>
+    <w:p>
+      <w:pPr>
+        <w:spacing w:after="60" w:before="160"/>
+      </w:pPr>
+      <w:r>
+        <w:rPr>
+          <w:b/>
+          <w:bCs/>
+          <w:color w:val="4F46E5"/>
+          <w:spacing w:val="20"/>
+          <w:sz w:val="17"/>
+          <w:szCs w:val="17"/>
+        </w:rPr>
+        <w:t xml:space="preserve">FILES</w:t>
+      </w:r>
+    </w:p>
+    <w:p>
+      <w:pPr>
+        <w:pStyle w:val="ListParagraph"/>
+        <w:numPr>
+          <w:ilvl w:val="0"/>
+          <w:numId w:val="2"/>
+        </w:numPr>
+      </w:pPr>
+      <w:r>
+        <w:rPr>
+          <w:rFonts w:ascii="Consolas" w:cs="Consolas" w:eastAsia="Consolas" w:hAnsi="Consolas"/>
+          <w:sz w:val="19"/>
+          <w:szCs w:val="19"/>
+        </w:rPr>
+        <w:t xml:space="preserve">.github/workflows/pages.yml (removed)</w:t>
+      </w:r>
+    </w:p>
+    <w:p>
+      <w:pPr>
+        <w:pStyle w:val="ListParagraph"/>
+        <w:numPr>
+          <w:ilvl w:val="0"/>
+          <w:numId w:val="2"/>
+        </w:numPr>
+      </w:pPr>
+      <w:r>
+        <w:rPr>
+          <w:rFonts w:ascii="Consolas" w:cs="Consolas" w:eastAsia="Consolas" w:hAnsi="Consolas"/>
+          <w:sz w:val="19"/>
+          <w:szCs w:val="19"/>
+        </w:rPr>
         <w:t xml:space="preserve">README.md</w:t>
       </w:r>
     </w:p>
     <w:p>
       <w:pPr>
+        <w:pStyle w:val="ListParagraph"/>
+        <w:numPr>
+          <w:ilvl w:val="0"/>
+          <w:numId w:val="2"/>
+        </w:numPr>
+      </w:pPr>
+      <w:r>
+        <w:rPr>
+          <w:rFonts w:ascii="Consolas" w:cs="Consolas" w:eastAsia="Consolas" w:hAnsi="Consolas"/>
+          <w:sz w:val="19"/>
+          <w:szCs w:val="19"/>
+        </w:rPr>
+        <w:t xml:space="preserve">docs/prompt_log.json</w:t>
+      </w:r>
+    </w:p>
+    <w:p>
+      <w:pPr>
+        <w:pStyle w:val="ListParagraph"/>
+        <w:numPr>
+          <w:ilvl w:val="0"/>
+          <w:numId w:val="2"/>
+        </w:numPr>
+      </w:pPr>
+      <w:r>
+        <w:rPr>
+          <w:rFonts w:ascii="Consolas" w:cs="Consolas" w:eastAsia="Consolas" w:hAnsi="Consolas"/>
+          <w:sz w:val="19"/>
+          <w:szCs w:val="19"/>
+        </w:rPr>
+        <w:t xml:space="preserve">docs/SplitStack_Prompt_Log.docx</w:t>
+      </w:r>
+    </w:p>
+    <w:p>
+      <w:pPr>
+        <w:pStyle w:val="ListParagraph"/>
+        <w:numPr>
+          <w:ilvl w:val="0"/>
+          <w:numId w:val="2"/>
+        </w:numPr>
+      </w:pPr>
+      <w:r>
+        <w:rPr>
+          <w:rFonts w:ascii="Consolas" w:cs="Consolas" w:eastAsia="Consolas" w:hAnsi="Consolas"/>
+          <w:sz w:val="19"/>
+          <w:szCs w:val="19"/>
+        </w:rPr>
+        <w:t xml:space="preserve">docs/SplitStack_Prompt_Log.pdf</w:t>
+      </w:r>
+    </w:p>
+    <w:p>
+      <w:pPr>
         <w:spacing w:after="60" w:before="160"/>
       </w:pPr>
       <w:r>
@@ -5989,7 +6649,7 @@
           <w:sz w:val="21"/>
           <w:szCs w:val="21"/>
         </w:rPr>
-        <w:t xml:space="preserve">Repository: https://github.com/MahaprabhuK/SplitStack - Website: https://mahaprabhuk.github.io/SplitStack/</w:t>
+        <w:t xml:space="preserve">main pushed to GitHub; branches on GitHub: main (refurbished work) and legacy (original Flask app).</w:t>
       </w:r>
     </w:p>
     <w:p>
@@ -6017,7 +6677,7 @@
           <w:sz w:val="21"/>
           <w:szCs w:val="21"/>
         </w:rPr>
-        <w:t xml:space="preserve">gh repo view; Pages workflow run; HTTP check of the live URL.</w:t>
+        <w:t xml:space="preserve">git ls-remote shows main and legacy at the expected commits.</w:t>
       </w:r>
     </w:p>
     <w:p>

</xml_diff>

<commit_message>
Deploy Review 1 site to GitHub Pages via gh-pages branch
- client/ published from the gh-pages branch (no Actions workflow needed)
- README: restore the live site link
- Prompt log: log the push and deploy steps, rebuild docx/pdf

Co-Authored-By: Claude Opus 5.5 <noreply@anthropic.com>
</commit_message>
<xml_diff>
--- a/docs/SplitStack_Prompt_Log.docx
+++ b/docs/SplitStack_Prompt_Log.docx
@@ -132,7 +132,7 @@
           <w:sz w:val="21"/>
           <w:szCs w:val="21"/>
         </w:rPr>
-        <w:t xml:space="preserve">17</w:t>
+        <w:t xml:space="preserve">19</w:t>
       </w:r>
     </w:p>
     <w:p>
@@ -713,7 +713,7 @@
                 <w:sz w:val="18"/>
                 <w:szCs w:val="18"/>
               </w:rPr>
-              <w:t xml:space="preserve">5</w:t>
+              <w:t xml:space="preserve">7</w:t>
             </w:r>
           </w:p>
         </w:tc>
@@ -2901,6 +2901,245 @@
           </w:p>
         </w:tc>
       </w:tr>
+      <w:tr>
+        <w:tc>
+          <w:tcPr>
+            <w:tcW w:type="dxa" w:w="700"/>
+            <w:shd w:fill="F7F7FB" w:color="auto" w:val="clear"/>
+            <w:tcMar>
+              <w:top w:type="dxa" w:w="60"/>
+              <w:left w:type="dxa" w:w="100"/>
+              <w:bottom w:type="dxa" w:w="60"/>
+              <w:right w:type="dxa" w:w="100"/>
+            </w:tcMar>
+          </w:tcPr>
+          <w:p>
+            <w:r>
+              <w:rPr>
+                <w:b w:val="false"/>
+                <w:bCs w:val="false"/>
+                <w:color w:val="222222"/>
+                <w:sz w:val="18"/>
+                <w:szCs w:val="18"/>
+              </w:rPr>
+              <w:t xml:space="preserve">18</w:t>
+            </w:r>
+          </w:p>
+        </w:tc>
+        <w:tc>
+          <w:tcPr>
+            <w:tcW w:type="dxa" w:w="1500"/>
+            <w:shd w:fill="F7F7FB" w:color="auto" w:val="clear"/>
+            <w:tcMar>
+              <w:top w:type="dxa" w:w="60"/>
+              <w:left w:type="dxa" w:w="100"/>
+              <w:bottom w:type="dxa" w:w="60"/>
+              <w:right w:type="dxa" w:w="100"/>
+            </w:tcMar>
+          </w:tcPr>
+          <w:p>
+            <w:r>
+              <w:rPr>
+                <w:b w:val="false"/>
+                <w:bCs w:val="false"/>
+                <w:color w:val="222222"/>
+                <w:sz w:val="18"/>
+                <w:szCs w:val="18"/>
+              </w:rPr>
+              <w:t xml:space="preserve">Wrap-up</w:t>
+            </w:r>
+          </w:p>
+        </w:tc>
+        <w:tc>
+          <w:tcPr>
+            <w:tcW w:type="dxa" w:w="4538"/>
+            <w:shd w:fill="F7F7FB" w:color="auto" w:val="clear"/>
+            <w:tcMar>
+              <w:top w:type="dxa" w:w="60"/>
+              <w:left w:type="dxa" w:w="100"/>
+              <w:bottom w:type="dxa" w:w="60"/>
+              <w:right w:type="dxa" w:w="100"/>
+            </w:tcMar>
+          </w:tcPr>
+          <w:p>
+            <w:r>
+              <w:rPr>
+                <w:b w:val="false"/>
+                <w:bCs w:val="false"/>
+                <w:color w:val="222222"/>
+                <w:sz w:val="18"/>
+                <w:szCs w:val="18"/>
+              </w:rPr>
+              <w:t xml:space="preserve">Request: push the code and deploy the website</w:t>
+            </w:r>
+          </w:p>
+        </w:tc>
+        <w:tc>
+          <w:tcPr>
+            <w:tcW w:type="dxa" w:w="1500"/>
+            <w:shd w:fill="F7F7FB" w:color="auto" w:val="clear"/>
+            <w:tcMar>
+              <w:top w:type="dxa" w:w="60"/>
+              <w:left w:type="dxa" w:w="100"/>
+              <w:bottom w:type="dxa" w:w="60"/>
+              <w:right w:type="dxa" w:w="100"/>
+            </w:tcMar>
+          </w:tcPr>
+          <w:p>
+            <w:r>
+              <w:rPr>
+                <w:b w:val="false"/>
+                <w:bCs w:val="false"/>
+                <w:color w:val="222222"/>
+                <w:sz w:val="18"/>
+                <w:szCs w:val="18"/>
+              </w:rPr>
+              <w:t xml:space="preserve">User prompt</w:t>
+            </w:r>
+          </w:p>
+        </w:tc>
+        <w:tc>
+          <w:tcPr>
+            <w:tcW w:type="dxa" w:w="1400"/>
+            <w:shd w:fill="F7F7FB" w:color="auto" w:val="clear"/>
+            <w:tcMar>
+              <w:top w:type="dxa" w:w="60"/>
+              <w:left w:type="dxa" w:w="100"/>
+              <w:bottom w:type="dxa" w:w="60"/>
+              <w:right w:type="dxa" w:w="100"/>
+            </w:tcMar>
+          </w:tcPr>
+          <w:p>
+            <w:r>
+              <w:rPr>
+                <w:b w:val="false"/>
+                <w:bCs w:val="false"/>
+                <w:color w:val="222222"/>
+                <w:sz w:val="18"/>
+                <w:szCs w:val="18"/>
+              </w:rPr>
+              <w:t xml:space="preserve">2026-10-15</w:t>
+            </w:r>
+          </w:p>
+        </w:tc>
+      </w:tr>
+      <w:tr>
+        <w:tc>
+          <w:tcPr>
+            <w:tcW w:type="dxa" w:w="700"/>
+            <w:tcMar>
+              <w:top w:type="dxa" w:w="60"/>
+              <w:left w:type="dxa" w:w="100"/>
+              <w:bottom w:type="dxa" w:w="60"/>
+              <w:right w:type="dxa" w:w="100"/>
+            </w:tcMar>
+          </w:tcPr>
+          <w:p>
+            <w:r>
+              <w:rPr>
+                <w:b w:val="false"/>
+                <w:bCs w:val="false"/>
+                <w:color w:val="222222"/>
+                <w:sz w:val="18"/>
+                <w:szCs w:val="18"/>
+              </w:rPr>
+              <w:t xml:space="preserve">19</w:t>
+            </w:r>
+          </w:p>
+        </w:tc>
+        <w:tc>
+          <w:tcPr>
+            <w:tcW w:type="dxa" w:w="1500"/>
+            <w:tcMar>
+              <w:top w:type="dxa" w:w="60"/>
+              <w:left w:type="dxa" w:w="100"/>
+              <w:bottom w:type="dxa" w:w="60"/>
+              <w:right w:type="dxa" w:w="100"/>
+            </w:tcMar>
+          </w:tcPr>
+          <w:p>
+            <w:r>
+              <w:rPr>
+                <w:b w:val="false"/>
+                <w:bCs w:val="false"/>
+                <w:color w:val="222222"/>
+                <w:sz w:val="18"/>
+                <w:szCs w:val="18"/>
+              </w:rPr>
+              <w:t xml:space="preserve">Wrap-up</w:t>
+            </w:r>
+          </w:p>
+        </w:tc>
+        <w:tc>
+          <w:tcPr>
+            <w:tcW w:type="dxa" w:w="4538"/>
+            <w:tcMar>
+              <w:top w:type="dxa" w:w="60"/>
+              <w:left w:type="dxa" w:w="100"/>
+              <w:bottom w:type="dxa" w:w="60"/>
+              <w:right w:type="dxa" w:w="100"/>
+            </w:tcMar>
+          </w:tcPr>
+          <w:p>
+            <w:r>
+              <w:rPr>
+                <w:b w:val="false"/>
+                <w:bCs w:val="false"/>
+                <w:color w:val="222222"/>
+                <w:sz w:val="18"/>
+                <w:szCs w:val="18"/>
+              </w:rPr>
+              <w:t xml:space="preserve">Deploy the client to GitHub Pages from a gh-pages branch</w:t>
+            </w:r>
+          </w:p>
+        </w:tc>
+        <w:tc>
+          <w:tcPr>
+            <w:tcW w:type="dxa" w:w="1500"/>
+            <w:tcMar>
+              <w:top w:type="dxa" w:w="60"/>
+              <w:left w:type="dxa" w:w="100"/>
+              <w:bottom w:type="dxa" w:w="60"/>
+              <w:right w:type="dxa" w:w="100"/>
+            </w:tcMar>
+          </w:tcPr>
+          <w:p>
+            <w:r>
+              <w:rPr>
+                <w:b w:val="false"/>
+                <w:bCs w:val="false"/>
+                <w:color w:val="222222"/>
+                <w:sz w:val="18"/>
+                <w:szCs w:val="18"/>
+              </w:rPr>
+              <w:t xml:space="preserve">Working prompt</w:t>
+            </w:r>
+          </w:p>
+        </w:tc>
+        <w:tc>
+          <w:tcPr>
+            <w:tcW w:type="dxa" w:w="1400"/>
+            <w:tcMar>
+              <w:top w:type="dxa" w:w="60"/>
+              <w:left w:type="dxa" w:w="100"/>
+              <w:bottom w:type="dxa" w:w="60"/>
+              <w:right w:type="dxa" w:w="100"/>
+            </w:tcMar>
+          </w:tcPr>
+          <w:p>
+            <w:r>
+              <w:rPr>
+                <w:b w:val="false"/>
+                <w:bCs w:val="false"/>
+                <w:color w:val="222222"/>
+                <w:sz w:val="18"/>
+                <w:szCs w:val="18"/>
+              </w:rPr>
+              <w:t xml:space="preserve">2026-10-15</w:t>
+            </w:r>
+          </w:p>
+        </w:tc>
+      </w:tr>
     </w:tbl>
     <w:p>
       <w:r>
@@ -6678,6 +6917,393 @@
           <w:szCs w:val="21"/>
         </w:rPr>
         <w:t xml:space="preserve">git ls-remote shows main and legacy at the expected commits.</w:t>
+      </w:r>
+    </w:p>
+    <w:p>
+      <w:pPr>
+        <w:pBdr>
+          <w:bottom w:val="single" w:color="D9DBE5" w:sz="4" w:space="4"/>
+        </w:pBdr>
+        <w:spacing w:after="200"/>
+      </w:pPr>
+      <w:r>
+        <w:t xml:space="preserve"/>
+      </w:r>
+    </w:p>
+    <w:p>
+      <w:pPr>
+        <w:pStyle w:val="Heading3"/>
+        <w:keepNext/>
+      </w:pPr>
+      <w:r>
+        <w:t xml:space="preserve">#18  Request: push the code and deploy the website</w:t>
+      </w:r>
+    </w:p>
+    <w:p>
+      <w:pPr>
+        <w:keepNext/>
+        <w:spacing w:after="60"/>
+      </w:pPr>
+      <w:r>
+        <w:rPr>
+          <w:color w:val="5B6475"/>
+          <w:sz w:val="18"/>
+          <w:szCs w:val="18"/>
+        </w:rPr>
+        <w:t xml:space="preserve">User prompt  |  2026-10-15</w:t>
+      </w:r>
+    </w:p>
+    <w:p>
+      <w:pPr>
+        <w:spacing w:after="60" w:before="160"/>
+      </w:pPr>
+      <w:r>
+        <w:rPr>
+          <w:b/>
+          <w:bCs/>
+          <w:color w:val="4F46E5"/>
+          <w:spacing w:val="20"/>
+          <w:sz w:val="17"/>
+          <w:szCs w:val="17"/>
+        </w:rPr>
+        <w:t xml:space="preserve">PROMPT</w:t>
+      </w:r>
+    </w:p>
+    <w:p>
+      <w:pPr>
+        <w:pBdr>
+          <w:left w:val="single" w:color="4F46E5" w:sz="18" w:space="8"/>
+        </w:pBdr>
+        <w:shd w:fill="F1F2F8" w:color="auto" w:val="clear"/>
+        <w:spacing w:after="120" w:before="40" w:line="276"/>
+        <w:ind w:left="160" w:right="160"/>
+      </w:pPr>
+      <w:r>
+        <w:rPr>
+          <w:rFonts w:ascii="Consolas" w:cs="Consolas" w:eastAsia="Consolas" w:hAnsi="Consolas"/>
+          <w:sz w:val="19"/>
+          <w:szCs w:val="19"/>
+        </w:rPr>
+        <w:t xml:space="preserve">first push the code and deploy it</w:t>
+      </w:r>
+    </w:p>
+    <w:p>
+      <w:pPr>
+        <w:spacing w:after="60" w:before="160"/>
+      </w:pPr>
+      <w:r>
+        <w:rPr>
+          <w:b/>
+          <w:bCs/>
+          <w:color w:val="4F46E5"/>
+          <w:spacing w:val="20"/>
+          <w:sz w:val="17"/>
+          <w:szCs w:val="17"/>
+        </w:rPr>
+        <w:t xml:space="preserve">PURPOSE</w:t>
+      </w:r>
+    </w:p>
+    <w:p>
+      <w:pPr>
+        <w:spacing w:after="80"/>
+      </w:pPr>
+      <w:r>
+        <w:rPr>
+          <w:sz w:val="21"/>
+          <w:szCs w:val="21"/>
+        </w:rPr>
+        <w:t xml:space="preserve">Get the code on GitHub and the Review 1 site online.</w:t>
+      </w:r>
+    </w:p>
+    <w:p>
+      <w:pPr>
+        <w:spacing w:after="60" w:before="160"/>
+      </w:pPr>
+      <w:r>
+        <w:rPr>
+          <w:b/>
+          <w:bCs/>
+          <w:color w:val="4F46E5"/>
+          <w:spacing w:val="20"/>
+          <w:sz w:val="17"/>
+          <w:szCs w:val="17"/>
+        </w:rPr>
+        <w:t xml:space="preserve">FILES</w:t>
+      </w:r>
+    </w:p>
+    <w:p>
+      <w:pPr>
+        <w:pStyle w:val="ListParagraph"/>
+        <w:numPr>
+          <w:ilvl w:val="0"/>
+          <w:numId w:val="2"/>
+        </w:numPr>
+      </w:pPr>
+      <w:r>
+        <w:rPr>
+          <w:rFonts w:ascii="Consolas" w:cs="Consolas" w:eastAsia="Consolas" w:hAnsi="Consolas"/>
+          <w:sz w:val="19"/>
+          <w:szCs w:val="19"/>
+        </w:rPr>
+        <w:t xml:space="preserve">-</w:t>
+      </w:r>
+    </w:p>
+    <w:p>
+      <w:pPr>
+        <w:spacing w:after="60" w:before="160"/>
+      </w:pPr>
+      <w:r>
+        <w:rPr>
+          <w:b/>
+          <w:bCs/>
+          <w:color w:val="4F46E5"/>
+          <w:spacing w:val="20"/>
+          <w:sz w:val="17"/>
+          <w:szCs w:val="17"/>
+        </w:rPr>
+        <w:t xml:space="preserve">RESULT</w:t>
+      </w:r>
+    </w:p>
+    <w:p>
+      <w:pPr>
+        <w:spacing w:after="80"/>
+      </w:pPr>
+      <w:r>
+        <w:rPr>
+          <w:sz w:val="21"/>
+          <w:szCs w:val="21"/>
+        </w:rPr>
+        <w:t xml:space="preserve">Handled in the next step.</w:t>
+      </w:r>
+    </w:p>
+    <w:p>
+      <w:pPr>
+        <w:spacing w:after="60" w:before="160"/>
+      </w:pPr>
+      <w:r>
+        <w:rPr>
+          <w:b/>
+          <w:bCs/>
+          <w:color w:val="4F46E5"/>
+          <w:spacing w:val="20"/>
+          <w:sz w:val="17"/>
+          <w:szCs w:val="17"/>
+        </w:rPr>
+        <w:t xml:space="preserve">VERIFICATION</w:t>
+      </w:r>
+    </w:p>
+    <w:p>
+      <w:pPr>
+        <w:spacing w:after="80"/>
+      </w:pPr>
+      <w:r>
+        <w:rPr>
+          <w:sz w:val="21"/>
+          <w:szCs w:val="21"/>
+        </w:rPr>
+        <w:t xml:space="preserve">-</w:t>
+      </w:r>
+    </w:p>
+    <w:p>
+      <w:pPr>
+        <w:pBdr>
+          <w:bottom w:val="single" w:color="D9DBE5" w:sz="4" w:space="4"/>
+        </w:pBdr>
+        <w:spacing w:after="200"/>
+      </w:pPr>
+      <w:r>
+        <w:t xml:space="preserve"/>
+      </w:r>
+    </w:p>
+    <w:p>
+      <w:pPr>
+        <w:pStyle w:val="Heading3"/>
+        <w:keepNext/>
+      </w:pPr>
+      <w:r>
+        <w:t xml:space="preserve">#19  Deploy the client to GitHub Pages from a gh-pages branch</w:t>
+      </w:r>
+    </w:p>
+    <w:p>
+      <w:pPr>
+        <w:keepNext/>
+        <w:spacing w:after="60"/>
+      </w:pPr>
+      <w:r>
+        <w:rPr>
+          <w:color w:val="5B6475"/>
+          <w:sz w:val="18"/>
+          <w:szCs w:val="18"/>
+        </w:rPr>
+        <w:t xml:space="preserve">Working prompt  |  2026-10-15</w:t>
+      </w:r>
+    </w:p>
+    <w:p>
+      <w:pPr>
+        <w:spacing w:after="60" w:before="160"/>
+      </w:pPr>
+      <w:r>
+        <w:rPr>
+          <w:b/>
+          <w:bCs/>
+          <w:color w:val="4F46E5"/>
+          <w:spacing w:val="20"/>
+          <w:sz w:val="17"/>
+          <w:szCs w:val="17"/>
+        </w:rPr>
+        <w:t xml:space="preserve">PROMPT</w:t>
+      </w:r>
+    </w:p>
+    <w:p>
+      <w:pPr>
+        <w:pBdr>
+          <w:left w:val="single" w:color="4F46E5" w:sz="18" w:space="8"/>
+        </w:pBdr>
+        <w:shd w:fill="F1F2F8" w:color="auto" w:val="clear"/>
+        <w:spacing w:after="120" w:before="40" w:line="276"/>
+        <w:ind w:left="160" w:right="160"/>
+      </w:pPr>
+      <w:r>
+        <w:rPr>
+          <w:rFonts w:ascii="Consolas" w:cs="Consolas" w:eastAsia="Consolas" w:hAnsi="Consolas"/>
+          <w:sz w:val="19"/>
+          <w:szCs w:val="19"/>
+        </w:rPr>
+        <w:t xml:space="preserve">Push refurbish to main and refurbish on MahaprabhuK/SplitStack. Because the token cannot push workflow files, deploy without GitHub Actions: check that client/ uses only relative links, split client/ into its own history with git subtree split, push it as the gh-pages branch, wait for GitHub Pages to publish it, then put the live link back in README.md and log the step.</w:t>
+      </w:r>
+    </w:p>
+    <w:p>
+      <w:pPr>
+        <w:spacing w:after="60" w:before="160"/>
+      </w:pPr>
+      <w:r>
+        <w:rPr>
+          <w:b/>
+          <w:bCs/>
+          <w:color w:val="4F46E5"/>
+          <w:spacing w:val="20"/>
+          <w:sz w:val="17"/>
+          <w:szCs w:val="17"/>
+        </w:rPr>
+        <w:t xml:space="preserve">PURPOSE</w:t>
+      </w:r>
+    </w:p>
+    <w:p>
+      <w:pPr>
+        <w:spacing w:after="80"/>
+      </w:pPr>
+      <w:r>
+        <w:rPr>
+          <w:sz w:val="21"/>
+          <w:szCs w:val="21"/>
+        </w:rPr>
+        <w:t xml:space="preserve">Publish the Review 1 site at a public URL without needing the workflow scope.</w:t>
+      </w:r>
+    </w:p>
+    <w:p>
+      <w:pPr>
+        <w:spacing w:after="60" w:before="160"/>
+      </w:pPr>
+      <w:r>
+        <w:rPr>
+          <w:b/>
+          <w:bCs/>
+          <w:color w:val="4F46E5"/>
+          <w:spacing w:val="20"/>
+          <w:sz w:val="17"/>
+          <w:szCs w:val="17"/>
+        </w:rPr>
+        <w:t xml:space="preserve">FILES</w:t>
+      </w:r>
+    </w:p>
+    <w:p>
+      <w:pPr>
+        <w:pStyle w:val="ListParagraph"/>
+        <w:numPr>
+          <w:ilvl w:val="0"/>
+          <w:numId w:val="2"/>
+        </w:numPr>
+      </w:pPr>
+      <w:r>
+        <w:rPr>
+          <w:rFonts w:ascii="Consolas" w:cs="Consolas" w:eastAsia="Consolas" w:hAnsi="Consolas"/>
+          <w:sz w:val="19"/>
+          <w:szCs w:val="19"/>
+        </w:rPr>
+        <w:t xml:space="preserve">README.md</w:t>
+      </w:r>
+    </w:p>
+    <w:p>
+      <w:pPr>
+        <w:pStyle w:val="ListParagraph"/>
+        <w:numPr>
+          <w:ilvl w:val="0"/>
+          <w:numId w:val="2"/>
+        </w:numPr>
+      </w:pPr>
+      <w:r>
+        <w:rPr>
+          <w:rFonts w:ascii="Consolas" w:cs="Consolas" w:eastAsia="Consolas" w:hAnsi="Consolas"/>
+          <w:sz w:val="19"/>
+          <w:szCs w:val="19"/>
+        </w:rPr>
+        <w:t xml:space="preserve">docs/prompt_log.json</w:t>
+      </w:r>
+    </w:p>
+    <w:p>
+      <w:pPr>
+        <w:spacing w:after="60" w:before="160"/>
+      </w:pPr>
+      <w:r>
+        <w:rPr>
+          <w:b/>
+          <w:bCs/>
+          <w:color w:val="4F46E5"/>
+          <w:spacing w:val="20"/>
+          <w:sz w:val="17"/>
+          <w:szCs w:val="17"/>
+        </w:rPr>
+        <w:t xml:space="preserve">RESULT</w:t>
+      </w:r>
+    </w:p>
+    <w:p>
+      <w:pPr>
+        <w:spacing w:after="80"/>
+      </w:pPr>
+      <w:r>
+        <w:rPr>
+          <w:sz w:val="21"/>
+          <w:szCs w:val="21"/>
+        </w:rPr>
+        <w:t xml:space="preserve">main and refurbish are on GitHub. The client/ folder is published from the gh-pages branch at https://mahaprabhuk.github.io/SplitStack/ (GitHub enabled Pages automatically). To redeploy after client changes: git subtree split --prefix client refurbish, then push that commit to gh-pages.</w:t>
+      </w:r>
+    </w:p>
+    <w:p>
+      <w:pPr>
+        <w:spacing w:after="60" w:before="160"/>
+      </w:pPr>
+      <w:r>
+        <w:rPr>
+          <w:b/>
+          <w:bCs/>
+          <w:color w:val="4F46E5"/>
+          <w:spacing w:val="20"/>
+          <w:sz w:val="17"/>
+          <w:szCs w:val="17"/>
+        </w:rPr>
+        <w:t xml:space="preserve">VERIFICATION</w:t>
+      </w:r>
+    </w:p>
+    <w:p>
+      <w:pPr>
+        <w:spacing w:after="80"/>
+      </w:pPr>
+      <w:r>
+        <w:rPr>
+          <w:sz w:val="21"/>
+          <w:szCs w:val="21"/>
+        </w:rPr>
+        <w:t xml:space="preserve">git ls-remote; curl returned 200 for the home page, pages/404.html and css/base.css on the live site.</w:t>
       </w:r>
     </w:p>
     <w:p>

</xml_diff>

<commit_message>
Add handover prompts PDF for finishing the project
- docs/tools/build_handover_pdf.py builds docs/SplitStack_Handover_Prompts.pdf
- Prompt 0 (context and rules) plus P1-P15 with checks and commit messages
- Prompt log: log the handover request, rebuild docx/pdf

Co-Authored-By: Claude Opus 5.5 <noreply@anthropic.com>
</commit_message>
<xml_diff>
--- a/docs/SplitStack_Prompt_Log.docx
+++ b/docs/SplitStack_Prompt_Log.docx
@@ -132,7 +132,7 @@
           <w:sz w:val="21"/>
           <w:szCs w:val="21"/>
         </w:rPr>
-        <w:t xml:space="preserve">19</w:t>
+        <w:t xml:space="preserve">21</w:t>
       </w:r>
     </w:p>
     <w:p>
@@ -713,7 +713,7 @@
                 <w:sz w:val="18"/>
                 <w:szCs w:val="18"/>
               </w:rPr>
-              <w:t xml:space="preserve">7</w:t>
+              <w:t xml:space="preserve">9</w:t>
             </w:r>
           </w:p>
         </w:tc>
@@ -3140,6 +3140,245 @@
           </w:p>
         </w:tc>
       </w:tr>
+      <w:tr>
+        <w:tc>
+          <w:tcPr>
+            <w:tcW w:type="dxa" w:w="700"/>
+            <w:shd w:fill="F7F7FB" w:color="auto" w:val="clear"/>
+            <w:tcMar>
+              <w:top w:type="dxa" w:w="60"/>
+              <w:left w:type="dxa" w:w="100"/>
+              <w:bottom w:type="dxa" w:w="60"/>
+              <w:right w:type="dxa" w:w="100"/>
+            </w:tcMar>
+          </w:tcPr>
+          <w:p>
+            <w:r>
+              <w:rPr>
+                <w:b w:val="false"/>
+                <w:bCs w:val="false"/>
+                <w:color w:val="222222"/>
+                <w:sz w:val="18"/>
+                <w:szCs w:val="18"/>
+              </w:rPr>
+              <w:t xml:space="preserve">20</w:t>
+            </w:r>
+          </w:p>
+        </w:tc>
+        <w:tc>
+          <w:tcPr>
+            <w:tcW w:type="dxa" w:w="1500"/>
+            <w:shd w:fill="F7F7FB" w:color="auto" w:val="clear"/>
+            <w:tcMar>
+              <w:top w:type="dxa" w:w="60"/>
+              <w:left w:type="dxa" w:w="100"/>
+              <w:bottom w:type="dxa" w:w="60"/>
+              <w:right w:type="dxa" w:w="100"/>
+            </w:tcMar>
+          </w:tcPr>
+          <w:p>
+            <w:r>
+              <w:rPr>
+                <w:b w:val="false"/>
+                <w:bCs w:val="false"/>
+                <w:color w:val="222222"/>
+                <w:sz w:val="18"/>
+                <w:szCs w:val="18"/>
+              </w:rPr>
+              <w:t xml:space="preserve">Wrap-up</w:t>
+            </w:r>
+          </w:p>
+        </w:tc>
+        <w:tc>
+          <w:tcPr>
+            <w:tcW w:type="dxa" w:w="4538"/>
+            <w:shd w:fill="F7F7FB" w:color="auto" w:val="clear"/>
+            <w:tcMar>
+              <w:top w:type="dxa" w:w="60"/>
+              <w:left w:type="dxa" w:w="100"/>
+              <w:bottom w:type="dxa" w:w="60"/>
+              <w:right w:type="dxa" w:w="100"/>
+            </w:tcMar>
+          </w:tcPr>
+          <w:p>
+            <w:r>
+              <w:rPr>
+                <w:b w:val="false"/>
+                <w:bCs w:val="false"/>
+                <w:color w:val="222222"/>
+                <w:sz w:val="18"/>
+                <w:szCs w:val="18"/>
+              </w:rPr>
+              <w:t xml:space="preserve">Request: handover prompt PDF for a teammate's agent</w:t>
+            </w:r>
+          </w:p>
+        </w:tc>
+        <w:tc>
+          <w:tcPr>
+            <w:tcW w:type="dxa" w:w="1500"/>
+            <w:shd w:fill="F7F7FB" w:color="auto" w:val="clear"/>
+            <w:tcMar>
+              <w:top w:type="dxa" w:w="60"/>
+              <w:left w:type="dxa" w:w="100"/>
+              <w:bottom w:type="dxa" w:w="60"/>
+              <w:right w:type="dxa" w:w="100"/>
+            </w:tcMar>
+          </w:tcPr>
+          <w:p>
+            <w:r>
+              <w:rPr>
+                <w:b w:val="false"/>
+                <w:bCs w:val="false"/>
+                <w:color w:val="222222"/>
+                <w:sz w:val="18"/>
+                <w:szCs w:val="18"/>
+              </w:rPr>
+              <w:t xml:space="preserve">User prompt</w:t>
+            </w:r>
+          </w:p>
+        </w:tc>
+        <w:tc>
+          <w:tcPr>
+            <w:tcW w:type="dxa" w:w="1400"/>
+            <w:shd w:fill="F7F7FB" w:color="auto" w:val="clear"/>
+            <w:tcMar>
+              <w:top w:type="dxa" w:w="60"/>
+              <w:left w:type="dxa" w:w="100"/>
+              <w:bottom w:type="dxa" w:w="60"/>
+              <w:right w:type="dxa" w:w="100"/>
+            </w:tcMar>
+          </w:tcPr>
+          <w:p>
+            <w:r>
+              <w:rPr>
+                <w:b w:val="false"/>
+                <w:bCs w:val="false"/>
+                <w:color w:val="222222"/>
+                <w:sz w:val="18"/>
+                <w:szCs w:val="18"/>
+              </w:rPr>
+              <w:t xml:space="preserve">2026-10-15</w:t>
+            </w:r>
+          </w:p>
+        </w:tc>
+      </w:tr>
+      <w:tr>
+        <w:tc>
+          <w:tcPr>
+            <w:tcW w:type="dxa" w:w="700"/>
+            <w:tcMar>
+              <w:top w:type="dxa" w:w="60"/>
+              <w:left w:type="dxa" w:w="100"/>
+              <w:bottom w:type="dxa" w:w="60"/>
+              <w:right w:type="dxa" w:w="100"/>
+            </w:tcMar>
+          </w:tcPr>
+          <w:p>
+            <w:r>
+              <w:rPr>
+                <w:b w:val="false"/>
+                <w:bCs w:val="false"/>
+                <w:color w:val="222222"/>
+                <w:sz w:val="18"/>
+                <w:szCs w:val="18"/>
+              </w:rPr>
+              <w:t xml:space="preserve">21</w:t>
+            </w:r>
+          </w:p>
+        </w:tc>
+        <w:tc>
+          <w:tcPr>
+            <w:tcW w:type="dxa" w:w="1500"/>
+            <w:tcMar>
+              <w:top w:type="dxa" w:w="60"/>
+              <w:left w:type="dxa" w:w="100"/>
+              <w:bottom w:type="dxa" w:w="60"/>
+              <w:right w:type="dxa" w:w="100"/>
+            </w:tcMar>
+          </w:tcPr>
+          <w:p>
+            <w:r>
+              <w:rPr>
+                <w:b w:val="false"/>
+                <w:bCs w:val="false"/>
+                <w:color w:val="222222"/>
+                <w:sz w:val="18"/>
+                <w:szCs w:val="18"/>
+              </w:rPr>
+              <w:t xml:space="preserve">Wrap-up</w:t>
+            </w:r>
+          </w:p>
+        </w:tc>
+        <w:tc>
+          <w:tcPr>
+            <w:tcW w:type="dxa" w:w="4538"/>
+            <w:tcMar>
+              <w:top w:type="dxa" w:w="60"/>
+              <w:left w:type="dxa" w:w="100"/>
+              <w:bottom w:type="dxa" w:w="60"/>
+              <w:right w:type="dxa" w:w="100"/>
+            </w:tcMar>
+          </w:tcPr>
+          <w:p>
+            <w:r>
+              <w:rPr>
+                <w:b w:val="false"/>
+                <w:bCs w:val="false"/>
+                <w:color w:val="222222"/>
+                <w:sz w:val="18"/>
+                <w:szCs w:val="18"/>
+              </w:rPr>
+              <w:t xml:space="preserve">Handover prompts PDF</w:t>
+            </w:r>
+          </w:p>
+        </w:tc>
+        <w:tc>
+          <w:tcPr>
+            <w:tcW w:type="dxa" w:w="1500"/>
+            <w:tcMar>
+              <w:top w:type="dxa" w:w="60"/>
+              <w:left w:type="dxa" w:w="100"/>
+              <w:bottom w:type="dxa" w:w="60"/>
+              <w:right w:type="dxa" w:w="100"/>
+            </w:tcMar>
+          </w:tcPr>
+          <w:p>
+            <w:r>
+              <w:rPr>
+                <w:b w:val="false"/>
+                <w:bCs w:val="false"/>
+                <w:color w:val="222222"/>
+                <w:sz w:val="18"/>
+                <w:szCs w:val="18"/>
+              </w:rPr>
+              <w:t xml:space="preserve">Working prompt</w:t>
+            </w:r>
+          </w:p>
+        </w:tc>
+        <w:tc>
+          <w:tcPr>
+            <w:tcW w:type="dxa" w:w="1400"/>
+            <w:tcMar>
+              <w:top w:type="dxa" w:w="60"/>
+              <w:left w:type="dxa" w:w="100"/>
+              <w:bottom w:type="dxa" w:w="60"/>
+              <w:right w:type="dxa" w:w="100"/>
+            </w:tcMar>
+          </w:tcPr>
+          <w:p>
+            <w:r>
+              <w:rPr>
+                <w:b w:val="false"/>
+                <w:bCs w:val="false"/>
+                <w:color w:val="222222"/>
+                <w:sz w:val="18"/>
+                <w:szCs w:val="18"/>
+              </w:rPr>
+              <w:t xml:space="preserve">2026-10-15</w:t>
+            </w:r>
+          </w:p>
+        </w:tc>
+      </w:tr>
     </w:tbl>
     <w:p>
       <w:r>
@@ -7304,6 +7543,393 @@
           <w:szCs w:val="21"/>
         </w:rPr>
         <w:t xml:space="preserve">git ls-remote; curl returned 200 for the home page, pages/404.html and css/base.css on the live site.</w:t>
+      </w:r>
+    </w:p>
+    <w:p>
+      <w:pPr>
+        <w:pBdr>
+          <w:bottom w:val="single" w:color="D9DBE5" w:sz="4" w:space="4"/>
+        </w:pBdr>
+        <w:spacing w:after="200"/>
+      </w:pPr>
+      <w:r>
+        <w:t xml:space="preserve"/>
+      </w:r>
+    </w:p>
+    <w:p>
+      <w:pPr>
+        <w:pStyle w:val="Heading3"/>
+        <w:keepNext/>
+      </w:pPr>
+      <w:r>
+        <w:t xml:space="preserve">#20  Request: handover prompt PDF for a teammate's agent</w:t>
+      </w:r>
+    </w:p>
+    <w:p>
+      <w:pPr>
+        <w:keepNext/>
+        <w:spacing w:after="60"/>
+      </w:pPr>
+      <w:r>
+        <w:rPr>
+          <w:color w:val="5B6475"/>
+          <w:sz w:val="18"/>
+          <w:szCs w:val="18"/>
+        </w:rPr>
+        <w:t xml:space="preserve">User prompt  |  2026-10-15</w:t>
+      </w:r>
+    </w:p>
+    <w:p>
+      <w:pPr>
+        <w:spacing w:after="60" w:before="160"/>
+      </w:pPr>
+      <w:r>
+        <w:rPr>
+          <w:b/>
+          <w:bCs/>
+          <w:color w:val="4F46E5"/>
+          <w:spacing w:val="20"/>
+          <w:sz w:val="17"/>
+          <w:szCs w:val="17"/>
+        </w:rPr>
+        <w:t xml:space="preserve">PROMPT</w:t>
+      </w:r>
+    </w:p>
+    <w:p>
+      <w:pPr>
+        <w:pBdr>
+          <w:left w:val="single" w:color="4F46E5" w:sz="18" w:space="8"/>
+        </w:pBdr>
+        <w:shd w:fill="F1F2F8" w:color="auto" w:val="clear"/>
+        <w:spacing w:after="120" w:before="40" w:line="276"/>
+        <w:ind w:left="160" w:right="160"/>
+      </w:pPr>
+      <w:r>
+        <w:rPr>
+          <w:rFonts w:ascii="Consolas" w:cs="Consolas" w:eastAsia="Consolas" w:hAnsi="Consolas"/>
+          <w:sz w:val="19"/>
+          <w:szCs w:val="19"/>
+        </w:rPr>
+        <w:t xml:space="preserve">imma handover the project to my teammate i want you to create a detailed prompt for his agent most prolly he'll use anti gravity so i want a pdf containing prompts to complete the rest of the work in the project. so create a pdf and mention its path once its created then i'll share it to him</w:t>
+      </w:r>
+    </w:p>
+    <w:p>
+      <w:pPr>
+        <w:spacing w:after="60" w:before="160"/>
+      </w:pPr>
+      <w:r>
+        <w:rPr>
+          <w:b/>
+          <w:bCs/>
+          <w:color w:val="4F46E5"/>
+          <w:spacing w:val="20"/>
+          <w:sz w:val="17"/>
+          <w:szCs w:val="17"/>
+        </w:rPr>
+        <w:t xml:space="preserve">PURPOSE</w:t>
+      </w:r>
+    </w:p>
+    <w:p>
+      <w:pPr>
+        <w:spacing w:after="80"/>
+      </w:pPr>
+      <w:r>
+        <w:rPr>
+          <w:sz w:val="21"/>
+          <w:szCs w:val="21"/>
+        </w:rPr>
+        <w:t xml:space="preserve">Let a teammate's AI agent (Antigravity) finish Review 2, Review 3 and the wrap-up.</w:t>
+      </w:r>
+    </w:p>
+    <w:p>
+      <w:pPr>
+        <w:spacing w:after="60" w:before="160"/>
+      </w:pPr>
+      <w:r>
+        <w:rPr>
+          <w:b/>
+          <w:bCs/>
+          <w:color w:val="4F46E5"/>
+          <w:spacing w:val="20"/>
+          <w:sz w:val="17"/>
+          <w:szCs w:val="17"/>
+        </w:rPr>
+        <w:t xml:space="preserve">FILES</w:t>
+      </w:r>
+    </w:p>
+    <w:p>
+      <w:pPr>
+        <w:pStyle w:val="ListParagraph"/>
+        <w:numPr>
+          <w:ilvl w:val="0"/>
+          <w:numId w:val="2"/>
+        </w:numPr>
+      </w:pPr>
+      <w:r>
+        <w:rPr>
+          <w:rFonts w:ascii="Consolas" w:cs="Consolas" w:eastAsia="Consolas" w:hAnsi="Consolas"/>
+          <w:sz w:val="19"/>
+          <w:szCs w:val="19"/>
+        </w:rPr>
+        <w:t xml:space="preserve">-</w:t>
+      </w:r>
+    </w:p>
+    <w:p>
+      <w:pPr>
+        <w:spacing w:after="60" w:before="160"/>
+      </w:pPr>
+      <w:r>
+        <w:rPr>
+          <w:b/>
+          <w:bCs/>
+          <w:color w:val="4F46E5"/>
+          <w:spacing w:val="20"/>
+          <w:sz w:val="17"/>
+          <w:szCs w:val="17"/>
+        </w:rPr>
+        <w:t xml:space="preserve">RESULT</w:t>
+      </w:r>
+    </w:p>
+    <w:p>
+      <w:pPr>
+        <w:spacing w:after="80"/>
+      </w:pPr>
+      <w:r>
+        <w:rPr>
+          <w:sz w:val="21"/>
+          <w:szCs w:val="21"/>
+        </w:rPr>
+        <w:t xml:space="preserve">Handled in the next step.</w:t>
+      </w:r>
+    </w:p>
+    <w:p>
+      <w:pPr>
+        <w:spacing w:after="60" w:before="160"/>
+      </w:pPr>
+      <w:r>
+        <w:rPr>
+          <w:b/>
+          <w:bCs/>
+          <w:color w:val="4F46E5"/>
+          <w:spacing w:val="20"/>
+          <w:sz w:val="17"/>
+          <w:szCs w:val="17"/>
+        </w:rPr>
+        <w:t xml:space="preserve">VERIFICATION</w:t>
+      </w:r>
+    </w:p>
+    <w:p>
+      <w:pPr>
+        <w:spacing w:after="80"/>
+      </w:pPr>
+      <w:r>
+        <w:rPr>
+          <w:sz w:val="21"/>
+          <w:szCs w:val="21"/>
+        </w:rPr>
+        <w:t xml:space="preserve">-</w:t>
+      </w:r>
+    </w:p>
+    <w:p>
+      <w:pPr>
+        <w:pBdr>
+          <w:bottom w:val="single" w:color="D9DBE5" w:sz="4" w:space="4"/>
+        </w:pBdr>
+        <w:spacing w:after="200"/>
+      </w:pPr>
+      <w:r>
+        <w:t xml:space="preserve"/>
+      </w:r>
+    </w:p>
+    <w:p>
+      <w:pPr>
+        <w:pStyle w:val="Heading3"/>
+        <w:keepNext/>
+      </w:pPr>
+      <w:r>
+        <w:t xml:space="preserve">#21  Handover prompts PDF</w:t>
+      </w:r>
+    </w:p>
+    <w:p>
+      <w:pPr>
+        <w:keepNext/>
+        <w:spacing w:after="60"/>
+      </w:pPr>
+      <w:r>
+        <w:rPr>
+          <w:color w:val="5B6475"/>
+          <w:sz w:val="18"/>
+          <w:szCs w:val="18"/>
+        </w:rPr>
+        <w:t xml:space="preserve">Working prompt  |  2026-10-15</w:t>
+      </w:r>
+    </w:p>
+    <w:p>
+      <w:pPr>
+        <w:spacing w:after="60" w:before="160"/>
+      </w:pPr>
+      <w:r>
+        <w:rPr>
+          <w:b/>
+          <w:bCs/>
+          <w:color w:val="4F46E5"/>
+          <w:spacing w:val="20"/>
+          <w:sz w:val="17"/>
+          <w:szCs w:val="17"/>
+        </w:rPr>
+        <w:t xml:space="preserve">PROMPT</w:t>
+      </w:r>
+    </w:p>
+    <w:p>
+      <w:pPr>
+        <w:pBdr>
+          <w:left w:val="single" w:color="4F46E5" w:sz="18" w:space="8"/>
+        </w:pBdr>
+        <w:shd w:fill="F1F2F8" w:color="auto" w:val="clear"/>
+        <w:spacing w:after="120" w:before="40" w:line="276"/>
+        <w:ind w:left="160" w:right="160"/>
+      </w:pPr>
+      <w:r>
+        <w:rPr>
+          <w:rFonts w:ascii="Consolas" w:cs="Consolas" w:eastAsia="Consolas" w:hAnsi="Consolas"/>
+          <w:sz w:val="19"/>
+          <w:szCs w:val="19"/>
+        </w:rPr>
+        <w:t xml:space="preserve">Write docs/tools/build_handover_pdf.py (reusing the styles of build_prompt_pdf.py) to produce docs/SplitStack_Handover_Prompts.pdf: how to use it with Antigravity, one-time setup (tools, collaborator access, MongoDB Atlas, workflow token scope), a roadmap, Prompt 0 with the full project context, rules, logging, commit/push and gh-pages redeploy procedure, the 15 planned prompts P1-P15 expanded with concrete checks and commit messages, utility prompts (status, recovery, review rehearsal) and common problems. Render pages to check the layout.</w:t>
+      </w:r>
+    </w:p>
+    <w:p>
+      <w:pPr>
+        <w:spacing w:after="60" w:before="160"/>
+      </w:pPr>
+      <w:r>
+        <w:rPr>
+          <w:b/>
+          <w:bCs/>
+          <w:color w:val="4F46E5"/>
+          <w:spacing w:val="20"/>
+          <w:sz w:val="17"/>
+          <w:szCs w:val="17"/>
+        </w:rPr>
+        <w:t xml:space="preserve">PURPOSE</w:t>
+      </w:r>
+    </w:p>
+    <w:p>
+      <w:pPr>
+        <w:spacing w:after="80"/>
+      </w:pPr>
+      <w:r>
+        <w:rPr>
+          <w:sz w:val="21"/>
+          <w:szCs w:val="21"/>
+        </w:rPr>
+        <w:t xml:space="preserve">Give the teammate a self-contained, ordered set of prompts.</w:t>
+      </w:r>
+    </w:p>
+    <w:p>
+      <w:pPr>
+        <w:spacing w:after="60" w:before="160"/>
+      </w:pPr>
+      <w:r>
+        <w:rPr>
+          <w:b/>
+          <w:bCs/>
+          <w:color w:val="4F46E5"/>
+          <w:spacing w:val="20"/>
+          <w:sz w:val="17"/>
+          <w:szCs w:val="17"/>
+        </w:rPr>
+        <w:t xml:space="preserve">FILES</w:t>
+      </w:r>
+    </w:p>
+    <w:p>
+      <w:pPr>
+        <w:pStyle w:val="ListParagraph"/>
+        <w:numPr>
+          <w:ilvl w:val="0"/>
+          <w:numId w:val="2"/>
+        </w:numPr>
+      </w:pPr>
+      <w:r>
+        <w:rPr>
+          <w:rFonts w:ascii="Consolas" w:cs="Consolas" w:eastAsia="Consolas" w:hAnsi="Consolas"/>
+          <w:sz w:val="19"/>
+          <w:szCs w:val="19"/>
+        </w:rPr>
+        <w:t xml:space="preserve">docs/tools/build_handover_pdf.py</w:t>
+      </w:r>
+    </w:p>
+    <w:p>
+      <w:pPr>
+        <w:pStyle w:val="ListParagraph"/>
+        <w:numPr>
+          <w:ilvl w:val="0"/>
+          <w:numId w:val="2"/>
+        </w:numPr>
+      </w:pPr>
+      <w:r>
+        <w:rPr>
+          <w:rFonts w:ascii="Consolas" w:cs="Consolas" w:eastAsia="Consolas" w:hAnsi="Consolas"/>
+          <w:sz w:val="19"/>
+          <w:szCs w:val="19"/>
+        </w:rPr>
+        <w:t xml:space="preserve">docs/SplitStack_Handover_Prompts.pdf</w:t>
+      </w:r>
+    </w:p>
+    <w:p>
+      <w:pPr>
+        <w:spacing w:after="60" w:before="160"/>
+      </w:pPr>
+      <w:r>
+        <w:rPr>
+          <w:b/>
+          <w:bCs/>
+          <w:color w:val="4F46E5"/>
+          <w:spacing w:val="20"/>
+          <w:sz w:val="17"/>
+          <w:szCs w:val="17"/>
+        </w:rPr>
+        <w:t xml:space="preserve">RESULT</w:t>
+      </w:r>
+    </w:p>
+    <w:p>
+      <w:pPr>
+        <w:spacing w:after="80"/>
+      </w:pPr>
+      <w:r>
+        <w:rPr>
+          <w:sz w:val="21"/>
+          <w:szCs w:val="21"/>
+        </w:rPr>
+        <w:t xml:space="preserve">14-page PDF created. Changes against the planned prompts: P1 adds data-page attributes and client/js/package.json (type module) for node --test; P13 keeps the localStorage implementation as a demo mode (api-local.js chosen when /api/health does not answer) so the GitHub Pages site keeps working, instead of deleting it; P9 replaces deprecated csurf with a synchronizer token; P14 uses MongoMemoryReplSet because the API uses transactions; P15 asks for confirmation before deleting the Flask files and leaves Render account steps to the student.</w:t>
+      </w:r>
+    </w:p>
+    <w:p>
+      <w:pPr>
+        <w:spacing w:after="60" w:before="160"/>
+      </w:pPr>
+      <w:r>
+        <w:rPr>
+          <w:b/>
+          <w:bCs/>
+          <w:color w:val="4F46E5"/>
+          <w:spacing w:val="20"/>
+          <w:sz w:val="17"/>
+          <w:szCs w:val="17"/>
+        </w:rPr>
+        <w:t xml:space="preserve">VERIFICATION</w:t>
+      </w:r>
+    </w:p>
+    <w:p>
+      <w:pPr>
+        <w:spacing w:after="80"/>
+      </w:pPr>
+      <w:r>
+        <w:rPr>
+          <w:sz w:val="21"/>
+          <w:szCs w:val="21"/>
+        </w:rPr>
+        <w:t xml:space="preserve">Rendered pages with PyMuPDF and checked the layout of the setup, Prompt 0, step and utility pages.</w:t>
       </w:r>
     </w:p>
     <w:p>

</xml_diff>